<commit_message>
feat(auth): specify multi-user collaboration and admin override governance
</commit_message>
<xml_diff>
--- a/Novwrite.docx
+++ b/Novwrite.docx
@@ -29,7 +29,7 @@
           <w:color w:val="4B5563"/>
           <w:sz w:val="30"/>
         </w:rPr>
-        <w:t>A Continuity-First Novel Creation Platform with a User-Defined Story Universe Engine</w:t>
+        <w:t>A Continuity-First Multi-User Novel Creation Platform with a User-Defined Story Universe Engine</w:t>
       </w:r>
     </w:p>
     <w:p>
@@ -58,9 +58,9 @@
           <w:color w:val="374151"/>
           <w:sz w:val="22"/>
         </w:rPr>
-        <w:t>An Authoritative Canonical State Tracking and Continuity Verification Framework</w:t>
+        <w:t>An Authoritative Canonical State Tracking, Multi-User Collaborative RBAC, and</w:t>
         <w:br/>
-        <w:t>for Long-Form Generative Narrative Engineering</w:t>
+        <w:t>Continuity Verification Framework for Long-Form Narrative Engineering</w:t>
         <w:br/>
         <w:br/>
         <w:t>Department of Computer Science &amp; Engineering</w:t>
@@ -194,7 +194,7 @@
               <w:rPr>
                 <w:color w:val="111827"/>
               </w:rPr>
-              <w:t>Technical Architecture &amp; System Baseline Locked (v1.3)</w:t>
+              <w:t>Technical Architecture &amp; System Baseline Locked (v1.5 - Multi-User RBAC &amp; Admin Overrides)</w:t>
             </w:r>
           </w:p>
         </w:tc>
@@ -259,12 +259,12 @@
     </w:p>
     <w:p>
       <w:r>
-        <w:t>Modern artificial intelligence applications in creative writing face a critical bottleneck: Large Language Models (LLMs) lack persistent, authoritative memory across long-form multi-chapter narratives. Because LLMs operate probabilistically over bounded context windows, they frequently suffer from catastrophic memory drift, hallucinations, and continuity contradictions (e.g., deceased characters reappearing, item ownership inconsistencies, power scaling violations, and retroactive timeline confusion). Existing solutions either rely on naive vector similarity search or attempt to cram entire story histories into expanded context windows, both of which fail to provide deterministic guarantees of narrative canon.</w:t>
+        <w:t>Modern artificial intelligence applications in creative writing face two fundamental bottlenecks: (1) Large Language Models (LLMs) lack persistent, authoritative memory across long-form multi-chapter narratives, leading to hallucinations and continuity contradictions; and (2) existing narrative platforms lack enterprise-grade multi-user collaboration primitives, forcing co-authors, lorekeepers, and editors into uncoordinated overwrites and unstructured wiki chaos.</w:t>
       </w:r>
     </w:p>
     <w:p>
       <w:r>
-        <w:t>NovWrite addresses this foundational limitation by establishing a continuity-first novel creation architecture grounded in the principle: Canon Over AI Memory. Rather than treating a novel as flat, unstructured prose documents, NovWrite formalizes the fictional universe as a deterministic state machine powered by event-sourcing state reconstruction, dynamic schema definitions, and explainable continuity verification algorithms.</w:t>
+        <w:t>NovWrite addresses these foundational limitations by establishing a continuity-first multi-user novel creation architecture grounded in the principle: Canon Over AI Memory. Rather than treating a novel as flat, unstructured text documents, NovWrite formalizes the fictional universe as a deterministic state machine powered by event-sourcing state reconstruction, dynamic schema definitions, multi-tenant Role-Based Access Control (RBAC), and explainable continuity verification algorithms.</w:t>
       </w:r>
     </w:p>
     <w:tbl>
@@ -314,7 +314,7 @@
                 <w:color w:val="1F2937"/>
                 <w:sz w:val="20"/>
               </w:rPr>
-              <w:t>Core Architectural Thesis: Fictional world state is stored deterministically in an authoritative relational + dynamic JSONB database (PostgreSQL 18 with pgvector), not implicitly inside probabilistic AI context windows. AI models operate as stateless transformation engines that receive authoritative world state as prompt context.</w:t>
+              <w:t>Core Architectural Thesis: Fictional world state is stored deterministically in an authoritative relational + dynamic JSONB database (PostgreSQL 18 with pgvector), not implicitly inside probabilistic AI context windows. AI models operate as stateless transformation engines that receive authoritative world state as prompt context. Multi-user concurrency is governed through heartbeat scene leases and audited administrative override boundaries.</w:t>
             </w:r>
           </w:p>
         </w:tc>
@@ -322,7 +322,7 @@
     </w:tbl>
     <w:p>
       <w:r>
-        <w:t>This report outlines the complete technical architecture of the NovWrite platform, spanning its hybrid multi-service backend (Go 1.23+ Core API, TypeScript Prisma Data Service, PostgreSQL 18 with pgvector, and Redis 7 Multi-Tier Cache), its decoupled multi-platform frontend architecture (SvelteKit Web, Tauri 2 Desktop, and React Native / Expo Mobile with React Native Reusables), and its deterministic continuity verification pipeline.</w:t>
+        <w:t>This report outlines the complete technical architecture of the NovWrite platform, spanning its hybrid multi-service backend (Go 1.23+ Core API, TypeScript Prisma Data Service, PostgreSQL 18 with pgvector, and Redis 7 Multi-Tier Cache), its decoupled multi-platform frontend architecture (SvelteKit Web, Tauri 2 Desktop, and React Native / Expo Mobile with React Native Reusables), and its deterministic multi-user continuity verification pipeline.</w:t>
       </w:r>
     </w:p>
     <w:p>
@@ -351,7 +351,7 @@
     </w:p>
     <w:p>
       <w:r>
-        <w:t>Long-form creative writing in complex fictional genres (fantasy, science fiction, xianxia cultivation, alternate history, mystery) requires managing thousands of interconnected entities, hierarchical progression tiers, multi-faction affiliations, and causal timelines. A typical web novel or fantasy series spans hundreds of chapters, tens of thousands of character interactions, and dynamic item transfers. Human authors struggle to maintain perfect continuity across such scales, while existing AI writing tools exacerbate the problem through hallucinations.</w:t>
+        <w:t>Long-form creative writing in complex fictional genres (fantasy, science fiction, xianxia cultivation, alternate history, mystery) frequently involves collaborative teams: lead authors, co-writers, world builders, lorekeepers, and beta reviewers. Managing thousands of interconnected entities, hierarchical progression tiers, multi-faction affiliations, and causal timelines across multiple concurrent contributors requires strict concurrency control and deterministic canon tracking.</w:t>
       </w:r>
     </w:p>
     <w:p>
@@ -430,7 +430,7 @@
         </w:tc>
         <w:tc>
           <w:tcPr>
-            <w:tcW w:type="dxa" w:w="2016"/>
+            <w:tcW w:type="dxa" w:w="1872"/>
             <w:shd w:fill="7C3AED"/>
             <w:tcMar>
               <w:top w:w="100" w:type="dxa"/>
@@ -476,13 +476,13 @@
                 <w:color w:val="FFFFFF"/>
                 <w:sz w:val="19"/>
               </w:rPr>
-              <w:t>Dynamic Universe Customization</w:t>
+              <w:t>Multi-User RBAC &amp; Leases</w:t>
             </w:r>
           </w:p>
         </w:tc>
         <w:tc>
           <w:tcPr>
-            <w:tcW w:type="dxa" w:w="1728"/>
+            <w:tcW w:type="dxa" w:w="1872"/>
             <w:shd w:fill="7C3AED"/>
             <w:tcMar>
               <w:top w:w="100" w:type="dxa"/>
@@ -560,7 +560,7 @@
         </w:tc>
         <w:tc>
           <w:tcPr>
-            <w:tcW w:type="dxa" w:w="2016"/>
+            <w:tcW w:type="dxa" w:w="1872"/>
             <w:shd w:fill="FFFFFF"/>
             <w:tcMar>
               <w:top w:w="80" w:type="dxa"/>
@@ -604,13 +604,13 @@
                 <w:color w:val="1F2937"/>
                 <w:sz w:val="18"/>
               </w:rPr>
-              <w:t>Rigid prompt tags</w:t>
+              <w:t>Single User Only</w:t>
             </w:r>
           </w:p>
         </w:tc>
         <w:tc>
           <w:tcPr>
-            <w:tcW w:type="dxa" w:w="1728"/>
+            <w:tcW w:type="dxa" w:w="1872"/>
             <w:shd w:fill="FFFFFF"/>
             <w:tcMar>
               <w:top w:w="80" w:type="dxa"/>
@@ -687,7 +687,7 @@
         </w:tc>
         <w:tc>
           <w:tcPr>
-            <w:tcW w:type="dxa" w:w="2016"/>
+            <w:tcW w:type="dxa" w:w="1872"/>
             <w:shd w:fill="F9FAFB"/>
             <w:tcMar>
               <w:top w:w="80" w:type="dxa"/>
@@ -731,13 +731,13 @@
                 <w:color w:val="1F2937"/>
                 <w:sz w:val="18"/>
               </w:rPr>
-              <w:t>Custom fields / templates</w:t>
+              <w:t>Basic file sync / comments</w:t>
             </w:r>
           </w:p>
         </w:tc>
         <w:tc>
           <w:tcPr>
-            <w:tcW w:type="dxa" w:w="1728"/>
+            <w:tcW w:type="dxa" w:w="1872"/>
             <w:shd w:fill="F9FAFB"/>
             <w:tcMar>
               <w:top w:w="80" w:type="dxa"/>
@@ -783,7 +783,7 @@
                 <w:color w:val="1F2937"/>
                 <w:sz w:val="18"/>
               </w:rPr>
-              <w:t>Standard RAG Systems</w:t>
+              <w:t>Google Docs / Word</w:t>
             </w:r>
           </w:p>
         </w:tc>
@@ -808,32 +808,7 @@
                 <w:color w:val="1F2937"/>
                 <w:sz w:val="18"/>
               </w:rPr>
-              <w:t>Vector Embedding Search</w:t>
-            </w:r>
-          </w:p>
-        </w:tc>
-        <w:tc>
-          <w:tcPr>
-            <w:tcW w:type="dxa" w:w="2016"/>
-            <w:shd w:fill="FFFFFF"/>
-            <w:tcMar>
-              <w:top w:w="80" w:type="dxa"/>
-              <w:bottom w:w="80" w:type="dxa"/>
-              <w:left w:w="120" w:type="dxa"/>
-              <w:right w:w="120" w:type="dxa"/>
-            </w:tcMar>
-          </w:tcPr>
-          <w:p>
-            <w:pPr>
-              <w:jc w:val="left"/>
-            </w:pPr>
-            <w:r>
-              <w:rPr>
-                <w:rFonts w:ascii="Calibri" w:hAnsi="Calibri"/>
-                <w:color w:val="1F2937"/>
-                <w:sz w:val="18"/>
-              </w:rPr>
-              <w:t>Chunk similarity (No temporal order)</w:t>
+              <w:t>CRDT Prose Streams</w:t>
             </w:r>
           </w:p>
         </w:tc>
@@ -858,13 +833,13 @@
                 <w:color w:val="1F2937"/>
                 <w:sz w:val="18"/>
               </w:rPr>
-              <w:t>Unstructured prose chunks</w:t>
+              <w:t>Zero lore/world tracking</w:t>
             </w:r>
           </w:p>
         </w:tc>
         <w:tc>
           <w:tcPr>
-            <w:tcW w:type="dxa" w:w="1728"/>
+            <w:tcW w:type="dxa" w:w="1872"/>
             <w:shd w:fill="FFFFFF"/>
             <w:tcMar>
               <w:top w:w="80" w:type="dxa"/>
@@ -883,7 +858,32 @@
                 <w:color w:val="1F2937"/>
                 <w:sz w:val="18"/>
               </w:rPr>
-              <w:t>Similarity scores only</w:t>
+              <w:t>Document-level permissions</w:t>
+            </w:r>
+          </w:p>
+        </w:tc>
+        <w:tc>
+          <w:tcPr>
+            <w:tcW w:type="dxa" w:w="1872"/>
+            <w:shd w:fill="FFFFFF"/>
+            <w:tcMar>
+              <w:top w:w="80" w:type="dxa"/>
+              <w:bottom w:w="80" w:type="dxa"/>
+              <w:left w:w="120" w:type="dxa"/>
+              <w:right w:w="120" w:type="dxa"/>
+            </w:tcMar>
+          </w:tcPr>
+          <w:p>
+            <w:pPr>
+              <w:jc w:val="left"/>
+            </w:pPr>
+            <w:r>
+              <w:rPr>
+                <w:rFonts w:ascii="Calibri" w:hAnsi="Calibri"/>
+                <w:color w:val="1F2937"/>
+                <w:sz w:val="18"/>
+              </w:rPr>
+              <w:t>None</w:t>
             </w:r>
           </w:p>
         </w:tc>
@@ -941,7 +941,7 @@
         </w:tc>
         <w:tc>
           <w:tcPr>
-            <w:tcW w:type="dxa" w:w="2016"/>
+            <w:tcW w:type="dxa" w:w="1872"/>
             <w:shd w:fill="F9FAFB"/>
             <w:tcMar>
               <w:top w:w="80" w:type="dxa"/>
@@ -985,13 +985,13 @@
                 <w:color w:val="1F2937"/>
                 <w:sz w:val="18"/>
               </w:rPr>
-              <w:t>Fully User-Defined Dynamic Schemas</w:t>
+              <w:t>Multi-Tenant RBAC + Heartbeat Scene Leases + Admin Overrides</w:t>
             </w:r>
           </w:p>
         </w:tc>
         <w:tc>
           <w:tcPr>
-            <w:tcW w:type="dxa" w:w="1728"/>
+            <w:tcW w:type="dxa" w:w="1872"/>
             <w:shd w:fill="F9FAFB"/>
             <w:tcMar>
               <w:top w:w="80" w:type="dxa"/>
@@ -1049,17 +1049,27 @@
         <w:rPr>
           <w:b/>
         </w:rPr>
-        <w:t xml:space="preserve">3. Explainable Continuity Verification: </w:t>
+        <w:t xml:space="preserve">3. Multi-User Collaboration &amp; RBAC: </w:t>
       </w:r>
       <w:r>
-        <w:t>Automatically detect lore contradictions in newly drafted prose, cite the exact historical event responsible, and offer one-click remediation actions.</w:t>
+        <w:t>Provide secure multi-tenant roles (OWNER, ADMIN, EDITOR, CONTRIBUTOR, VIEWER) and active heartbeat scene leases to prevent concurrent overwrites.</w:t>
         <w:br/>
       </w:r>
       <w:r>
         <w:rPr>
           <w:b/>
         </w:rPr>
-        <w:t xml:space="preserve">4. Decoupled Dedicated Workspaces: </w:t>
+        <w:t xml:space="preserve">4. Explainable Continuity Verification &amp; Admin Overrides: </w:t>
+      </w:r>
+      <w:r>
+        <w:t>Automatically detect lore contradictions in newly drafted prose, cite historical events responsible, and allow authorized admins to force-approve intentional exceptions with mandatory audit logging.</w:t>
+        <w:br/>
+      </w:r>
+      <w:r>
+        <w:rPr>
+          <w:b/>
+        </w:rPr>
+        <w:t xml:space="preserve">5. Decoupled Dedicated Workspaces: </w:t>
       </w:r>
       <w:r>
         <w:t>Provide dedicated full-viewport workbenches for Novel Writing vs World Building, eliminating nested tab-in-modal anti-patterns.</w:t>
@@ -1069,7 +1079,7 @@
         <w:rPr>
           <w:b/>
         </w:rPr>
-        <w:t xml:space="preserve">5. Tri-Platform Co-Development: </w:t>
+        <w:t xml:space="preserve">6. Tri-Platform Co-Development: </w:t>
       </w:r>
       <w:r>
         <w:t>Engineer Web (SvelteKit), Desktop (Tauri 2), and Mobile (React Native + Expo) simultaneously with complete component and design system parity.</w:t>
@@ -1088,7 +1098,7 @@
     </w:p>
     <w:p>
       <w:r>
-        <w:t>NovWrite employs a modular multi-tier service topology designed to balance low latency, type safety, relational data integrity, and high-performance event-sourcing calculations.</w:t>
+        <w:t>NovWrite employs a modular multi-tier service topology designed to balance low latency, type safety, relational data integrity, multi-user concurrency, and high-performance event-sourcing calculations.</w:t>
       </w:r>
     </w:p>
     <w:tbl>
@@ -1145,9 +1155,9 @@
               <w:br/>
               <w:t>|                             GO API BACKEND LAYER (Go 1.23+)                       |</w:t>
               <w:br/>
-              <w:t>|  Chi Router | Project Auth &amp; Tenancy | Prose Service | State Fold Engine          |</w:t>
+              <w:t>|  Chi Router | Multi-Tenant RBAC Middleware | Scene Lease Manager | State Fold Engine |</w:t>
               <w:br/>
-              <w:t>|  Continuity &amp; Invariant Rules Engine | AI Context Gateway                         |</w:t>
+              <w:t>|  Continuity &amp; Invariant Rules Engine | Admin Override Service | AI Context Gateway |</w:t>
               <w:br/>
               <w:t>+------------------------------------------+----------------------------------------+</w:t>
               <w:br/>
@@ -1171,7 +1181,7 @@
               <w:br/>
               <w:t>|                           STORAGE &amp; INFRASTRUCTURE LAYER                          |</w:t>
               <w:br/>
-              <w:t>|  PostgreSQL 18 + pgvector (System of Record) | Redis 7 (Snapshots, Cache &amp; Pub/Sub)  |</w:t>
+              <w:t>|  PostgreSQL 18 + pgvector (System of Record) | Redis 7 (Snapshots, Leases &amp; Pub/Sub)|</w:t>
               <w:br/>
               <w:t>+-----------------------------------------------------------------------------------+</w:t>
             </w:r>
@@ -1193,7 +1203,7 @@
         <w:br/>
         <w:t xml:space="preserve">   - Implemented in Go for extreme throughput, predictable memory footprint, and concurrent rule evaluation.</w:t>
         <w:br/>
-        <w:t xml:space="preserve">   - Encapsulates authentication, project workspace tenancy, prose drafting, timeline folding, and rule validation.</w:t>
+        <w:t xml:space="preserve">   - Encapsulates authentication, project workspace tenancy, prose drafting, scene leases, timeline folding, and rule validation.</w:t>
         <w:br/>
         <w:t xml:space="preserve">   - Enforces the Block-Based Code Standard with unique block IDs (BLOCK_&lt;DOMAIN&gt;_&lt;ACTION&gt;_&lt;ID&gt;) and RFC 7807 problem details.</w:t>
         <w:br/>
@@ -1211,7 +1221,7 @@
         <w:br/>
         <w:t xml:space="preserve">   - PostgreSQL 18 with pgvector extension serves as the single source of canonical truth.</w:t>
         <w:br/>
-        <w:t xml:space="preserve">   - Redis 7.2 handles multi-tier snapshot caching, single-flight fold calculation locks, and real-time Pub/Sub invalidation.</w:t>
+        <w:t xml:space="preserve">   - Redis 7.2 handles multi-tier snapshot caching, collaborative scene lease mutexes, and real-time Pub/Sub invalidation.</w:t>
       </w:r>
     </w:p>
     <w:p>
@@ -1232,7 +1242,7 @@
     </w:p>
     <w:p>
       <w:r>
-        <w:t>The database architecture is designed with a relational backbone for structural narrative hierarchies combined with PostgreSQL JSONB columns for dynamic, user-defined entity attributes.</w:t>
+        <w:t>The database architecture is designed with a relational backbone for structural narrative hierarchies and multi-user tenancy, combined with PostgreSQL JSONB columns for dynamic entity attributes.</w:t>
       </w:r>
     </w:p>
     <w:p>
@@ -1240,12 +1250,12 @@
         <w:pStyle w:val="Heading2"/>
       </w:pPr>
       <w:r>
-        <w:t>3.1 Relational Prose Backbone Schema</w:t>
+        <w:t>3.1 Multi-User Tenancy, Prose Hierarchy &amp; Scene Leases</w:t>
       </w:r>
     </w:p>
     <w:p>
       <w:r>
-        <w:t>Narrative hierarchy is modeled strictly through relational tables: Users -&gt; Projects -&gt; Novels -&gt; Chapters -&gt; Scenes. Every table enforces foreign key constraints with ON DELETE CASCADE and compound uniqueness constraints to maintain strict manuscript ordering and multi-tenant isolation.</w:t>
+        <w:t>Users and projects form the multi-tenant core. Project memberships govern RBAC permissions, scenes track author attribution and active lease locks, and admin overrides are persisted to immutable audit tables.</w:t>
       </w:r>
     </w:p>
     <w:tbl>
@@ -1286,7 +1296,22 @@
                 <w:color w:val="0F172A"/>
                 <w:sz w:val="17"/>
               </w:rPr>
-              <w:t>-- Relational Prose Hierarchy (PostgreSQL 18)</w:t>
+              <w:t>-- Multi-User Tenancy &amp; Prose Hierarchy (PostgreSQL 18)</w:t>
+              <w:br/>
+              <w:t>CREATE TABLE users (</w:t>
+              <w:br/>
+              <w:t xml:space="preserve">    id UUID PRIMARY KEY DEFAULT gen_random_uuid(),</w:t>
+              <w:br/>
+              <w:t xml:space="preserve">    email VARCHAR(255) NOT NULL UNIQUE,</w:t>
+              <w:br/>
+              <w:t xml:space="preserve">    password_hash VARCHAR(255) NOT NULL,</w:t>
+              <w:br/>
+              <w:t xml:space="preserve">    display_name VARCHAR(100) NOT NULL,</w:t>
+              <w:br/>
+              <w:t xml:space="preserve">    created_at TIMESTAMPTZ NOT NULL DEFAULT NOW()</w:t>
+              <w:br/>
+              <w:t>);</w:t>
+              <w:br/>
               <w:br/>
               <w:t>CREATE TABLE projects (</w:t>
               <w:br/>
@@ -1307,21 +1332,23 @@
               <w:t>);</w:t>
               <w:br/>
               <w:br/>
-              <w:t>CREATE TABLE chapters (</w:t>
+              <w:t>CREATE TABLE project_members (</w:t>
               <w:br/>
               <w:t xml:space="preserve">    id UUID PRIMARY KEY DEFAULT gen_random_uuid(),</w:t>
               <w:br/>
-              <w:t xml:space="preserve">    novel_id UUID NOT NULL REFERENCES novels(id) ON DELETE CASCADE,</w:t>
-              <w:br/>
               <w:t xml:space="preserve">    project_id UUID NOT NULL REFERENCES projects(id) ON DELETE CASCADE,</w:t>
               <w:br/>
-              <w:t xml:space="preserve">    title VARCHAR(255) NOT NULL,</w:t>
+              <w:t xml:space="preserve">    user_id UUID NOT NULL REFERENCES users(id) ON DELETE CASCADE,</w:t>
               <w:br/>
-              <w:t xml:space="preserve">    order_index INT NOT NULL,</w:t>
+              <w:t xml:space="preserve">    role VARCHAR(50) NOT NULL, -- OWNER, ADMIN, EDITOR, CONTRIBUTOR, VIEWER</w:t>
               <w:br/>
-              <w:t xml:space="preserve">    global_sequence_number INT NOT NULL,</w:t>
+              <w:t xml:space="preserve">    permissions JSONB NOT NULL DEFAULT '{}'::jsonb,</w:t>
               <w:br/>
-              <w:t xml:space="preserve">    CONSTRAINT uq_chapter_order UNIQUE (novel_id, order_index)</w:t>
+              <w:t xml:space="preserve">    invited_by UUID REFERENCES users(id) ON DELETE SET NULL,</w:t>
+              <w:br/>
+              <w:t xml:space="preserve">    created_at TIMESTAMPTZ NOT NULL DEFAULT NOW(),</w:t>
+              <w:br/>
+              <w:t xml:space="preserve">    CONSTRAINT uq_project_member UNIQUE (project_id, user_id)</w:t>
               <w:br/>
               <w:t>);</w:t>
               <w:br/>
@@ -1342,7 +1369,53 @@
               <w:br/>
               <w:t xml:space="preserve">    status VARCHAR(50) NOT NULL DEFAULT 'draft',</w:t>
               <w:br/>
+              <w:t xml:space="preserve">    last_edited_by UUID REFERENCES users(id) ON DELETE SET NULL,</w:t>
+              <w:br/>
+              <w:t xml:space="preserve">    created_at TIMESTAMPTZ NOT NULL DEFAULT NOW(),</w:t>
+              <w:br/>
               <w:t xml:space="preserve">    CONSTRAINT uq_scene_order UNIQUE (chapter_id, order_index)</w:t>
+              <w:br/>
+              <w:t>);</w:t>
+              <w:br/>
+              <w:br/>
+              <w:t>CREATE TABLE scene_leases (</w:t>
+              <w:br/>
+              <w:t xml:space="preserve">    scene_id UUID PRIMARY KEY REFERENCES scenes(id) ON DELETE CASCADE,</w:t>
+              <w:br/>
+              <w:t xml:space="preserve">    project_id UUID NOT NULL REFERENCES projects(id) ON DELETE CASCADE,</w:t>
+              <w:br/>
+              <w:t xml:space="preserve">    locked_by_user_id UUID NOT NULL REFERENCES users(id) ON DELETE CASCADE,</w:t>
+              <w:br/>
+              <w:t xml:space="preserve">    heartbeat_token VARCHAR(64) NOT NULL,</w:t>
+              <w:br/>
+              <w:t xml:space="preserve">    acquired_at TIMESTAMPTZ NOT NULL DEFAULT NOW(),</w:t>
+              <w:br/>
+              <w:t xml:space="preserve">    expires_at TIMESTAMPTZ NOT NULL</w:t>
+              <w:br/>
+              <w:t>);</w:t>
+              <w:br/>
+              <w:br/>
+              <w:t>CREATE TABLE admin_override_logs (</w:t>
+              <w:br/>
+              <w:t xml:space="preserve">    id UUID PRIMARY KEY DEFAULT gen_random_uuid(),</w:t>
+              <w:br/>
+              <w:t xml:space="preserve">    project_id UUID NOT NULL REFERENCES projects(id) ON DELETE CASCADE,</w:t>
+              <w:br/>
+              <w:t xml:space="preserve">    admin_user_id UUID NOT NULL REFERENCES users(id) ON DELETE RESTRICT,</w:t>
+              <w:br/>
+              <w:t xml:space="preserve">    target_type VARCHAR(50) NOT NULL, -- CONTINUITY_VIOLATION, TIMELINE_BRANCH, SCENE_LOCK, SCHEMA_MUTATION</w:t>
+              <w:br/>
+              <w:t xml:space="preserve">    target_id UUID NOT NULL,</w:t>
+              <w:br/>
+              <w:t xml:space="preserve">    action VARCHAR(50) NOT NULL, -- FORCE_APPROVE_VIOLATION, BREAK_SCENE_LOCK, MERGE_BRANCH_OVERRIDE, SCHEMA_FORCE_MIGRATE</w:t>
+              <w:br/>
+              <w:t xml:space="preserve">    justification TEXT NOT NULL,</w:t>
+              <w:br/>
+              <w:t xml:space="preserve">    previous_state JSONB NOT NULL,</w:t>
+              <w:br/>
+              <w:t xml:space="preserve">    new_state JSONB NOT NULL,</w:t>
+              <w:br/>
+              <w:t xml:space="preserve">    created_at TIMESTAMPTZ NOT NULL DEFAULT NOW()</w:t>
               <w:br/>
               <w:t>);</w:t>
             </w:r>
@@ -1647,7 +1720,7 @@
         <w:pStyle w:val="Heading2"/>
       </w:pPr>
       <w:r>
-        <w:t>4.2 Continuity &amp; Invariant Verification Pipeline</w:t>
+        <w:t>4.2 Continuity Invariant Rules &amp; Explainable Violations</w:t>
       </w:r>
     </w:p>
     <w:p>
@@ -2055,54 +2128,1049 @@
         </w:tc>
       </w:tr>
     </w:tbl>
+    <w:p>
+      <w:pPr>
+        <w:pStyle w:val="Heading2"/>
+      </w:pPr>
+      <w:r>
+        <w:t>4.3 Admin Override Governance: Authorized Powers vs Strict Prohibitions</w:t>
+      </w:r>
+    </w:p>
+    <w:p>
+      <w:r>
+        <w:t>To allow narrative flexibility while preserving strict system auditability, NovWrite establishes clear administrative boundaries:</w:t>
+      </w:r>
+    </w:p>
     <w:tbl>
       <w:tblPr>
         <w:tblW w:type="auto" w:w="0"/>
         <w:jc w:val="center"/>
-        <w:tblLayout w:type="fixed"/>
         <w:tblLook w:firstColumn="1" w:firstRow="1" w:lastColumn="0" w:lastRow="0" w:noHBand="0" w:noVBand="1" w:val="04A0"/>
       </w:tblPr>
       <w:tblGrid>
-        <w:gridCol w:w="9360"/>
+        <w:gridCol w:w="1872"/>
+        <w:gridCol w:w="1872"/>
+        <w:gridCol w:w="1872"/>
+        <w:gridCol w:w="1872"/>
+        <w:gridCol w:w="1872"/>
       </w:tblGrid>
       <w:tr>
         <w:tc>
           <w:tcPr>
-            <w:tcW w:type="dxa" w:w="9360"/>
-            <w:shd w:fill="F5F3FF"/>
+            <w:tcW w:type="dxa" w:w="2160"/>
+            <w:shd w:fill="7C3AED"/>
             <w:tcMar>
-              <w:top w:w="120" w:type="dxa"/>
-              <w:bottom w:w="120" w:type="dxa"/>
-              <w:left w:w="180" w:type="dxa"/>
-              <w:right w:w="180" w:type="dxa"/>
+              <w:top w:w="100" w:type="dxa"/>
+              <w:bottom w:w="100" w:type="dxa"/>
+              <w:left w:w="120" w:type="dxa"/>
+              <w:right w:w="120" w:type="dxa"/>
             </w:tcMar>
-            <w:tcBorders>
-              <w:top w:val="none" w:sz="0" w:space="0" w:color="auto"/>
-              <w:left w:val="single" w:sz="24" w:space="0" w:color="7C3AED"/>
-              <w:bottom w:val="none" w:sz="0" w:space="0" w:color="auto"/>
-              <w:right w:val="none" w:sz="0" w:space="0" w:color="auto"/>
-            </w:tcBorders>
           </w:tcPr>
           <w:p>
             <w:pPr>
-              <w:spacing w:before="40" w:after="40"/>
+              <w:jc w:val="left"/>
             </w:pPr>
             <w:r>
               <w:rPr>
                 <w:rFonts w:ascii="Calibri" w:hAnsi="Calibri"/>
                 <w:b/>
-                <w:color w:val="5B21B6"/>
-                <w:sz w:val="20"/>
+                <w:color w:val="FFFFFF"/>
+                <w:sz w:val="19"/>
               </w:rPr>
-              <w:t xml:space="preserve">EXPLAINABILITY GUARANTEE: </w:t>
+              <w:t>Target Operation</w:t>
             </w:r>
+          </w:p>
+        </w:tc>
+        <w:tc>
+          <w:tcPr>
+            <w:tcW w:type="dxa" w:w="1296"/>
+            <w:shd w:fill="7C3AED"/>
+            <w:tcMar>
+              <w:top w:w="100" w:type="dxa"/>
+              <w:bottom w:w="100" w:type="dxa"/>
+              <w:left w:w="120" w:type="dxa"/>
+              <w:right w:w="120" w:type="dxa"/>
+            </w:tcMar>
+          </w:tcPr>
+          <w:p>
+            <w:pPr>
+              <w:jc w:val="left"/>
+            </w:pPr>
+            <w:r>
+              <w:rPr>
+                <w:rFonts w:ascii="Calibri" w:hAnsi="Calibri"/>
+                <w:b/>
+                <w:color w:val="FFFFFF"/>
+                <w:sz w:val="19"/>
+              </w:rPr>
+              <w:t>Permitted for ADMIN?</w:t>
+            </w:r>
+          </w:p>
+        </w:tc>
+        <w:tc>
+          <w:tcPr>
+            <w:tcW w:type="dxa" w:w="1296"/>
+            <w:shd w:fill="7C3AED"/>
+            <w:tcMar>
+              <w:top w:w="100" w:type="dxa"/>
+              <w:bottom w:w="100" w:type="dxa"/>
+              <w:left w:w="120" w:type="dxa"/>
+              <w:right w:w="120" w:type="dxa"/>
+            </w:tcMar>
+          </w:tcPr>
+          <w:p>
+            <w:pPr>
+              <w:jc w:val="left"/>
+            </w:pPr>
+            <w:r>
+              <w:rPr>
+                <w:rFonts w:ascii="Calibri" w:hAnsi="Calibri"/>
+                <w:b/>
+                <w:color w:val="FFFFFF"/>
+                <w:sz w:val="19"/>
+              </w:rPr>
+              <w:t>Permitted for OWNER?</w:t>
+            </w:r>
+          </w:p>
+        </w:tc>
+        <w:tc>
+          <w:tcPr>
+            <w:tcW w:type="dxa" w:w="2448"/>
+            <w:shd w:fill="7C3AED"/>
+            <w:tcMar>
+              <w:top w:w="100" w:type="dxa"/>
+              <w:bottom w:w="100" w:type="dxa"/>
+              <w:left w:w="120" w:type="dxa"/>
+              <w:right w:w="120" w:type="dxa"/>
+            </w:tcMar>
+          </w:tcPr>
+          <w:p>
+            <w:pPr>
+              <w:jc w:val="left"/>
+            </w:pPr>
+            <w:r>
+              <w:rPr>
+                <w:rFonts w:ascii="Calibri" w:hAnsi="Calibri"/>
+                <w:b/>
+                <w:color w:val="FFFFFF"/>
+                <w:sz w:val="19"/>
+              </w:rPr>
+              <w:t>Audit Requirement</w:t>
+            </w:r>
+          </w:p>
+        </w:tc>
+        <w:tc>
+          <w:tcPr>
+            <w:tcW w:type="dxa" w:w="2160"/>
+            <w:shd w:fill="7C3AED"/>
+            <w:tcMar>
+              <w:top w:w="100" w:type="dxa"/>
+              <w:bottom w:w="100" w:type="dxa"/>
+              <w:left w:w="120" w:type="dxa"/>
+              <w:right w:w="120" w:type="dxa"/>
+            </w:tcMar>
+          </w:tcPr>
+          <w:p>
+            <w:pPr>
+              <w:jc w:val="left"/>
+            </w:pPr>
+            <w:r>
+              <w:rPr>
+                <w:rFonts w:ascii="Calibri" w:hAnsi="Calibri"/>
+                <w:b/>
+                <w:color w:val="FFFFFF"/>
+                <w:sz w:val="19"/>
+              </w:rPr>
+              <w:t>Immutable Safety Rail</w:t>
+            </w:r>
+          </w:p>
+        </w:tc>
+      </w:tr>
+      <w:tr>
+        <w:tc>
+          <w:tcPr>
+            <w:tcW w:type="dxa" w:w="2160"/>
+            <w:shd w:fill="FFFFFF"/>
+            <w:tcMar>
+              <w:top w:w="80" w:type="dxa"/>
+              <w:bottom w:w="80" w:type="dxa"/>
+              <w:left w:w="120" w:type="dxa"/>
+              <w:right w:w="120" w:type="dxa"/>
+            </w:tcMar>
+          </w:tcPr>
+          <w:p>
+            <w:pPr>
+              <w:jc w:val="left"/>
+            </w:pPr>
             <w:r>
               <w:rPr>
                 <w:rFonts w:ascii="Calibri" w:hAnsi="Calibri"/>
                 <w:color w:val="1F2937"/>
-                <w:sz w:val="20"/>
+                <w:sz w:val="18"/>
               </w:rPr>
-              <w:t>Explainable Violation Model: Every rule violation generates an RFC 7807 Problem Detail containing: (1) Contradictory claim text, (2) Canonical baseline value, (3) Historical causal event ID that established the baseline, and (4) Actionable resolution suggestions (Accept New Canon, Add Missing Event, Edit Prose).</w:t>
+              <w:t>Force-Approve Invariant Violation</w:t>
+            </w:r>
+          </w:p>
+        </w:tc>
+        <w:tc>
+          <w:tcPr>
+            <w:tcW w:type="dxa" w:w="1296"/>
+            <w:shd w:fill="FFFFFF"/>
+            <w:tcMar>
+              <w:top w:w="80" w:type="dxa"/>
+              <w:bottom w:w="80" w:type="dxa"/>
+              <w:left w:w="120" w:type="dxa"/>
+              <w:right w:w="120" w:type="dxa"/>
+            </w:tcMar>
+          </w:tcPr>
+          <w:p>
+            <w:pPr>
+              <w:jc w:val="left"/>
+            </w:pPr>
+            <w:r>
+              <w:rPr>
+                <w:rFonts w:ascii="Calibri" w:hAnsi="Calibri"/>
+                <w:color w:val="1F2937"/>
+                <w:sz w:val="18"/>
+              </w:rPr>
+              <w:t>Yes</w:t>
+            </w:r>
+          </w:p>
+        </w:tc>
+        <w:tc>
+          <w:tcPr>
+            <w:tcW w:type="dxa" w:w="1296"/>
+            <w:shd w:fill="FFFFFF"/>
+            <w:tcMar>
+              <w:top w:w="80" w:type="dxa"/>
+              <w:bottom w:w="80" w:type="dxa"/>
+              <w:left w:w="120" w:type="dxa"/>
+              <w:right w:w="120" w:type="dxa"/>
+            </w:tcMar>
+          </w:tcPr>
+          <w:p>
+            <w:pPr>
+              <w:jc w:val="left"/>
+            </w:pPr>
+            <w:r>
+              <w:rPr>
+                <w:rFonts w:ascii="Calibri" w:hAnsi="Calibri"/>
+                <w:color w:val="1F2937"/>
+                <w:sz w:val="18"/>
+              </w:rPr>
+              <w:t>Yes</w:t>
+            </w:r>
+          </w:p>
+        </w:tc>
+        <w:tc>
+          <w:tcPr>
+            <w:tcW w:type="dxa" w:w="2448"/>
+            <w:shd w:fill="FFFFFF"/>
+            <w:tcMar>
+              <w:top w:w="80" w:type="dxa"/>
+              <w:bottom w:w="80" w:type="dxa"/>
+              <w:left w:w="120" w:type="dxa"/>
+              <w:right w:w="120" w:type="dxa"/>
+            </w:tcMar>
+          </w:tcPr>
+          <w:p>
+            <w:pPr>
+              <w:jc w:val="left"/>
+            </w:pPr>
+            <w:r>
+              <w:rPr>
+                <w:rFonts w:ascii="Calibri" w:hAnsi="Calibri"/>
+                <w:color w:val="1F2937"/>
+                <w:sz w:val="18"/>
+              </w:rPr>
+              <w:t>Mandatory textual justification logged to admin_override_logs</w:t>
+            </w:r>
+          </w:p>
+        </w:tc>
+        <w:tc>
+          <w:tcPr>
+            <w:tcW w:type="dxa" w:w="2160"/>
+            <w:shd w:fill="FFFFFF"/>
+            <w:tcMar>
+              <w:top w:w="80" w:type="dxa"/>
+              <w:bottom w:w="80" w:type="dxa"/>
+              <w:left w:w="120" w:type="dxa"/>
+              <w:right w:w="120" w:type="dxa"/>
+            </w:tcMar>
+          </w:tcPr>
+          <w:p>
+            <w:pPr>
+              <w:jc w:val="left"/>
+            </w:pPr>
+            <w:r>
+              <w:rPr>
+                <w:rFonts w:ascii="Calibri" w:hAnsi="Calibri"/>
+                <w:color w:val="1F2937"/>
+                <w:sz w:val="18"/>
+              </w:rPr>
+              <w:t>Cannot erase violation history; marks resolved with override flag</w:t>
+            </w:r>
+          </w:p>
+        </w:tc>
+      </w:tr>
+      <w:tr>
+        <w:tc>
+          <w:tcPr>
+            <w:tcW w:type="dxa" w:w="2160"/>
+            <w:shd w:fill="F9FAFB"/>
+            <w:tcMar>
+              <w:top w:w="80" w:type="dxa"/>
+              <w:bottom w:w="80" w:type="dxa"/>
+              <w:left w:w="120" w:type="dxa"/>
+              <w:right w:w="120" w:type="dxa"/>
+            </w:tcMar>
+          </w:tcPr>
+          <w:p>
+            <w:pPr>
+              <w:jc w:val="left"/>
+            </w:pPr>
+            <w:r>
+              <w:rPr>
+                <w:rFonts w:ascii="Calibri" w:hAnsi="Calibri"/>
+                <w:color w:val="1F2937"/>
+                <w:sz w:val="18"/>
+              </w:rPr>
+              <w:t>Break Stale Scene Lock</w:t>
+            </w:r>
+          </w:p>
+        </w:tc>
+        <w:tc>
+          <w:tcPr>
+            <w:tcW w:type="dxa" w:w="1296"/>
+            <w:shd w:fill="F9FAFB"/>
+            <w:tcMar>
+              <w:top w:w="80" w:type="dxa"/>
+              <w:bottom w:w="80" w:type="dxa"/>
+              <w:left w:w="120" w:type="dxa"/>
+              <w:right w:w="120" w:type="dxa"/>
+            </w:tcMar>
+          </w:tcPr>
+          <w:p>
+            <w:pPr>
+              <w:jc w:val="left"/>
+            </w:pPr>
+            <w:r>
+              <w:rPr>
+                <w:rFonts w:ascii="Calibri" w:hAnsi="Calibri"/>
+                <w:color w:val="1F2937"/>
+                <w:sz w:val="18"/>
+              </w:rPr>
+              <w:t>Yes</w:t>
+            </w:r>
+          </w:p>
+        </w:tc>
+        <w:tc>
+          <w:tcPr>
+            <w:tcW w:type="dxa" w:w="1296"/>
+            <w:shd w:fill="F9FAFB"/>
+            <w:tcMar>
+              <w:top w:w="80" w:type="dxa"/>
+              <w:bottom w:w="80" w:type="dxa"/>
+              <w:left w:w="120" w:type="dxa"/>
+              <w:right w:w="120" w:type="dxa"/>
+            </w:tcMar>
+          </w:tcPr>
+          <w:p>
+            <w:pPr>
+              <w:jc w:val="left"/>
+            </w:pPr>
+            <w:r>
+              <w:rPr>
+                <w:rFonts w:ascii="Calibri" w:hAnsi="Calibri"/>
+                <w:color w:val="1F2937"/>
+                <w:sz w:val="18"/>
+              </w:rPr>
+              <w:t>Yes</w:t>
+            </w:r>
+          </w:p>
+        </w:tc>
+        <w:tc>
+          <w:tcPr>
+            <w:tcW w:type="dxa" w:w="2448"/>
+            <w:shd w:fill="F9FAFB"/>
+            <w:tcMar>
+              <w:top w:w="80" w:type="dxa"/>
+              <w:bottom w:w="80" w:type="dxa"/>
+              <w:left w:w="120" w:type="dxa"/>
+              <w:right w:w="120" w:type="dxa"/>
+            </w:tcMar>
+          </w:tcPr>
+          <w:p>
+            <w:pPr>
+              <w:jc w:val="left"/>
+            </w:pPr>
+            <w:r>
+              <w:rPr>
+                <w:rFonts w:ascii="Calibri" w:hAnsi="Calibri"/>
+                <w:color w:val="1F2937"/>
+                <w:sz w:val="18"/>
+              </w:rPr>
+              <w:t>Lease expiration verification or reason logged</w:t>
+            </w:r>
+          </w:p>
+        </w:tc>
+        <w:tc>
+          <w:tcPr>
+            <w:tcW w:type="dxa" w:w="2160"/>
+            <w:shd w:fill="F9FAFB"/>
+            <w:tcMar>
+              <w:top w:w="80" w:type="dxa"/>
+              <w:bottom w:w="80" w:type="dxa"/>
+              <w:left w:w="120" w:type="dxa"/>
+              <w:right w:w="120" w:type="dxa"/>
+            </w:tcMar>
+          </w:tcPr>
+          <w:p>
+            <w:pPr>
+              <w:jc w:val="left"/>
+            </w:pPr>
+            <w:r>
+              <w:rPr>
+                <w:rFonts w:ascii="Calibri" w:hAnsi="Calibri"/>
+                <w:color w:val="1F2937"/>
+                <w:sz w:val="18"/>
+              </w:rPr>
+              <w:t>Cannot overwrite uncommitted client drafts</w:t>
+            </w:r>
+          </w:p>
+        </w:tc>
+      </w:tr>
+      <w:tr>
+        <w:tc>
+          <w:tcPr>
+            <w:tcW w:type="dxa" w:w="2160"/>
+            <w:shd w:fill="FFFFFF"/>
+            <w:tcMar>
+              <w:top w:w="80" w:type="dxa"/>
+              <w:bottom w:w="80" w:type="dxa"/>
+              <w:left w:w="120" w:type="dxa"/>
+              <w:right w:w="120" w:type="dxa"/>
+            </w:tcMar>
+          </w:tcPr>
+          <w:p>
+            <w:pPr>
+              <w:jc w:val="left"/>
+            </w:pPr>
+            <w:r>
+              <w:rPr>
+                <w:rFonts w:ascii="Calibri" w:hAnsi="Calibri"/>
+                <w:color w:val="1F2937"/>
+                <w:sz w:val="18"/>
+              </w:rPr>
+              <w:t>Merge Conflicting Timeline Branches</w:t>
+            </w:r>
+          </w:p>
+        </w:tc>
+        <w:tc>
+          <w:tcPr>
+            <w:tcW w:type="dxa" w:w="1296"/>
+            <w:shd w:fill="FFFFFF"/>
+            <w:tcMar>
+              <w:top w:w="80" w:type="dxa"/>
+              <w:bottom w:w="80" w:type="dxa"/>
+              <w:left w:w="120" w:type="dxa"/>
+              <w:right w:w="120" w:type="dxa"/>
+            </w:tcMar>
+          </w:tcPr>
+          <w:p>
+            <w:pPr>
+              <w:jc w:val="left"/>
+            </w:pPr>
+            <w:r>
+              <w:rPr>
+                <w:rFonts w:ascii="Calibri" w:hAnsi="Calibri"/>
+                <w:color w:val="1F2937"/>
+                <w:sz w:val="18"/>
+              </w:rPr>
+              <w:t>Yes</w:t>
+            </w:r>
+          </w:p>
+        </w:tc>
+        <w:tc>
+          <w:tcPr>
+            <w:tcW w:type="dxa" w:w="1296"/>
+            <w:shd w:fill="FFFFFF"/>
+            <w:tcMar>
+              <w:top w:w="80" w:type="dxa"/>
+              <w:bottom w:w="80" w:type="dxa"/>
+              <w:left w:w="120" w:type="dxa"/>
+              <w:right w:w="120" w:type="dxa"/>
+            </w:tcMar>
+          </w:tcPr>
+          <w:p>
+            <w:pPr>
+              <w:jc w:val="left"/>
+            </w:pPr>
+            <w:r>
+              <w:rPr>
+                <w:rFonts w:ascii="Calibri" w:hAnsi="Calibri"/>
+                <w:color w:val="1F2937"/>
+                <w:sz w:val="18"/>
+              </w:rPr>
+              <w:t>Yes</w:t>
+            </w:r>
+          </w:p>
+        </w:tc>
+        <w:tc>
+          <w:tcPr>
+            <w:tcW w:type="dxa" w:w="2448"/>
+            <w:shd w:fill="FFFFFF"/>
+            <w:tcMar>
+              <w:top w:w="80" w:type="dxa"/>
+              <w:bottom w:w="80" w:type="dxa"/>
+              <w:left w:w="120" w:type="dxa"/>
+              <w:right w:w="120" w:type="dxa"/>
+            </w:tcMar>
+          </w:tcPr>
+          <w:p>
+            <w:pPr>
+              <w:jc w:val="left"/>
+            </w:pPr>
+            <w:r>
+              <w:rPr>
+                <w:rFonts w:ascii="Calibri" w:hAnsi="Calibri"/>
+                <w:color w:val="1F2937"/>
+                <w:sz w:val="18"/>
+              </w:rPr>
+              <w:t>Conflict resolution rationale recorded</w:t>
+            </w:r>
+          </w:p>
+        </w:tc>
+        <w:tc>
+          <w:tcPr>
+            <w:tcW w:type="dxa" w:w="2160"/>
+            <w:shd w:fill="FFFFFF"/>
+            <w:tcMar>
+              <w:top w:w="80" w:type="dxa"/>
+              <w:bottom w:w="80" w:type="dxa"/>
+              <w:left w:w="120" w:type="dxa"/>
+              <w:right w:w="120" w:type="dxa"/>
+            </w:tcMar>
+          </w:tcPr>
+          <w:p>
+            <w:pPr>
+              <w:jc w:val="left"/>
+            </w:pPr>
+            <w:r>
+              <w:rPr>
+                <w:rFonts w:ascii="Calibri" w:hAnsi="Calibri"/>
+                <w:color w:val="1F2937"/>
+                <w:sz w:val="18"/>
+              </w:rPr>
+              <w:t>Replays new branch; past effects remain append-only</w:t>
+            </w:r>
+          </w:p>
+        </w:tc>
+      </w:tr>
+      <w:tr>
+        <w:tc>
+          <w:tcPr>
+            <w:tcW w:type="dxa" w:w="2160"/>
+            <w:shd w:fill="F9FAFB"/>
+            <w:tcMar>
+              <w:top w:w="80" w:type="dxa"/>
+              <w:bottom w:w="80" w:type="dxa"/>
+              <w:left w:w="120" w:type="dxa"/>
+              <w:right w:w="120" w:type="dxa"/>
+            </w:tcMar>
+          </w:tcPr>
+          <w:p>
+            <w:pPr>
+              <w:jc w:val="left"/>
+            </w:pPr>
+            <w:r>
+              <w:rPr>
+                <w:rFonts w:ascii="Calibri" w:hAnsi="Calibri"/>
+                <w:color w:val="1F2937"/>
+                <w:sz w:val="18"/>
+              </w:rPr>
+              <w:t>Modify Project Custom Schemas</w:t>
+            </w:r>
+          </w:p>
+        </w:tc>
+        <w:tc>
+          <w:tcPr>
+            <w:tcW w:type="dxa" w:w="1296"/>
+            <w:shd w:fill="F9FAFB"/>
+            <w:tcMar>
+              <w:top w:w="80" w:type="dxa"/>
+              <w:bottom w:w="80" w:type="dxa"/>
+              <w:left w:w="120" w:type="dxa"/>
+              <w:right w:w="120" w:type="dxa"/>
+            </w:tcMar>
+          </w:tcPr>
+          <w:p>
+            <w:pPr>
+              <w:jc w:val="left"/>
+            </w:pPr>
+            <w:r>
+              <w:rPr>
+                <w:rFonts w:ascii="Calibri" w:hAnsi="Calibri"/>
+                <w:color w:val="1F2937"/>
+                <w:sz w:val="18"/>
+              </w:rPr>
+              <w:t>Yes</w:t>
+            </w:r>
+          </w:p>
+        </w:tc>
+        <w:tc>
+          <w:tcPr>
+            <w:tcW w:type="dxa" w:w="1296"/>
+            <w:shd w:fill="F9FAFB"/>
+            <w:tcMar>
+              <w:top w:w="80" w:type="dxa"/>
+              <w:bottom w:w="80" w:type="dxa"/>
+              <w:left w:w="120" w:type="dxa"/>
+              <w:right w:w="120" w:type="dxa"/>
+            </w:tcMar>
+          </w:tcPr>
+          <w:p>
+            <w:pPr>
+              <w:jc w:val="left"/>
+            </w:pPr>
+            <w:r>
+              <w:rPr>
+                <w:rFonts w:ascii="Calibri" w:hAnsi="Calibri"/>
+                <w:color w:val="1F2937"/>
+                <w:sz w:val="18"/>
+              </w:rPr>
+              <w:t>Yes</w:t>
+            </w:r>
+          </w:p>
+        </w:tc>
+        <w:tc>
+          <w:tcPr>
+            <w:tcW w:type="dxa" w:w="2448"/>
+            <w:shd w:fill="F9FAFB"/>
+            <w:tcMar>
+              <w:top w:w="80" w:type="dxa"/>
+              <w:bottom w:w="80" w:type="dxa"/>
+              <w:left w:w="120" w:type="dxa"/>
+              <w:right w:w="120" w:type="dxa"/>
+            </w:tcMar>
+          </w:tcPr>
+          <w:p>
+            <w:pPr>
+              <w:jc w:val="left"/>
+            </w:pPr>
+            <w:r>
+              <w:rPr>
+                <w:rFonts w:ascii="Calibri" w:hAnsi="Calibri"/>
+                <w:color w:val="1F2937"/>
+                <w:sz w:val="18"/>
+              </w:rPr>
+              <w:t>Schema version bump logged</w:t>
+            </w:r>
+          </w:p>
+        </w:tc>
+        <w:tc>
+          <w:tcPr>
+            <w:tcW w:type="dxa" w:w="2160"/>
+            <w:shd w:fill="F9FAFB"/>
+            <w:tcMar>
+              <w:top w:w="80" w:type="dxa"/>
+              <w:bottom w:w="80" w:type="dxa"/>
+              <w:left w:w="120" w:type="dxa"/>
+              <w:right w:w="120" w:type="dxa"/>
+            </w:tcMar>
+          </w:tcPr>
+          <w:p>
+            <w:pPr>
+              <w:jc w:val="left"/>
+            </w:pPr>
+            <w:r>
+              <w:rPr>
+                <w:rFonts w:ascii="Calibri" w:hAnsi="Calibri"/>
+                <w:color w:val="1F2937"/>
+                <w:sz w:val="18"/>
+              </w:rPr>
+              <w:t>Legacy entity data preserved with deprecation flags</w:t>
+            </w:r>
+          </w:p>
+        </w:tc>
+      </w:tr>
+      <w:tr>
+        <w:tc>
+          <w:tcPr>
+            <w:tcW w:type="dxa" w:w="2160"/>
+            <w:shd w:fill="FFFFFF"/>
+            <w:tcMar>
+              <w:top w:w="80" w:type="dxa"/>
+              <w:bottom w:w="80" w:type="dxa"/>
+              <w:left w:w="120" w:type="dxa"/>
+              <w:right w:w="120" w:type="dxa"/>
+            </w:tcMar>
+          </w:tcPr>
+          <w:p>
+            <w:pPr>
+              <w:jc w:val="left"/>
+            </w:pPr>
+            <w:r>
+              <w:rPr>
+                <w:rFonts w:ascii="Calibri" w:hAnsi="Calibri"/>
+                <w:color w:val="1F2937"/>
+                <w:sz w:val="18"/>
+              </w:rPr>
+              <w:t>Transfer / Delete Project</w:t>
+            </w:r>
+          </w:p>
+        </w:tc>
+        <w:tc>
+          <w:tcPr>
+            <w:tcW w:type="dxa" w:w="1296"/>
+            <w:shd w:fill="FFFFFF"/>
+            <w:tcMar>
+              <w:top w:w="80" w:type="dxa"/>
+              <w:bottom w:w="80" w:type="dxa"/>
+              <w:left w:w="120" w:type="dxa"/>
+              <w:right w:w="120" w:type="dxa"/>
+            </w:tcMar>
+          </w:tcPr>
+          <w:p>
+            <w:pPr>
+              <w:jc w:val="left"/>
+            </w:pPr>
+            <w:r>
+              <w:rPr>
+                <w:rFonts w:ascii="Calibri" w:hAnsi="Calibri"/>
+                <w:color w:val="1F2937"/>
+                <w:sz w:val="18"/>
+              </w:rPr>
+              <w:t>NO</w:t>
+            </w:r>
+          </w:p>
+        </w:tc>
+        <w:tc>
+          <w:tcPr>
+            <w:tcW w:type="dxa" w:w="1296"/>
+            <w:shd w:fill="FFFFFF"/>
+            <w:tcMar>
+              <w:top w:w="80" w:type="dxa"/>
+              <w:bottom w:w="80" w:type="dxa"/>
+              <w:left w:w="120" w:type="dxa"/>
+              <w:right w:w="120" w:type="dxa"/>
+            </w:tcMar>
+          </w:tcPr>
+          <w:p>
+            <w:pPr>
+              <w:jc w:val="left"/>
+            </w:pPr>
+            <w:r>
+              <w:rPr>
+                <w:rFonts w:ascii="Calibri" w:hAnsi="Calibri"/>
+                <w:color w:val="1F2937"/>
+                <w:sz w:val="18"/>
+              </w:rPr>
+              <w:t>YES</w:t>
+            </w:r>
+          </w:p>
+        </w:tc>
+        <w:tc>
+          <w:tcPr>
+            <w:tcW w:type="dxa" w:w="2448"/>
+            <w:shd w:fill="FFFFFF"/>
+            <w:tcMar>
+              <w:top w:w="80" w:type="dxa"/>
+              <w:bottom w:w="80" w:type="dxa"/>
+              <w:left w:w="120" w:type="dxa"/>
+              <w:right w:w="120" w:type="dxa"/>
+            </w:tcMar>
+          </w:tcPr>
+          <w:p>
+            <w:pPr>
+              <w:jc w:val="left"/>
+            </w:pPr>
+            <w:r>
+              <w:rPr>
+                <w:rFonts w:ascii="Calibri" w:hAnsi="Calibri"/>
+                <w:color w:val="1F2937"/>
+                <w:sz w:val="18"/>
+              </w:rPr>
+              <w:t>Multi-factor confirmation + Owner password check</w:t>
+            </w:r>
+          </w:p>
+        </w:tc>
+        <w:tc>
+          <w:tcPr>
+            <w:tcW w:type="dxa" w:w="2160"/>
+            <w:shd w:fill="FFFFFF"/>
+            <w:tcMar>
+              <w:top w:w="80" w:type="dxa"/>
+              <w:bottom w:w="80" w:type="dxa"/>
+              <w:left w:w="120" w:type="dxa"/>
+              <w:right w:w="120" w:type="dxa"/>
+            </w:tcMar>
+          </w:tcPr>
+          <w:p>
+            <w:pPr>
+              <w:jc w:val="left"/>
+            </w:pPr>
+            <w:r>
+              <w:rPr>
+                <w:rFonts w:ascii="Calibri" w:hAnsi="Calibri"/>
+                <w:color w:val="1F2937"/>
+                <w:sz w:val="18"/>
+              </w:rPr>
+              <w:t>Project deletion is strictly restricted to project OWNER</w:t>
+            </w:r>
+          </w:p>
+        </w:tc>
+      </w:tr>
+      <w:tr>
+        <w:tc>
+          <w:tcPr>
+            <w:tcW w:type="dxa" w:w="2160"/>
+            <w:shd w:fill="F9FAFB"/>
+            <w:tcMar>
+              <w:top w:w="80" w:type="dxa"/>
+              <w:bottom w:w="80" w:type="dxa"/>
+              <w:left w:w="120" w:type="dxa"/>
+              <w:right w:w="120" w:type="dxa"/>
+            </w:tcMar>
+          </w:tcPr>
+          <w:p>
+            <w:pPr>
+              <w:jc w:val="left"/>
+            </w:pPr>
+            <w:r>
+              <w:rPr>
+                <w:rFonts w:ascii="Calibri" w:hAnsi="Calibri"/>
+                <w:color w:val="1F2937"/>
+                <w:sz w:val="18"/>
+              </w:rPr>
+              <w:t>Cross-Tenant Project Access</w:t>
+            </w:r>
+          </w:p>
+        </w:tc>
+        <w:tc>
+          <w:tcPr>
+            <w:tcW w:type="dxa" w:w="1296"/>
+            <w:shd w:fill="F9FAFB"/>
+            <w:tcMar>
+              <w:top w:w="80" w:type="dxa"/>
+              <w:bottom w:w="80" w:type="dxa"/>
+              <w:left w:w="120" w:type="dxa"/>
+              <w:right w:w="120" w:type="dxa"/>
+            </w:tcMar>
+          </w:tcPr>
+          <w:p>
+            <w:pPr>
+              <w:jc w:val="left"/>
+            </w:pPr>
+            <w:r>
+              <w:rPr>
+                <w:rFonts w:ascii="Calibri" w:hAnsi="Calibri"/>
+                <w:color w:val="1F2937"/>
+                <w:sz w:val="18"/>
+              </w:rPr>
+              <w:t>NO</w:t>
+            </w:r>
+          </w:p>
+        </w:tc>
+        <w:tc>
+          <w:tcPr>
+            <w:tcW w:type="dxa" w:w="1296"/>
+            <w:shd w:fill="F9FAFB"/>
+            <w:tcMar>
+              <w:top w:w="80" w:type="dxa"/>
+              <w:bottom w:w="80" w:type="dxa"/>
+              <w:left w:w="120" w:type="dxa"/>
+              <w:right w:w="120" w:type="dxa"/>
+            </w:tcMar>
+          </w:tcPr>
+          <w:p>
+            <w:pPr>
+              <w:jc w:val="left"/>
+            </w:pPr>
+            <w:r>
+              <w:rPr>
+                <w:rFonts w:ascii="Calibri" w:hAnsi="Calibri"/>
+                <w:color w:val="1F2937"/>
+                <w:sz w:val="18"/>
+              </w:rPr>
+              <w:t>NO</w:t>
+            </w:r>
+          </w:p>
+        </w:tc>
+        <w:tc>
+          <w:tcPr>
+            <w:tcW w:type="dxa" w:w="2448"/>
+            <w:shd w:fill="F9FAFB"/>
+            <w:tcMar>
+              <w:top w:w="80" w:type="dxa"/>
+              <w:bottom w:w="80" w:type="dxa"/>
+              <w:left w:w="120" w:type="dxa"/>
+              <w:right w:w="120" w:type="dxa"/>
+            </w:tcMar>
+          </w:tcPr>
+          <w:p>
+            <w:pPr>
+              <w:jc w:val="left"/>
+            </w:pPr>
+            <w:r>
+              <w:rPr>
+                <w:rFonts w:ascii="Calibri" w:hAnsi="Calibri"/>
+                <w:color w:val="1F2937"/>
+                <w:sz w:val="18"/>
+              </w:rPr>
+              <w:t>Blocked at SQL &amp; JWT middleware level</w:t>
+            </w:r>
+          </w:p>
+        </w:tc>
+        <w:tc>
+          <w:tcPr>
+            <w:tcW w:type="dxa" w:w="2160"/>
+            <w:shd w:fill="F9FAFB"/>
+            <w:tcMar>
+              <w:top w:w="80" w:type="dxa"/>
+              <w:bottom w:w="80" w:type="dxa"/>
+              <w:left w:w="120" w:type="dxa"/>
+              <w:right w:w="120" w:type="dxa"/>
+            </w:tcMar>
+          </w:tcPr>
+          <w:p>
+            <w:pPr>
+              <w:jc w:val="left"/>
+            </w:pPr>
+            <w:r>
+              <w:rPr>
+                <w:rFonts w:ascii="Calibri" w:hAnsi="Calibri"/>
+                <w:color w:val="1F2937"/>
+                <w:sz w:val="18"/>
+              </w:rPr>
+              <w:t>Absolute tenant isolation between different fictional universes</w:t>
+            </w:r>
+          </w:p>
+        </w:tc>
+      </w:tr>
+      <w:tr>
+        <w:tc>
+          <w:tcPr>
+            <w:tcW w:type="dxa" w:w="2160"/>
+            <w:shd w:fill="FFFFFF"/>
+            <w:tcMar>
+              <w:top w:w="80" w:type="dxa"/>
+              <w:bottom w:w="80" w:type="dxa"/>
+              <w:left w:w="120" w:type="dxa"/>
+              <w:right w:w="120" w:type="dxa"/>
+            </w:tcMar>
+          </w:tcPr>
+          <w:p>
+            <w:pPr>
+              <w:jc w:val="left"/>
+            </w:pPr>
+            <w:r>
+              <w:rPr>
+                <w:rFonts w:ascii="Calibri" w:hAnsi="Calibri"/>
+                <w:color w:val="1F2937"/>
+                <w:sz w:val="18"/>
+              </w:rPr>
+              <w:t>Impersonate Author Attribution</w:t>
+            </w:r>
+          </w:p>
+        </w:tc>
+        <w:tc>
+          <w:tcPr>
+            <w:tcW w:type="dxa" w:w="1296"/>
+            <w:shd w:fill="FFFFFF"/>
+            <w:tcMar>
+              <w:top w:w="80" w:type="dxa"/>
+              <w:bottom w:w="80" w:type="dxa"/>
+              <w:left w:w="120" w:type="dxa"/>
+              <w:right w:w="120" w:type="dxa"/>
+            </w:tcMar>
+          </w:tcPr>
+          <w:p>
+            <w:pPr>
+              <w:jc w:val="left"/>
+            </w:pPr>
+            <w:r>
+              <w:rPr>
+                <w:rFonts w:ascii="Calibri" w:hAnsi="Calibri"/>
+                <w:color w:val="1F2937"/>
+                <w:sz w:val="18"/>
+              </w:rPr>
+              <w:t>NO</w:t>
+            </w:r>
+          </w:p>
+        </w:tc>
+        <w:tc>
+          <w:tcPr>
+            <w:tcW w:type="dxa" w:w="1296"/>
+            <w:shd w:fill="FFFFFF"/>
+            <w:tcMar>
+              <w:top w:w="80" w:type="dxa"/>
+              <w:bottom w:w="80" w:type="dxa"/>
+              <w:left w:w="120" w:type="dxa"/>
+              <w:right w:w="120" w:type="dxa"/>
+            </w:tcMar>
+          </w:tcPr>
+          <w:p>
+            <w:pPr>
+              <w:jc w:val="left"/>
+            </w:pPr>
+            <w:r>
+              <w:rPr>
+                <w:rFonts w:ascii="Calibri" w:hAnsi="Calibri"/>
+                <w:color w:val="1F2937"/>
+                <w:sz w:val="18"/>
+              </w:rPr>
+              <w:t>NO</w:t>
+            </w:r>
+          </w:p>
+        </w:tc>
+        <w:tc>
+          <w:tcPr>
+            <w:tcW w:type="dxa" w:w="2448"/>
+            <w:shd w:fill="FFFFFF"/>
+            <w:tcMar>
+              <w:top w:w="80" w:type="dxa"/>
+              <w:bottom w:w="80" w:type="dxa"/>
+              <w:left w:w="120" w:type="dxa"/>
+              <w:right w:w="120" w:type="dxa"/>
+            </w:tcMar>
+          </w:tcPr>
+          <w:p>
+            <w:pPr>
+              <w:jc w:val="left"/>
+            </w:pPr>
+            <w:r>
+              <w:rPr>
+                <w:rFonts w:ascii="Calibri" w:hAnsi="Calibri"/>
+                <w:color w:val="1F2937"/>
+                <w:sz w:val="18"/>
+              </w:rPr>
+              <w:t>Blocked by cryptographic user ID binding</w:t>
+            </w:r>
+          </w:p>
+        </w:tc>
+        <w:tc>
+          <w:tcPr>
+            <w:tcW w:type="dxa" w:w="2160"/>
+            <w:shd w:fill="FFFFFF"/>
+            <w:tcMar>
+              <w:top w:w="80" w:type="dxa"/>
+              <w:bottom w:w="80" w:type="dxa"/>
+              <w:left w:w="120" w:type="dxa"/>
+              <w:right w:w="120" w:type="dxa"/>
+            </w:tcMar>
+          </w:tcPr>
+          <w:p>
+            <w:pPr>
+              <w:jc w:val="left"/>
+            </w:pPr>
+            <w:r>
+              <w:rPr>
+                <w:rFonts w:ascii="Calibri" w:hAnsi="Calibri"/>
+                <w:color w:val="1F2937"/>
+                <w:sz w:val="18"/>
+              </w:rPr>
+              <w:t>Edits always record the executing user's true ID</w:t>
             </w:r>
           </w:p>
         </w:tc>
@@ -2143,6 +3211,8 @@
         <w:br/>
         <w:t xml:space="preserve">   - Focuses exclusively on writing velocity with a full-height markdown prose canvas.</w:t>
         <w:br/>
+        <w:t xml:space="preserve">   - Real-time author presence avatars and active scene lock banners.</w:t>
+        <w:br/>
         <w:t xml:space="preserve">   - Minimalist status pills indicate real-time continuity health without interrupting the creative flow.</w:t>
         <w:br/>
         <w:t xml:space="preserve">   - Non-intrusive slide-over drawers provide instant lore lookup on demand.</w:t>
@@ -2164,7 +3234,7 @@
         <w:br/>
         <w:t xml:space="preserve">   - Relationships (/world/relationships): Master 2D relationship matrix and node-link network visualizer.</w:t>
         <w:br/>
-        <w:t xml:space="preserve">   - Continuity Health &amp; Canon Reconciler (/world/audit): System-wide violation dashboard with one-click remediation.</w:t>
+        <w:t xml:space="preserve">   - Continuity Health &amp; Canon Reconciler (/world/audit): System-wide violation dashboard with Admin Override Modal.</w:t>
       </w:r>
     </w:p>
     <w:tbl>
@@ -2795,7 +3865,7 @@
     </w:p>
     <w:p>
       <w:r>
-        <w:t>To guarantee sub-5ms state retrieval across narratives with thousands of events, NovWrite implements a 5-tier Redis 7.2 caching topology.</w:t>
+        <w:t>To guarantee sub-5ms state retrieval and multi-user concurrency across narratives with thousands of events, NovWrite implements a 7-tier Redis 7.2 caching topology.</w:t>
       </w:r>
     </w:p>
     <w:tbl>
@@ -2965,7 +4035,7 @@
                 <w:color w:val="1F2937"/>
                 <w:sz w:val="18"/>
               </w:rPr>
-              <w:t>1. Auth &amp; Session</w:t>
+              <w:t>1. Auth &amp; RBAC</w:t>
             </w:r>
           </w:p>
         </w:tc>
@@ -3578,6 +4648,260 @@
           </w:p>
         </w:tc>
       </w:tr>
+      <w:tr>
+        <w:tc>
+          <w:tcPr>
+            <w:tcW w:type="dxa" w:w="1728"/>
+            <w:shd w:fill="F9FAFB"/>
+            <w:tcMar>
+              <w:top w:w="80" w:type="dxa"/>
+              <w:bottom w:w="80" w:type="dxa"/>
+              <w:left w:w="120" w:type="dxa"/>
+              <w:right w:w="120" w:type="dxa"/>
+            </w:tcMar>
+          </w:tcPr>
+          <w:p>
+            <w:pPr>
+              <w:jc w:val="left"/>
+            </w:pPr>
+            <w:r>
+              <w:rPr>
+                <w:rFonts w:ascii="Calibri" w:hAnsi="Calibri"/>
+                <w:color w:val="1F2937"/>
+                <w:sz w:val="18"/>
+              </w:rPr>
+              <w:t>6. Scene Lease Lock</w:t>
+            </w:r>
+          </w:p>
+        </w:tc>
+        <w:tc>
+          <w:tcPr>
+            <w:tcW w:type="dxa" w:w="3024"/>
+            <w:shd w:fill="F9FAFB"/>
+            <w:tcMar>
+              <w:top w:w="80" w:type="dxa"/>
+              <w:bottom w:w="80" w:type="dxa"/>
+              <w:left w:w="120" w:type="dxa"/>
+              <w:right w:w="120" w:type="dxa"/>
+            </w:tcMar>
+          </w:tcPr>
+          <w:p>
+            <w:pPr>
+              <w:jc w:val="left"/>
+            </w:pPr>
+            <w:r>
+              <w:rPr>
+                <w:rFonts w:ascii="Calibri" w:hAnsi="Calibri"/>
+                <w:color w:val="1F2937"/>
+                <w:sz w:val="18"/>
+              </w:rPr>
+              <w:t>novwrite:v1:proj:{id}:scene:{id}:lease</w:t>
+            </w:r>
+          </w:p>
+        </w:tc>
+        <w:tc>
+          <w:tcPr>
+            <w:tcW w:type="dxa" w:w="1296"/>
+            <w:shd w:fill="F9FAFB"/>
+            <w:tcMar>
+              <w:top w:w="80" w:type="dxa"/>
+              <w:bottom w:w="80" w:type="dxa"/>
+              <w:left w:w="120" w:type="dxa"/>
+              <w:right w:w="120" w:type="dxa"/>
+            </w:tcMar>
+          </w:tcPr>
+          <w:p>
+            <w:pPr>
+              <w:jc w:val="left"/>
+            </w:pPr>
+            <w:r>
+              <w:rPr>
+                <w:rFonts w:ascii="Calibri" w:hAnsi="Calibri"/>
+                <w:color w:val="1F2937"/>
+                <w:sz w:val="18"/>
+              </w:rPr>
+              <w:t>JSON</w:t>
+            </w:r>
+          </w:p>
+        </w:tc>
+        <w:tc>
+          <w:tcPr>
+            <w:tcW w:type="dxa" w:w="1152"/>
+            <w:shd w:fill="F9FAFB"/>
+            <w:tcMar>
+              <w:top w:w="80" w:type="dxa"/>
+              <w:bottom w:w="80" w:type="dxa"/>
+              <w:left w:w="120" w:type="dxa"/>
+              <w:right w:w="120" w:type="dxa"/>
+            </w:tcMar>
+          </w:tcPr>
+          <w:p>
+            <w:pPr>
+              <w:jc w:val="left"/>
+            </w:pPr>
+            <w:r>
+              <w:rPr>
+                <w:rFonts w:ascii="Calibri" w:hAnsi="Calibri"/>
+                <w:color w:val="1F2937"/>
+                <w:sz w:val="18"/>
+              </w:rPr>
+              <w:t>60 Secs</w:t>
+            </w:r>
+          </w:p>
+        </w:tc>
+        <w:tc>
+          <w:tcPr>
+            <w:tcW w:type="dxa" w:w="2160"/>
+            <w:shd w:fill="F9FAFB"/>
+            <w:tcMar>
+              <w:top w:w="80" w:type="dxa"/>
+              <w:bottom w:w="80" w:type="dxa"/>
+              <w:left w:w="120" w:type="dxa"/>
+              <w:right w:w="120" w:type="dxa"/>
+            </w:tcMar>
+          </w:tcPr>
+          <w:p>
+            <w:pPr>
+              <w:jc w:val="left"/>
+            </w:pPr>
+            <w:r>
+              <w:rPr>
+                <w:rFonts w:ascii="Calibri" w:hAnsi="Calibri"/>
+                <w:color w:val="1F2937"/>
+                <w:sz w:val="18"/>
+              </w:rPr>
+              <w:t>Heartbeat Refresh / Admin Break</w:t>
+            </w:r>
+          </w:p>
+        </w:tc>
+      </w:tr>
+      <w:tr>
+        <w:tc>
+          <w:tcPr>
+            <w:tcW w:type="dxa" w:w="1728"/>
+            <w:shd w:fill="FFFFFF"/>
+            <w:tcMar>
+              <w:top w:w="80" w:type="dxa"/>
+              <w:bottom w:w="80" w:type="dxa"/>
+              <w:left w:w="120" w:type="dxa"/>
+              <w:right w:w="120" w:type="dxa"/>
+            </w:tcMar>
+          </w:tcPr>
+          <w:p>
+            <w:pPr>
+              <w:jc w:val="left"/>
+            </w:pPr>
+            <w:r>
+              <w:rPr>
+                <w:rFonts w:ascii="Calibri" w:hAnsi="Calibri"/>
+                <w:color w:val="1F2937"/>
+                <w:sz w:val="18"/>
+              </w:rPr>
+              <w:t>7. Multi-User Presence</w:t>
+            </w:r>
+          </w:p>
+        </w:tc>
+        <w:tc>
+          <w:tcPr>
+            <w:tcW w:type="dxa" w:w="3024"/>
+            <w:shd w:fill="FFFFFF"/>
+            <w:tcMar>
+              <w:top w:w="80" w:type="dxa"/>
+              <w:bottom w:w="80" w:type="dxa"/>
+              <w:left w:w="120" w:type="dxa"/>
+              <w:right w:w="120" w:type="dxa"/>
+            </w:tcMar>
+          </w:tcPr>
+          <w:p>
+            <w:pPr>
+              <w:jc w:val="left"/>
+            </w:pPr>
+            <w:r>
+              <w:rPr>
+                <w:rFonts w:ascii="Calibri" w:hAnsi="Calibri"/>
+                <w:color w:val="1F2937"/>
+                <w:sz w:val="18"/>
+              </w:rPr>
+              <w:t>novwrite:v1:proj:{id}:presence</w:t>
+            </w:r>
+          </w:p>
+        </w:tc>
+        <w:tc>
+          <w:tcPr>
+            <w:tcW w:type="dxa" w:w="1296"/>
+            <w:shd w:fill="FFFFFF"/>
+            <w:tcMar>
+              <w:top w:w="80" w:type="dxa"/>
+              <w:bottom w:w="80" w:type="dxa"/>
+              <w:left w:w="120" w:type="dxa"/>
+              <w:right w:w="120" w:type="dxa"/>
+            </w:tcMar>
+          </w:tcPr>
+          <w:p>
+            <w:pPr>
+              <w:jc w:val="left"/>
+            </w:pPr>
+            <w:r>
+              <w:rPr>
+                <w:rFonts w:ascii="Calibri" w:hAnsi="Calibri"/>
+                <w:color w:val="1F2937"/>
+                <w:sz w:val="18"/>
+              </w:rPr>
+              <w:t>Hash / Set</w:t>
+            </w:r>
+          </w:p>
+        </w:tc>
+        <w:tc>
+          <w:tcPr>
+            <w:tcW w:type="dxa" w:w="1152"/>
+            <w:shd w:fill="FFFFFF"/>
+            <w:tcMar>
+              <w:top w:w="80" w:type="dxa"/>
+              <w:bottom w:w="80" w:type="dxa"/>
+              <w:left w:w="120" w:type="dxa"/>
+              <w:right w:w="120" w:type="dxa"/>
+            </w:tcMar>
+          </w:tcPr>
+          <w:p>
+            <w:pPr>
+              <w:jc w:val="left"/>
+            </w:pPr>
+            <w:r>
+              <w:rPr>
+                <w:rFonts w:ascii="Calibri" w:hAnsi="Calibri"/>
+                <w:color w:val="1F2937"/>
+                <w:sz w:val="18"/>
+              </w:rPr>
+              <w:t>30 Secs</w:t>
+            </w:r>
+          </w:p>
+        </w:tc>
+        <w:tc>
+          <w:tcPr>
+            <w:tcW w:type="dxa" w:w="2160"/>
+            <w:shd w:fill="FFFFFF"/>
+            <w:tcMar>
+              <w:top w:w="80" w:type="dxa"/>
+              <w:bottom w:w="80" w:type="dxa"/>
+              <w:left w:w="120" w:type="dxa"/>
+              <w:right w:w="120" w:type="dxa"/>
+            </w:tcMar>
+          </w:tcPr>
+          <w:p>
+            <w:pPr>
+              <w:jc w:val="left"/>
+            </w:pPr>
+            <w:r>
+              <w:rPr>
+                <w:rFonts w:ascii="Calibri" w:hAnsi="Calibri"/>
+                <w:color w:val="1F2937"/>
+                <w:sz w:val="18"/>
+              </w:rPr>
+              <w:t>Heartbeat Sync</w:t>
+            </w:r>
+          </w:p>
+        </w:tc>
+      </w:tr>
     </w:tbl>
     <w:p>
       <w:pPr>
@@ -3672,7 +4996,7 @@
     </w:p>
     <w:p>
       <w:r>
-        <w:t>NovWrite establishes a new architectural benchmark for AI-assisted creative writing systems. By enforcing Canon Over AI Memory, combining relational prose structures with dynamic JSONB schemas, and leveraging event-sourcing state reconstruction, the platform guarantees deterministic lore consistency across massive multi-chapter narratives.</w:t>
+        <w:t>NovWrite establishes a new architectural benchmark for AI-assisted creative writing systems. By enforcing Canon Over AI Memory, combining relational prose structures with dynamic JSONB schemas, providing robust multi-user RBAC and scene leases, and leveraging event-sourcing state reconstruction with audited admin overrides, the platform guarantees deterministic lore consistency across massive multi-chapter narratives.</w:t>
       </w:r>
     </w:p>
     <w:p>

</xml_diff>

<commit_message>
feat(auth): add platform admin capabilities and rename in-app project roles to authors
</commit_message>
<xml_diff>
--- a/Novwrite.docx
+++ b/Novwrite.docx
@@ -58,9 +58,9 @@
           <w:color w:val="374151"/>
           <w:sz w:val="22"/>
         </w:rPr>
-        <w:t>An Authoritative Canonical State Tracking, Multi-User Collaborative RBAC, and</w:t>
+        <w:t>An Authoritative Canonical State Tracking, Collaborative Author Roles, and</w:t>
         <w:br/>
-        <w:t>Continuity Verification Framework for Long-Form Narrative Engineering</w:t>
+        <w:t>Platform Administration Framework for Long-Form Narrative Engineering</w:t>
         <w:br/>
         <w:br/>
         <w:t>Department of Computer Science &amp; Engineering</w:t>
@@ -194,7 +194,7 @@
               <w:rPr>
                 <w:color w:val="111827"/>
               </w:rPr>
-              <w:t>Technical Architecture &amp; System Baseline Locked (v1.5 - Multi-User RBAC &amp; Admin Overrides)</w:t>
+              <w:t>Technical Architecture &amp; System Baseline Locked (v1.6 - Platform Admin &amp; Author Roles)</w:t>
             </w:r>
           </w:p>
         </w:tc>
@@ -264,7 +264,7 @@
     </w:p>
     <w:p>
       <w:r>
-        <w:t>NovWrite addresses these foundational limitations by establishing a continuity-first multi-user novel creation architecture grounded in the principle: Canon Over AI Memory. Rather than treating a novel as flat, unstructured text documents, NovWrite formalizes the fictional universe as a deterministic state machine powered by event-sourcing state reconstruction, dynamic schema definitions, multi-tenant Role-Based Access Control (RBAC), and explainable continuity verification algorithms.</w:t>
+        <w:t>NovWrite addresses these foundational limitations by establishing a continuity-first multi-user novel creation architecture grounded in the principle: Canon Over AI Memory. Rather than treating a novel as flat, unstructured text documents, NovWrite formalizes the fictional universe as a deterministic state machine powered by event-sourcing state reconstruction, dynamic schema definitions, in-app Author Roles (Lead Author, Co-Author, Editor, Contributor, Viewer), Platform Administration capabilities (MFA resets, payment/refund processing, data repair assistance), and explainable continuity verification algorithms.</w:t>
       </w:r>
     </w:p>
     <w:tbl>
@@ -314,7 +314,7 @@
                 <w:color w:val="1F2937"/>
                 <w:sz w:val="20"/>
               </w:rPr>
-              <w:t>Core Architectural Thesis: Fictional world state is stored deterministically in an authoritative relational + dynamic JSONB database (PostgreSQL 18 with pgvector), not implicitly inside probabilistic AI context windows. AI models operate as stateless transformation engines that receive authoritative world state as prompt context. Multi-user concurrency is governed through heartbeat scene leases and audited administrative override boundaries.</w:t>
+              <w:t>Core Architectural Thesis: Fictional world state is stored deterministically in an authoritative relational + dynamic JSONB database (PostgreSQL 18 with pgvector), not implicitly inside probabilistic AI context windows. In-app collaboration is managed via Author Roles (Lead Author, Co-Author) with heartbeat scene leases, while Platform Administrators handle user account support, MFA resets, and billing.</w:t>
             </w:r>
           </w:p>
         </w:tc>
@@ -351,7 +351,7 @@
     </w:p>
     <w:p>
       <w:r>
-        <w:t>Long-form creative writing in complex fictional genres (fantasy, science fiction, xianxia cultivation, alternate history, mystery) frequently involves collaborative teams: lead authors, co-writers, world builders, lorekeepers, and beta reviewers. Managing thousands of interconnected entities, hierarchical progression tiers, multi-faction affiliations, and causal timelines across multiple concurrent contributors requires strict concurrency control and deterministic canon tracking.</w:t>
+        <w:t>Long-form creative writing in complex fictional genres (fantasy, science fiction, xianxia cultivation, alternate history, mystery) frequently involves collaborative teams: lead authors, co-authors, world builders, lorekeepers, and beta reviewers. Managing thousands of interconnected entities, hierarchical progression tiers, multi-faction affiliations, and causal timelines across multiple concurrent contributors requires strict concurrency control, deterministic canon tracking, and clear administrative support boundaries.</w:t>
       </w:r>
     </w:p>
     <w:p>
@@ -476,7 +476,7 @@
                 <w:color w:val="FFFFFF"/>
                 <w:sz w:val="19"/>
               </w:rPr>
-              <w:t>Multi-User RBAC &amp; Leases</w:t>
+              <w:t>Author Roles &amp; Leases</w:t>
             </w:r>
           </w:p>
         </w:tc>
@@ -502,7 +502,7 @@
                 <w:color w:val="FFFFFF"/>
                 <w:sz w:val="19"/>
               </w:rPr>
-              <w:t>Explainability</w:t>
+              <w:t>Platform Support Operations</w:t>
             </w:r>
           </w:p>
         </w:tc>
@@ -629,7 +629,7 @@
                 <w:color w:val="1F2937"/>
                 <w:sz w:val="18"/>
               </w:rPr>
-              <w:t>Zero (No citations)</w:t>
+              <w:t>Basic support tickets</w:t>
             </w:r>
           </w:p>
         </w:tc>
@@ -756,7 +756,7 @@
                 <w:color w:val="1F2937"/>
                 <w:sz w:val="18"/>
               </w:rPr>
-              <w:t>Manual human review</w:t>
+              <w:t>Self-hosted / No admin support</w:t>
             </w:r>
           </w:p>
         </w:tc>
@@ -883,7 +883,7 @@
                 <w:color w:val="1F2937"/>
                 <w:sz w:val="18"/>
               </w:rPr>
-              <w:t>None</w:t>
+              <w:t>Workspace Admin</w:t>
             </w:r>
           </w:p>
         </w:tc>
@@ -985,7 +985,7 @@
                 <w:color w:val="1F2937"/>
                 <w:sz w:val="18"/>
               </w:rPr>
-              <w:t>Multi-Tenant RBAC + Heartbeat Scene Leases + Admin Overrides</w:t>
+              <w:t>Lead Author / Co-Author + Heartbeat Leases</w:t>
             </w:r>
           </w:p>
         </w:tc>
@@ -1010,7 +1010,7 @@
                 <w:color w:val="1F2937"/>
                 <w:sz w:val="18"/>
               </w:rPr>
-              <w:t>Actionable Causal Event Tracebacks</w:t>
+              <w:t>Platform Admin Console: MFA Reset, Refunds, Data Recovery</w:t>
             </w:r>
           </w:p>
         </w:tc>
@@ -1049,27 +1049,37 @@
         <w:rPr>
           <w:b/>
         </w:rPr>
-        <w:t xml:space="preserve">3. Multi-User Collaboration &amp; RBAC: </w:t>
+        <w:t xml:space="preserve">3. Collaborative Author Roles &amp; Concurrency: </w:t>
       </w:r>
       <w:r>
-        <w:t>Provide secure multi-tenant roles (OWNER, ADMIN, EDITOR, CONTRIBUTOR, VIEWER) and active heartbeat scene leases to prevent concurrent overwrites.</w:t>
+        <w:t>Provide structured in-app roles (Lead Author, Co-Author, Editor, Contributor, Viewer) and active heartbeat scene leases to prevent concurrent overwrites.</w:t>
         <w:br/>
       </w:r>
       <w:r>
         <w:rPr>
           <w:b/>
         </w:rPr>
-        <w:t xml:space="preserve">4. Explainable Continuity Verification &amp; Admin Overrides: </w:t>
+        <w:t xml:space="preserve">4. Platform Administration &amp; User Support: </w:t>
       </w:r>
       <w:r>
-        <w:t>Automatically detect lore contradictions in newly drafted prose, cite historical events responsible, and allow authorized admins to force-approve intentional exceptions with mandatory audit logging.</w:t>
+        <w:t>Empower platform administrators with tools for MFA reset, user management, Stripe payment refunds, and corrupted universe snapshot repairs.</w:t>
         <w:br/>
       </w:r>
       <w:r>
         <w:rPr>
           <w:b/>
         </w:rPr>
-        <w:t xml:space="preserve">5. Decoupled Dedicated Workspaces: </w:t>
+        <w:t xml:space="preserve">5. Explainable Continuity Verification &amp; Canon Overrides: </w:t>
+      </w:r>
+      <w:r>
+        <w:t>Automatically detect lore contradictions, cite historical events responsible, and allow authorized Lead Authors/Co-Authors to force-approve intentional exceptions with mandatory audit logging.</w:t>
+        <w:br/>
+      </w:r>
+      <w:r>
+        <w:rPr>
+          <w:b/>
+        </w:rPr>
+        <w:t xml:space="preserve">6. Decoupled Dedicated Workspaces: </w:t>
       </w:r>
       <w:r>
         <w:t>Provide dedicated full-viewport workbenches for Novel Writing vs World Building, eliminating nested tab-in-modal anti-patterns.</w:t>
@@ -1079,7 +1089,7 @@
         <w:rPr>
           <w:b/>
         </w:rPr>
-        <w:t xml:space="preserve">6. Tri-Platform Co-Development: </w:t>
+        <w:t xml:space="preserve">7. Tri-Platform Co-Development: </w:t>
       </w:r>
       <w:r>
         <w:t>Engineer Web (SvelteKit), Desktop (Tauri 2), and Mobile (React Native + Expo) simultaneously with complete component and design system parity.</w:t>
@@ -1155,9 +1165,9 @@
               <w:br/>
               <w:t>|                             GO API BACKEND LAYER (Go 1.23+)                       |</w:t>
               <w:br/>
-              <w:t>|  Chi Router | Multi-Tenant RBAC Middleware | Scene Lease Manager | State Fold Engine |</w:t>
+              <w:t>|  Chi Router | Author RBAC Middleware | Scene Lease Manager | State Fold Engine    |</w:t>
               <w:br/>
-              <w:t>|  Continuity &amp; Invariant Rules Engine | Admin Override Service | AI Context Gateway |</w:t>
+              <w:t>|  Continuity &amp; Invariant Rules Engine | Platform Admin Service | AI Gateway         |</w:t>
               <w:br/>
               <w:t>+------------------------------------------+----------------------------------------+</w:t>
               <w:br/>
@@ -1205,6 +1215,8 @@
         <w:br/>
         <w:t xml:space="preserve">   - Encapsulates authentication, project workspace tenancy, prose drafting, scene leases, timeline folding, and rule validation.</w:t>
         <w:br/>
+        <w:t xml:space="preserve">   - Hosts the Platform Admin Service for MFA resets, payment refunds, and project repair scripts.</w:t>
+        <w:br/>
         <w:t xml:space="preserve">   - Enforces the Block-Based Code Standard with unique block IDs (BLOCK_&lt;DOMAIN&gt;_&lt;ACTION&gt;_&lt;ID&gt;) and RFC 7807 problem details.</w:t>
         <w:br/>
         <w:br/>
@@ -1250,12 +1262,12 @@
         <w:pStyle w:val="Heading2"/>
       </w:pPr>
       <w:r>
-        <w:t>3.1 Multi-User Tenancy, Prose Hierarchy &amp; Scene Leases</w:t>
+        <w:t>3.1 Users, Platform Admin, Prose Hierarchy &amp; Scene Leases</w:t>
       </w:r>
     </w:p>
     <w:p>
       <w:r>
-        <w:t>Users and projects form the multi-tenant core. Project memberships govern RBAC permissions, scenes track author attribution and active lease locks, and admin overrides are persisted to immutable audit tables.</w:t>
+        <w:t>Users track platform administration status, MFA state, and Stripe billing. Project memberships govern in-app author roles, scenes track author attribution and active lease locks, and platform admin interventions are logged to immutable audit tables.</w:t>
       </w:r>
     </w:p>
     <w:tbl>
@@ -1296,7 +1308,7 @@
                 <w:color w:val="0F172A"/>
                 <w:sz w:val="17"/>
               </w:rPr>
-              <w:t>-- Multi-User Tenancy &amp; Prose Hierarchy (PostgreSQL 18)</w:t>
+              <w:t>-- Users &amp; Platform Administration (PostgreSQL 18)</w:t>
               <w:br/>
               <w:t>CREATE TABLE users (</w:t>
               <w:br/>
@@ -1308,26 +1320,17 @@
               <w:br/>
               <w:t xml:space="preserve">    display_name VARCHAR(100) NOT NULL,</w:t>
               <w:br/>
+              <w:t xml:space="preserve">    is_platform_admin BOOLEAN NOT NULL DEFAULT FALSE,</w:t>
+              <w:br/>
+              <w:t xml:space="preserve">    mfa_enabled BOOLEAN NOT NULL DEFAULT FALSE,</w:t>
+              <w:br/>
+              <w:t xml:space="preserve">    mfa_secret VARCHAR(255),</w:t>
+              <w:br/>
+              <w:t xml:space="preserve">    stripe_customer_id VARCHAR(100),</w:t>
+              <w:br/>
+              <w:t xml:space="preserve">    account_status VARCHAR(50) NOT NULL DEFAULT 'active',</w:t>
+              <w:br/>
               <w:t xml:space="preserve">    created_at TIMESTAMPTZ NOT NULL DEFAULT NOW()</w:t>
-              <w:br/>
-              <w:t>);</w:t>
-              <w:br/>
-              <w:br/>
-              <w:t>CREATE TABLE projects (</w:t>
-              <w:br/>
-              <w:t xml:space="preserve">    id UUID PRIMARY KEY DEFAULT gen_random_uuid(),</w:t>
-              <w:br/>
-              <w:t xml:space="preserve">    owner_id UUID NOT NULL REFERENCES users(id) ON DELETE CASCADE,</w:t>
-              <w:br/>
-              <w:t xml:space="preserve">    name VARCHAR(255) NOT NULL,</w:t>
-              <w:br/>
-              <w:t xml:space="preserve">    slug VARCHAR(255) NOT NULL,</w:t>
-              <w:br/>
-              <w:t xml:space="preserve">    settings JSONB NOT NULL DEFAULT '{}'::jsonb,</w:t>
-              <w:br/>
-              <w:t xml:space="preserve">    created_at TIMESTAMPTZ NOT NULL DEFAULT NOW(),</w:t>
-              <w:br/>
-              <w:t xml:space="preserve">    CONSTRAINT uq_project_owner_slug UNIQUE (owner_id, slug)</w:t>
               <w:br/>
               <w:t>);</w:t>
               <w:br/>
@@ -1340,7 +1343,7 @@
               <w:br/>
               <w:t xml:space="preserve">    user_id UUID NOT NULL REFERENCES users(id) ON DELETE CASCADE,</w:t>
               <w:br/>
-              <w:t xml:space="preserve">    role VARCHAR(50) NOT NULL, -- OWNER, ADMIN, EDITOR, CONTRIBUTOR, VIEWER</w:t>
+              <w:t xml:space="preserve">    role VARCHAR(50) NOT NULL, -- LEAD_AUTHOR, CO_AUTHOR, EDITOR, CONTRIBUTOR, VIEWER</w:t>
               <w:br/>
               <w:t xml:space="preserve">    permissions JSONB NOT NULL DEFAULT '{}'::jsonb,</w:t>
               <w:br/>
@@ -1349,31 +1352,6 @@
               <w:t xml:space="preserve">    created_at TIMESTAMPTZ NOT NULL DEFAULT NOW(),</w:t>
               <w:br/>
               <w:t xml:space="preserve">    CONSTRAINT uq_project_member UNIQUE (project_id, user_id)</w:t>
-              <w:br/>
-              <w:t>);</w:t>
-              <w:br/>
-              <w:br/>
-              <w:t>CREATE TABLE scenes (</w:t>
-              <w:br/>
-              <w:t xml:space="preserve">    id UUID PRIMARY KEY DEFAULT gen_random_uuid(),</w:t>
-              <w:br/>
-              <w:t xml:space="preserve">    chapter_id UUID NOT NULL REFERENCES chapters(id) ON DELETE CASCADE,</w:t>
-              <w:br/>
-              <w:t xml:space="preserve">    project_id UUID NOT NULL REFERENCES projects(id) ON DELETE CASCADE,</w:t>
-              <w:br/>
-              <w:t xml:space="preserve">    title VARCHAR(255) NOT NULL,</w:t>
-              <w:br/>
-              <w:t xml:space="preserve">    content_markdown TEXT NOT NULL DEFAULT '',</w:t>
-              <w:br/>
-              <w:t xml:space="preserve">    word_count INT NOT NULL DEFAULT 0,</w:t>
-              <w:br/>
-              <w:t xml:space="preserve">    status VARCHAR(50) NOT NULL DEFAULT 'draft',</w:t>
-              <w:br/>
-              <w:t xml:space="preserve">    last_edited_by UUID REFERENCES users(id) ON DELETE SET NULL,</w:t>
-              <w:br/>
-              <w:t xml:space="preserve">    created_at TIMESTAMPTZ NOT NULL DEFAULT NOW(),</w:t>
-              <w:br/>
-              <w:t xml:space="preserve">    CONSTRAINT uq_scene_order UNIQUE (chapter_id, order_index)</w:t>
               <w:br/>
               <w:t>);</w:t>
               <w:br/>
@@ -1395,25 +1373,21 @@
               <w:t>);</w:t>
               <w:br/>
               <w:br/>
-              <w:t>CREATE TABLE admin_override_logs (</w:t>
+              <w:t>CREATE TABLE platform_admin_audit_logs (</w:t>
               <w:br/>
               <w:t xml:space="preserve">    id UUID PRIMARY KEY DEFAULT gen_random_uuid(),</w:t>
               <w:br/>
-              <w:t xml:space="preserve">    project_id UUID NOT NULL REFERENCES projects(id) ON DELETE CASCADE,</w:t>
-              <w:br/>
               <w:t xml:space="preserve">    admin_user_id UUID NOT NULL REFERENCES users(id) ON DELETE RESTRICT,</w:t>
               <w:br/>
-              <w:t xml:space="preserve">    target_type VARCHAR(50) NOT NULL, -- CONTINUITY_VIOLATION, TIMELINE_BRANCH, SCENE_LOCK, SCHEMA_MUTATION</w:t>
+              <w:t xml:space="preserve">    target_user_id UUID REFERENCES users(id) ON DELETE SET NULL,</w:t>
               <w:br/>
-              <w:t xml:space="preserve">    target_id UUID NOT NULL,</w:t>
-              <w:br/>
-              <w:t xml:space="preserve">    action VARCHAR(50) NOT NULL, -- FORCE_APPROVE_VIOLATION, BREAK_SCENE_LOCK, MERGE_BRANCH_OVERRIDE, SCHEMA_FORCE_MIGRATE</w:t>
+              <w:t xml:space="preserve">    action_type VARCHAR(50) NOT NULL, -- MFA_RESET, ACCOUNT_UNLOCKED, REFUND_ISSUED, SUPPORT_DATA_REPAIR</w:t>
               <w:br/>
               <w:t xml:space="preserve">    justification TEXT NOT NULL,</w:t>
               <w:br/>
-              <w:t xml:space="preserve">    previous_state JSONB NOT NULL,</w:t>
+              <w:t xml:space="preserve">    metadata JSONB NOT NULL DEFAULT '{}'::jsonb,</w:t>
               <w:br/>
-              <w:t xml:space="preserve">    new_state JSONB NOT NULL,</w:t>
+              <w:t xml:space="preserve">    ip_address VARCHAR(45),</w:t>
               <w:br/>
               <w:t xml:space="preserve">    created_at TIMESTAMPTZ NOT NULL DEFAULT NOW()</w:t>
               <w:br/>
@@ -1653,12 +1627,7 @@
         <w:rPr>
           <w:color w:val="7C3AED"/>
         </w:rPr>
-        <w:t>4. Backend Subsystems &amp; Continuity Engine</w:t>
-      </w:r>
-    </w:p>
-    <w:p>
-      <w:r>
-        <w:t>The core Go backend hosts the business logic engines, maintaining pure separation between persistence and domain validation.</w:t>
+        <w:t>4. Backend Subsystems, Author Roles &amp; Platform Administration</w:t>
       </w:r>
     </w:p>
     <w:p>
@@ -1666,66 +1635,12 @@
         <w:pStyle w:val="Heading2"/>
       </w:pPr>
       <w:r>
-        <w:t>4.1 State Fold Engine Mechanics</w:t>
+        <w:t>4.1 In-App Author Roles &amp; Creative Hierarchy</w:t>
       </w:r>
     </w:p>
     <w:p>
       <w:r>
-        <w:t>The State Fold Engine computes the point-in-time universe state for sequence N through a deterministic 4-step algorithm:</w:t>
-      </w:r>
-    </w:p>
-    <w:p>
-      <w:r>
-        <w:rPr>
-          <w:b/>
-        </w:rPr>
-        <w:t xml:space="preserve">Step 1 (Snapshot Retrieval): </w:t>
-      </w:r>
-      <w:r>
-        <w:t>Query Redis Cache (or PostgreSQL `state_snapshots`) for the nearest snapshot where `sequence_number &lt;= N`.</w:t>
-        <w:br/>
-      </w:r>
-      <w:r>
-        <w:rPr>
-          <w:b/>
-        </w:rPr>
-        <w:t xml:space="preserve">Step 2 (Delta Fetching): </w:t>
-      </w:r>
-      <w:r>
-        <w:t>Fetch all `event_effects` between `snapshot.sequence_number` and `N` ordered by `events.narrative_sequence ASC`.</w:t>
-        <w:br/>
-      </w:r>
-      <w:r>
-        <w:rPr>
-          <w:b/>
-        </w:rPr>
-        <w:t xml:space="preserve">Step 3 (Fold Application): </w:t>
-      </w:r>
-      <w:r>
-        <w:t>Apply each effect's mutation operation (SET, INCREMENT, APPEND, REMOVE, TRANSFER) to the in-memory entity map.</w:t>
-        <w:br/>
-      </w:r>
-      <w:r>
-        <w:rPr>
-          <w:b/>
-        </w:rPr>
-        <w:t xml:space="preserve">Step 4 (Validation / Snapshotting): </w:t>
-      </w:r>
-      <w:r>
-        <w:t>Emit the authoritative folded state and optionally save a new checkpoint snapshot for rapid future O(1) access.</w:t>
-      </w:r>
-    </w:p>
-    <w:p>
-      <w:pPr>
-        <w:pStyle w:val="Heading2"/>
-      </w:pPr>
-      <w:r>
-        <w:t>4.2 Continuity Invariant Rules &amp; Explainable Violations</w:t>
-      </w:r>
-    </w:p>
-    <w:p>
-      <w:r>
-        <w:t>When an author writes or updates a scene, the Continuity Engine executes four classes of invariant rules:</w:t>
+        <w:t>Within project workspaces, creative permissions are organized under Author Roles:</w:t>
       </w:r>
     </w:p>
     <w:tbl>
@@ -1735,14 +1650,17 @@
         <w:tblLook w:firstColumn="1" w:firstRow="1" w:lastColumn="0" w:lastRow="0" w:noHBand="0" w:noVBand="1" w:val="04A0"/>
       </w:tblPr>
       <w:tblGrid>
-        <w:gridCol w:w="3120"/>
-        <w:gridCol w:w="3120"/>
-        <w:gridCol w:w="3120"/>
+        <w:gridCol w:w="1560"/>
+        <w:gridCol w:w="1560"/>
+        <w:gridCol w:w="1560"/>
+        <w:gridCol w:w="1560"/>
+        <w:gridCol w:w="1560"/>
+        <w:gridCol w:w="1560"/>
       </w:tblGrid>
       <w:tr>
         <w:tc>
           <w:tcPr>
-            <w:tcW w:type="dxa" w:w="2592"/>
+            <w:tcW w:type="dxa" w:w="1872"/>
             <w:shd w:fill="7C3AED"/>
             <w:tcMar>
               <w:top w:w="100" w:type="dxa"/>
@@ -1762,13 +1680,13 @@
                 <w:color w:val="FFFFFF"/>
                 <w:sz w:val="19"/>
               </w:rPr>
-              <w:t>Rule Class</w:t>
+              <w:t>Role</w:t>
             </w:r>
           </w:p>
         </w:tc>
         <w:tc>
           <w:tcPr>
-            <w:tcW w:type="dxa" w:w="3168"/>
+            <w:tcW w:type="dxa" w:w="2160"/>
             <w:shd w:fill="7C3AED"/>
             <w:tcMar>
               <w:top w:w="100" w:type="dxa"/>
@@ -1788,13 +1706,13 @@
                 <w:color w:val="FFFFFF"/>
                 <w:sz w:val="19"/>
               </w:rPr>
-              <w:t>Validation Mechanism</w:t>
+              <w:t>Creative Title</w:t>
             </w:r>
           </w:p>
         </w:tc>
         <w:tc>
           <w:tcPr>
-            <w:tcW w:type="dxa" w:w="3600"/>
+            <w:tcW w:type="dxa" w:w="1584"/>
             <w:shd w:fill="7C3AED"/>
             <w:tcMar>
               <w:top w:w="100" w:type="dxa"/>
@@ -1814,7 +1732,85 @@
                 <w:color w:val="FFFFFF"/>
                 <w:sz w:val="19"/>
               </w:rPr>
-              <w:t>Example Failure Triggered</w:t>
+              <w:t>Prose Drafting</w:t>
+            </w:r>
+          </w:p>
+        </w:tc>
+        <w:tc>
+          <w:tcPr>
+            <w:tcW w:type="dxa" w:w="1728"/>
+            <w:shd w:fill="7C3AED"/>
+            <w:tcMar>
+              <w:top w:w="100" w:type="dxa"/>
+              <w:bottom w:w="100" w:type="dxa"/>
+              <w:left w:w="120" w:type="dxa"/>
+              <w:right w:w="120" w:type="dxa"/>
+            </w:tcMar>
+          </w:tcPr>
+          <w:p>
+            <w:pPr>
+              <w:jc w:val="left"/>
+            </w:pPr>
+            <w:r>
+              <w:rPr>
+                <w:rFonts w:ascii="Calibri" w:hAnsi="Calibri"/>
+                <w:b/>
+                <w:color w:val="FFFFFF"/>
+                <w:sz w:val="19"/>
+              </w:rPr>
+              <w:t>World &amp; Entity CRUD</w:t>
+            </w:r>
+          </w:p>
+        </w:tc>
+        <w:tc>
+          <w:tcPr>
+            <w:tcW w:type="dxa" w:w="1584"/>
+            <w:shd w:fill="7C3AED"/>
+            <w:tcMar>
+              <w:top w:w="100" w:type="dxa"/>
+              <w:bottom w:w="100" w:type="dxa"/>
+              <w:left w:w="120" w:type="dxa"/>
+              <w:right w:w="120" w:type="dxa"/>
+            </w:tcMar>
+          </w:tcPr>
+          <w:p>
+            <w:pPr>
+              <w:jc w:val="left"/>
+            </w:pPr>
+            <w:r>
+              <w:rPr>
+                <w:rFonts w:ascii="Calibri" w:hAnsi="Calibri"/>
+                <w:b/>
+                <w:color w:val="FFFFFF"/>
+                <w:sz w:val="19"/>
+              </w:rPr>
+              <w:t>Timeline Mutations</w:t>
+            </w:r>
+          </w:p>
+        </w:tc>
+        <w:tc>
+          <w:tcPr>
+            <w:tcW w:type="dxa" w:w="1872"/>
+            <w:shd w:fill="7C3AED"/>
+            <w:tcMar>
+              <w:top w:w="100" w:type="dxa"/>
+              <w:bottom w:w="100" w:type="dxa"/>
+              <w:left w:w="120" w:type="dxa"/>
+              <w:right w:w="120" w:type="dxa"/>
+            </w:tcMar>
+          </w:tcPr>
+          <w:p>
+            <w:pPr>
+              <w:jc w:val="left"/>
+            </w:pPr>
+            <w:r>
+              <w:rPr>
+                <w:rFonts w:ascii="Calibri" w:hAnsi="Calibri"/>
+                <w:b/>
+                <w:color w:val="FFFFFF"/>
+                <w:sz w:val="19"/>
+              </w:rPr>
+              <w:t>Canon Overrides</w:t>
             </w:r>
           </w:p>
         </w:tc>
@@ -1822,7 +1818,7 @@
       <w:tr>
         <w:tc>
           <w:tcPr>
-            <w:tcW w:type="dxa" w:w="2592"/>
+            <w:tcW w:type="dxa" w:w="1872"/>
             <w:shd w:fill="FFFFFF"/>
             <w:tcMar>
               <w:top w:w="80" w:type="dxa"/>
@@ -1841,13 +1837,13 @@
                 <w:color w:val="1F2937"/>
                 <w:sz w:val="18"/>
               </w:rPr>
-              <w:t>Status Invariant</w:t>
+              <w:t>LEAD_AUTHOR</w:t>
             </w:r>
           </w:p>
         </w:tc>
         <w:tc>
           <w:tcPr>
-            <w:tcW w:type="dxa" w:w="3168"/>
+            <w:tcW w:type="dxa" w:w="2160"/>
             <w:shd w:fill="FFFFFF"/>
             <w:tcMar>
               <w:top w:w="80" w:type="dxa"/>
@@ -1866,13 +1862,13 @@
                 <w:color w:val="1F2937"/>
                 <w:sz w:val="18"/>
               </w:rPr>
-              <w:t>Verifies entity lifecycle status</w:t>
+              <w:t>Primary Author / Creator</w:t>
             </w:r>
           </w:p>
         </w:tc>
         <w:tc>
           <w:tcPr>
-            <w:tcW w:type="dxa" w:w="3600"/>
+            <w:tcW w:type="dxa" w:w="1584"/>
             <w:shd w:fill="FFFFFF"/>
             <w:tcMar>
               <w:top w:w="80" w:type="dxa"/>
@@ -1891,7 +1887,82 @@
                 <w:color w:val="1F2937"/>
                 <w:sz w:val="18"/>
               </w:rPr>
-              <w:t>Deceased character actively speaking or fighting in a scene</w:t>
+              <w:t>Full Read/Write</w:t>
+            </w:r>
+          </w:p>
+        </w:tc>
+        <w:tc>
+          <w:tcPr>
+            <w:tcW w:type="dxa" w:w="1728"/>
+            <w:shd w:fill="FFFFFF"/>
+            <w:tcMar>
+              <w:top w:w="80" w:type="dxa"/>
+              <w:bottom w:w="80" w:type="dxa"/>
+              <w:left w:w="120" w:type="dxa"/>
+              <w:right w:w="120" w:type="dxa"/>
+            </w:tcMar>
+          </w:tcPr>
+          <w:p>
+            <w:pPr>
+              <w:jc w:val="left"/>
+            </w:pPr>
+            <w:r>
+              <w:rPr>
+                <w:rFonts w:ascii="Calibri" w:hAnsi="Calibri"/>
+                <w:color w:val="1F2937"/>
+                <w:sz w:val="18"/>
+              </w:rPr>
+              <w:t>Full Read/Write</w:t>
+            </w:r>
+          </w:p>
+        </w:tc>
+        <w:tc>
+          <w:tcPr>
+            <w:tcW w:type="dxa" w:w="1584"/>
+            <w:shd w:fill="FFFFFF"/>
+            <w:tcMar>
+              <w:top w:w="80" w:type="dxa"/>
+              <w:bottom w:w="80" w:type="dxa"/>
+              <w:left w:w="120" w:type="dxa"/>
+              <w:right w:w="120" w:type="dxa"/>
+            </w:tcMar>
+          </w:tcPr>
+          <w:p>
+            <w:pPr>
+              <w:jc w:val="left"/>
+            </w:pPr>
+            <w:r>
+              <w:rPr>
+                <w:rFonts w:ascii="Calibri" w:hAnsi="Calibri"/>
+                <w:color w:val="1F2937"/>
+                <w:sz w:val="18"/>
+              </w:rPr>
+              <w:t>Full Read/Write</w:t>
+            </w:r>
+          </w:p>
+        </w:tc>
+        <w:tc>
+          <w:tcPr>
+            <w:tcW w:type="dxa" w:w="1872"/>
+            <w:shd w:fill="FFFFFF"/>
+            <w:tcMar>
+              <w:top w:w="80" w:type="dxa"/>
+              <w:bottom w:w="80" w:type="dxa"/>
+              <w:left w:w="120" w:type="dxa"/>
+              <w:right w:w="120" w:type="dxa"/>
+            </w:tcMar>
+          </w:tcPr>
+          <w:p>
+            <w:pPr>
+              <w:jc w:val="left"/>
+            </w:pPr>
+            <w:r>
+              <w:rPr>
+                <w:rFonts w:ascii="Calibri" w:hAnsi="Calibri"/>
+                <w:color w:val="1F2937"/>
+                <w:sz w:val="18"/>
+              </w:rPr>
+              <w:t>Full Authority + Invites &amp; Deletion</w:t>
             </w:r>
           </w:p>
         </w:tc>
@@ -1899,7 +1970,7 @@
       <w:tr>
         <w:tc>
           <w:tcPr>
-            <w:tcW w:type="dxa" w:w="2592"/>
+            <w:tcW w:type="dxa" w:w="1872"/>
             <w:shd w:fill="F9FAFB"/>
             <w:tcMar>
               <w:top w:w="80" w:type="dxa"/>
@@ -1918,13 +1989,13 @@
                 <w:color w:val="1F2937"/>
                 <w:sz w:val="18"/>
               </w:rPr>
-              <w:t>Exclusive Possession</w:t>
+              <w:t>CO_AUTHOR</w:t>
             </w:r>
           </w:p>
         </w:tc>
         <w:tc>
           <w:tcPr>
-            <w:tcW w:type="dxa" w:w="3168"/>
+            <w:tcW w:type="dxa" w:w="2160"/>
             <w:shd w:fill="F9FAFB"/>
             <w:tcMar>
               <w:top w:w="80" w:type="dxa"/>
@@ -1943,13 +2014,13 @@
                 <w:color w:val="1F2937"/>
                 <w:sz w:val="18"/>
               </w:rPr>
-              <w:t>Asserts uniqueness of unique items/relics</w:t>
+              <w:t>Co-Author / Senior Lorekeeper</w:t>
             </w:r>
           </w:p>
         </w:tc>
         <w:tc>
           <w:tcPr>
-            <w:tcW w:type="dxa" w:w="3600"/>
+            <w:tcW w:type="dxa" w:w="1584"/>
             <w:shd w:fill="F9FAFB"/>
             <w:tcMar>
               <w:top w:w="80" w:type="dxa"/>
@@ -1968,7 +2039,82 @@
                 <w:color w:val="1F2937"/>
                 <w:sz w:val="18"/>
               </w:rPr>
-              <w:t>Two characters wielding the unique 'Azure Dragon Sword' simultaneously</w:t>
+              <w:t>Full Read/Write</w:t>
+            </w:r>
+          </w:p>
+        </w:tc>
+        <w:tc>
+          <w:tcPr>
+            <w:tcW w:type="dxa" w:w="1728"/>
+            <w:shd w:fill="F9FAFB"/>
+            <w:tcMar>
+              <w:top w:w="80" w:type="dxa"/>
+              <w:bottom w:w="80" w:type="dxa"/>
+              <w:left w:w="120" w:type="dxa"/>
+              <w:right w:w="120" w:type="dxa"/>
+            </w:tcMar>
+          </w:tcPr>
+          <w:p>
+            <w:pPr>
+              <w:jc w:val="left"/>
+            </w:pPr>
+            <w:r>
+              <w:rPr>
+                <w:rFonts w:ascii="Calibri" w:hAnsi="Calibri"/>
+                <w:color w:val="1F2937"/>
+                <w:sz w:val="18"/>
+              </w:rPr>
+              <w:t>Full Read/Write</w:t>
+            </w:r>
+          </w:p>
+        </w:tc>
+        <w:tc>
+          <w:tcPr>
+            <w:tcW w:type="dxa" w:w="1584"/>
+            <w:shd w:fill="F9FAFB"/>
+            <w:tcMar>
+              <w:top w:w="80" w:type="dxa"/>
+              <w:bottom w:w="80" w:type="dxa"/>
+              <w:left w:w="120" w:type="dxa"/>
+              <w:right w:w="120" w:type="dxa"/>
+            </w:tcMar>
+          </w:tcPr>
+          <w:p>
+            <w:pPr>
+              <w:jc w:val="left"/>
+            </w:pPr>
+            <w:r>
+              <w:rPr>
+                <w:rFonts w:ascii="Calibri" w:hAnsi="Calibri"/>
+                <w:color w:val="1F2937"/>
+                <w:sz w:val="18"/>
+              </w:rPr>
+              <w:t>Full Read/Write</w:t>
+            </w:r>
+          </w:p>
+        </w:tc>
+        <w:tc>
+          <w:tcPr>
+            <w:tcW w:type="dxa" w:w="1872"/>
+            <w:shd w:fill="F9FAFB"/>
+            <w:tcMar>
+              <w:top w:w="80" w:type="dxa"/>
+              <w:bottom w:w="80" w:type="dxa"/>
+              <w:left w:w="120" w:type="dxa"/>
+              <w:right w:w="120" w:type="dxa"/>
+            </w:tcMar>
+          </w:tcPr>
+          <w:p>
+            <w:pPr>
+              <w:jc w:val="left"/>
+            </w:pPr>
+            <w:r>
+              <w:rPr>
+                <w:rFonts w:ascii="Calibri" w:hAnsi="Calibri"/>
+                <w:color w:val="1F2937"/>
+                <w:sz w:val="18"/>
+              </w:rPr>
+              <w:t>Canon Overrides &amp; Lock Breaking</w:t>
             </w:r>
           </w:p>
         </w:tc>
@@ -1976,7 +2122,7 @@
       <w:tr>
         <w:tc>
           <w:tcPr>
-            <w:tcW w:type="dxa" w:w="2592"/>
+            <w:tcW w:type="dxa" w:w="1872"/>
             <w:shd w:fill="FFFFFF"/>
             <w:tcMar>
               <w:top w:w="80" w:type="dxa"/>
@@ -1995,13 +2141,13 @@
                 <w:color w:val="1F2937"/>
                 <w:sz w:val="18"/>
               </w:rPr>
-              <w:t>Power Tier Ladder</w:t>
+              <w:t>EDITOR</w:t>
             </w:r>
           </w:p>
         </w:tc>
         <w:tc>
           <w:tcPr>
-            <w:tcW w:type="dxa" w:w="3168"/>
+            <w:tcW w:type="dxa" w:w="2160"/>
             <w:shd w:fill="FFFFFF"/>
             <w:tcMar>
               <w:top w:w="80" w:type="dxa"/>
@@ -2020,13 +2166,13 @@
                 <w:color w:val="1F2937"/>
                 <w:sz w:val="18"/>
               </w:rPr>
-              <w:t>Validates capability against progression stage</w:t>
+              <w:t>Chapter / Line Editor</w:t>
             </w:r>
           </w:p>
         </w:tc>
         <w:tc>
           <w:tcPr>
-            <w:tcW w:type="dxa" w:w="3600"/>
+            <w:tcW w:type="dxa" w:w="1584"/>
             <w:shd w:fill="FFFFFF"/>
             <w:tcMar>
               <w:top w:w="80" w:type="dxa"/>
@@ -2045,7 +2191,82 @@
                 <w:color w:val="1F2937"/>
                 <w:sz w:val="18"/>
               </w:rPr>
-              <w:t>Character in 'Qi Condensation' deploying 'Nascent Soul Domain' technique</w:t>
+              <w:t>Full Read/Write</w:t>
+            </w:r>
+          </w:p>
+        </w:tc>
+        <w:tc>
+          <w:tcPr>
+            <w:tcW w:type="dxa" w:w="1728"/>
+            <w:shd w:fill="FFFFFF"/>
+            <w:tcMar>
+              <w:top w:w="80" w:type="dxa"/>
+              <w:bottom w:w="80" w:type="dxa"/>
+              <w:left w:w="120" w:type="dxa"/>
+              <w:right w:w="120" w:type="dxa"/>
+            </w:tcMar>
+          </w:tcPr>
+          <w:p>
+            <w:pPr>
+              <w:jc w:val="left"/>
+            </w:pPr>
+            <w:r>
+              <w:rPr>
+                <w:rFonts w:ascii="Calibri" w:hAnsi="Calibri"/>
+                <w:color w:val="1F2937"/>
+                <w:sz w:val="18"/>
+              </w:rPr>
+              <w:t>Create/Edit Entities</w:t>
+            </w:r>
+          </w:p>
+        </w:tc>
+        <w:tc>
+          <w:tcPr>
+            <w:tcW w:type="dxa" w:w="1584"/>
+            <w:shd w:fill="FFFFFF"/>
+            <w:tcMar>
+              <w:top w:w="80" w:type="dxa"/>
+              <w:bottom w:w="80" w:type="dxa"/>
+              <w:left w:w="120" w:type="dxa"/>
+              <w:right w:w="120" w:type="dxa"/>
+            </w:tcMar>
+          </w:tcPr>
+          <w:p>
+            <w:pPr>
+              <w:jc w:val="left"/>
+            </w:pPr>
+            <w:r>
+              <w:rPr>
+                <w:rFonts w:ascii="Calibri" w:hAnsi="Calibri"/>
+                <w:color w:val="1F2937"/>
+                <w:sz w:val="18"/>
+              </w:rPr>
+              <w:t>Log Scene Events</w:t>
+            </w:r>
+          </w:p>
+        </w:tc>
+        <w:tc>
+          <w:tcPr>
+            <w:tcW w:type="dxa" w:w="1872"/>
+            <w:shd w:fill="FFFFFF"/>
+            <w:tcMar>
+              <w:top w:w="80" w:type="dxa"/>
+              <w:bottom w:w="80" w:type="dxa"/>
+              <w:left w:w="120" w:type="dxa"/>
+              <w:right w:w="120" w:type="dxa"/>
+            </w:tcMar>
+          </w:tcPr>
+          <w:p>
+            <w:pPr>
+              <w:jc w:val="left"/>
+            </w:pPr>
+            <w:r>
+              <w:rPr>
+                <w:rFonts w:ascii="Calibri" w:hAnsi="Calibri"/>
+                <w:color w:val="1F2937"/>
+                <w:sz w:val="18"/>
+              </w:rPr>
+              <w:t>None</w:t>
             </w:r>
           </w:p>
         </w:tc>
@@ -2053,7 +2274,7 @@
       <w:tr>
         <w:tc>
           <w:tcPr>
-            <w:tcW w:type="dxa" w:w="2592"/>
+            <w:tcW w:type="dxa" w:w="1872"/>
             <w:shd w:fill="F9FAFB"/>
             <w:tcMar>
               <w:top w:w="80" w:type="dxa"/>
@@ -2072,13 +2293,13 @@
                 <w:color w:val="1F2937"/>
                 <w:sz w:val="18"/>
               </w:rPr>
-              <w:t>Custom Predicate</w:t>
+              <w:t>CONTRIBUTOR</w:t>
             </w:r>
           </w:p>
         </w:tc>
         <w:tc>
           <w:tcPr>
-            <w:tcW w:type="dxa" w:w="3168"/>
+            <w:tcW w:type="dxa" w:w="2160"/>
             <w:shd w:fill="F9FAFB"/>
             <w:tcMar>
               <w:top w:w="80" w:type="dxa"/>
@@ -2097,13 +2318,13 @@
                 <w:color w:val="1F2937"/>
                 <w:sz w:val="18"/>
               </w:rPr>
-              <w:t>User-defined JSON logic expressions</w:t>
+              <w:t>Lore Builder / Guest Writer</w:t>
             </w:r>
           </w:p>
         </w:tc>
         <w:tc>
           <w:tcPr>
-            <w:tcW w:type="dxa" w:w="3600"/>
+            <w:tcW w:type="dxa" w:w="1584"/>
             <w:shd w:fill="F9FAFB"/>
             <w:tcMar>
               <w:top w:w="80" w:type="dxa"/>
@@ -2122,7 +2343,234 @@
                 <w:color w:val="1F2937"/>
                 <w:sz w:val="18"/>
               </w:rPr>
-              <w:t>Faction elder entering sacred grounds without 'Sect Master Token'</w:t>
+              <w:t>Draft Submissions</w:t>
+            </w:r>
+          </w:p>
+        </w:tc>
+        <w:tc>
+          <w:tcPr>
+            <w:tcW w:type="dxa" w:w="1728"/>
+            <w:shd w:fill="F9FAFB"/>
+            <w:tcMar>
+              <w:top w:w="80" w:type="dxa"/>
+              <w:bottom w:w="80" w:type="dxa"/>
+              <w:left w:w="120" w:type="dxa"/>
+              <w:right w:w="120" w:type="dxa"/>
+            </w:tcMar>
+          </w:tcPr>
+          <w:p>
+            <w:pPr>
+              <w:jc w:val="left"/>
+            </w:pPr>
+            <w:r>
+              <w:rPr>
+                <w:rFonts w:ascii="Calibri" w:hAnsi="Calibri"/>
+                <w:color w:val="1F2937"/>
+                <w:sz w:val="18"/>
+              </w:rPr>
+              <w:t>Draft Proposals</w:t>
+            </w:r>
+          </w:p>
+        </w:tc>
+        <w:tc>
+          <w:tcPr>
+            <w:tcW w:type="dxa" w:w="1584"/>
+            <w:shd w:fill="F9FAFB"/>
+            <w:tcMar>
+              <w:top w:w="80" w:type="dxa"/>
+              <w:bottom w:w="80" w:type="dxa"/>
+              <w:left w:w="120" w:type="dxa"/>
+              <w:right w:w="120" w:type="dxa"/>
+            </w:tcMar>
+          </w:tcPr>
+          <w:p>
+            <w:pPr>
+              <w:jc w:val="left"/>
+            </w:pPr>
+            <w:r>
+              <w:rPr>
+                <w:rFonts w:ascii="Calibri" w:hAnsi="Calibri"/>
+                <w:color w:val="1F2937"/>
+                <w:sz w:val="18"/>
+              </w:rPr>
+              <w:t>Propose Events</w:t>
+            </w:r>
+          </w:p>
+        </w:tc>
+        <w:tc>
+          <w:tcPr>
+            <w:tcW w:type="dxa" w:w="1872"/>
+            <w:shd w:fill="F9FAFB"/>
+            <w:tcMar>
+              <w:top w:w="80" w:type="dxa"/>
+              <w:bottom w:w="80" w:type="dxa"/>
+              <w:left w:w="120" w:type="dxa"/>
+              <w:right w:w="120" w:type="dxa"/>
+            </w:tcMar>
+          </w:tcPr>
+          <w:p>
+            <w:pPr>
+              <w:jc w:val="left"/>
+            </w:pPr>
+            <w:r>
+              <w:rPr>
+                <w:rFonts w:ascii="Calibri" w:hAnsi="Calibri"/>
+                <w:color w:val="1F2937"/>
+                <w:sz w:val="18"/>
+              </w:rPr>
+              <w:t>None</w:t>
+            </w:r>
+          </w:p>
+        </w:tc>
+      </w:tr>
+      <w:tr>
+        <w:tc>
+          <w:tcPr>
+            <w:tcW w:type="dxa" w:w="1872"/>
+            <w:shd w:fill="FFFFFF"/>
+            <w:tcMar>
+              <w:top w:w="80" w:type="dxa"/>
+              <w:bottom w:w="80" w:type="dxa"/>
+              <w:left w:w="120" w:type="dxa"/>
+              <w:right w:w="120" w:type="dxa"/>
+            </w:tcMar>
+          </w:tcPr>
+          <w:p>
+            <w:pPr>
+              <w:jc w:val="left"/>
+            </w:pPr>
+            <w:r>
+              <w:rPr>
+                <w:rFonts w:ascii="Calibri" w:hAnsi="Calibri"/>
+                <w:color w:val="1F2937"/>
+                <w:sz w:val="18"/>
+              </w:rPr>
+              <w:t>VIEWER</w:t>
+            </w:r>
+          </w:p>
+        </w:tc>
+        <w:tc>
+          <w:tcPr>
+            <w:tcW w:type="dxa" w:w="2160"/>
+            <w:shd w:fill="FFFFFF"/>
+            <w:tcMar>
+              <w:top w:w="80" w:type="dxa"/>
+              <w:bottom w:w="80" w:type="dxa"/>
+              <w:left w:w="120" w:type="dxa"/>
+              <w:right w:w="120" w:type="dxa"/>
+            </w:tcMar>
+          </w:tcPr>
+          <w:p>
+            <w:pPr>
+              <w:jc w:val="left"/>
+            </w:pPr>
+            <w:r>
+              <w:rPr>
+                <w:rFonts w:ascii="Calibri" w:hAnsi="Calibri"/>
+                <w:color w:val="1F2937"/>
+                <w:sz w:val="18"/>
+              </w:rPr>
+              <w:t>Beta Reader / Proofreader</w:t>
+            </w:r>
+          </w:p>
+        </w:tc>
+        <w:tc>
+          <w:tcPr>
+            <w:tcW w:type="dxa" w:w="1584"/>
+            <w:shd w:fill="FFFFFF"/>
+            <w:tcMar>
+              <w:top w:w="80" w:type="dxa"/>
+              <w:bottom w:w="80" w:type="dxa"/>
+              <w:left w:w="120" w:type="dxa"/>
+              <w:right w:w="120" w:type="dxa"/>
+            </w:tcMar>
+          </w:tcPr>
+          <w:p>
+            <w:pPr>
+              <w:jc w:val="left"/>
+            </w:pPr>
+            <w:r>
+              <w:rPr>
+                <w:rFonts w:ascii="Calibri" w:hAnsi="Calibri"/>
+                <w:color w:val="1F2937"/>
+                <w:sz w:val="18"/>
+              </w:rPr>
+              <w:t>Read Only</w:t>
+            </w:r>
+          </w:p>
+        </w:tc>
+        <w:tc>
+          <w:tcPr>
+            <w:tcW w:type="dxa" w:w="1728"/>
+            <w:shd w:fill="FFFFFF"/>
+            <w:tcMar>
+              <w:top w:w="80" w:type="dxa"/>
+              <w:bottom w:w="80" w:type="dxa"/>
+              <w:left w:w="120" w:type="dxa"/>
+              <w:right w:w="120" w:type="dxa"/>
+            </w:tcMar>
+          </w:tcPr>
+          <w:p>
+            <w:pPr>
+              <w:jc w:val="left"/>
+            </w:pPr>
+            <w:r>
+              <w:rPr>
+                <w:rFonts w:ascii="Calibri" w:hAnsi="Calibri"/>
+                <w:color w:val="1F2937"/>
+                <w:sz w:val="18"/>
+              </w:rPr>
+              <w:t>Read Only</w:t>
+            </w:r>
+          </w:p>
+        </w:tc>
+        <w:tc>
+          <w:tcPr>
+            <w:tcW w:type="dxa" w:w="1584"/>
+            <w:shd w:fill="FFFFFF"/>
+            <w:tcMar>
+              <w:top w:w="80" w:type="dxa"/>
+              <w:bottom w:w="80" w:type="dxa"/>
+              <w:left w:w="120" w:type="dxa"/>
+              <w:right w:w="120" w:type="dxa"/>
+            </w:tcMar>
+          </w:tcPr>
+          <w:p>
+            <w:pPr>
+              <w:jc w:val="left"/>
+            </w:pPr>
+            <w:r>
+              <w:rPr>
+                <w:rFonts w:ascii="Calibri" w:hAnsi="Calibri"/>
+                <w:color w:val="1F2937"/>
+                <w:sz w:val="18"/>
+              </w:rPr>
+              <w:t>Read Only</w:t>
+            </w:r>
+          </w:p>
+        </w:tc>
+        <w:tc>
+          <w:tcPr>
+            <w:tcW w:type="dxa" w:w="1872"/>
+            <w:shd w:fill="FFFFFF"/>
+            <w:tcMar>
+              <w:top w:w="80" w:type="dxa"/>
+              <w:bottom w:w="80" w:type="dxa"/>
+              <w:left w:w="120" w:type="dxa"/>
+              <w:right w:w="120" w:type="dxa"/>
+            </w:tcMar>
+          </w:tcPr>
+          <w:p>
+            <w:pPr>
+              <w:jc w:val="left"/>
+            </w:pPr>
+            <w:r>
+              <w:rPr>
+                <w:rFonts w:ascii="Calibri" w:hAnsi="Calibri"/>
+                <w:color w:val="1F2937"/>
+                <w:sz w:val="18"/>
+              </w:rPr>
+              <w:t>None</w:t>
             </w:r>
           </w:p>
         </w:tc>
@@ -2133,12 +2581,12 @@
         <w:pStyle w:val="Heading2"/>
       </w:pPr>
       <w:r>
-        <w:t>4.3 Admin Override Governance: Authorized Powers vs Strict Prohibitions</w:t>
+        <w:t>4.2 In-App Author Overrides: What Authors CAN vs CANNOT Override</w:t>
       </w:r>
     </w:p>
     <w:p>
       <w:r>
-        <w:t>To allow narrative flexibility while preserving strict system auditability, NovWrite establishes clear administrative boundaries:</w:t>
+        <w:t>To allow narrative flexibility (e.g., resurrection, divine intervention) without sacrificing auditability, Lead Authors and Co-Authors possess explicit override powers:</w:t>
       </w:r>
     </w:p>
     <w:tbl>
@@ -2203,7 +2651,7 @@
                 <w:color w:val="FFFFFF"/>
                 <w:sz w:val="19"/>
               </w:rPr>
-              <w:t>Permitted for ADMIN?</w:t>
+              <w:t>Permitted for CO_AUTHOR?</w:t>
             </w:r>
           </w:p>
         </w:tc>
@@ -2229,7 +2677,7 @@
                 <w:color w:val="FFFFFF"/>
                 <w:sz w:val="19"/>
               </w:rPr>
-              <w:t>Permitted for OWNER?</w:t>
+              <w:t>Permitted for LEAD_AUTHOR?</w:t>
             </w:r>
           </w:p>
         </w:tc>
@@ -2916,7 +3364,7 @@
                 <w:color w:val="1F2937"/>
                 <w:sz w:val="18"/>
               </w:rPr>
-              <w:t>Project deletion is strictly restricted to project OWNER</w:t>
+              <w:t>Project deletion is strictly restricted to LEAD_AUTHOR</w:t>
             </w:r>
           </w:p>
         </w:tc>
@@ -3177,6 +3625,701 @@
       </w:tr>
     </w:tbl>
     <w:p>
+      <w:pPr>
+        <w:pStyle w:val="Heading2"/>
+      </w:pPr>
+      <w:r>
+        <w:t>4.3 Platform Administration: User Management, MFA Resets &amp; Billing Refunds</w:t>
+      </w:r>
+    </w:p>
+    <w:p>
+      <w:r>
+        <w:t>Platform Administrators operate at the infrastructure level to assist end users:</w:t>
+      </w:r>
+    </w:p>
+    <w:tbl>
+      <w:tblPr>
+        <w:tblW w:type="auto" w:w="0"/>
+        <w:jc w:val="center"/>
+        <w:tblLook w:firstColumn="1" w:firstRow="1" w:lastColumn="0" w:lastRow="0" w:noHBand="0" w:noVBand="1" w:val="04A0"/>
+      </w:tblPr>
+      <w:tblGrid>
+        <w:gridCol w:w="2340"/>
+        <w:gridCol w:w="2340"/>
+        <w:gridCol w:w="2340"/>
+        <w:gridCol w:w="2340"/>
+      </w:tblGrid>
+      <w:tr>
+        <w:tc>
+          <w:tcPr>
+            <w:tcW w:type="dxa" w:w="1872"/>
+            <w:shd w:fill="7C3AED"/>
+            <w:tcMar>
+              <w:top w:w="100" w:type="dxa"/>
+              <w:bottom w:w="100" w:type="dxa"/>
+              <w:left w:w="120" w:type="dxa"/>
+              <w:right w:w="120" w:type="dxa"/>
+            </w:tcMar>
+          </w:tcPr>
+          <w:p>
+            <w:pPr>
+              <w:jc w:val="left"/>
+            </w:pPr>
+            <w:r>
+              <w:rPr>
+                <w:rFonts w:ascii="Calibri" w:hAnsi="Calibri"/>
+                <w:b/>
+                <w:color w:val="FFFFFF"/>
+                <w:sz w:val="19"/>
+              </w:rPr>
+              <w:t>Support Domain</w:t>
+            </w:r>
+          </w:p>
+        </w:tc>
+        <w:tc>
+          <w:tcPr>
+            <w:tcW w:type="dxa" w:w="2016"/>
+            <w:shd w:fill="7C3AED"/>
+            <w:tcMar>
+              <w:top w:w="100" w:type="dxa"/>
+              <w:bottom w:w="100" w:type="dxa"/>
+              <w:left w:w="120" w:type="dxa"/>
+              <w:right w:w="120" w:type="dxa"/>
+            </w:tcMar>
+          </w:tcPr>
+          <w:p>
+            <w:pPr>
+              <w:jc w:val="left"/>
+            </w:pPr>
+            <w:r>
+              <w:rPr>
+                <w:rFonts w:ascii="Calibri" w:hAnsi="Calibri"/>
+                <w:b/>
+                <w:color w:val="FFFFFF"/>
+                <w:sz w:val="19"/>
+              </w:rPr>
+              <w:t>Admin Action</w:t>
+            </w:r>
+          </w:p>
+        </w:tc>
+        <w:tc>
+          <w:tcPr>
+            <w:tcW w:type="dxa" w:w="3312"/>
+            <w:shd w:fill="7C3AED"/>
+            <w:tcMar>
+              <w:top w:w="100" w:type="dxa"/>
+              <w:bottom w:w="100" w:type="dxa"/>
+              <w:left w:w="120" w:type="dxa"/>
+              <w:right w:w="120" w:type="dxa"/>
+            </w:tcMar>
+          </w:tcPr>
+          <w:p>
+            <w:pPr>
+              <w:jc w:val="left"/>
+            </w:pPr>
+            <w:r>
+              <w:rPr>
+                <w:rFonts w:ascii="Calibri" w:hAnsi="Calibri"/>
+                <w:b/>
+                <w:color w:val="FFFFFF"/>
+                <w:sz w:val="19"/>
+              </w:rPr>
+              <w:t>Purpose &amp; Workflow</w:t>
+            </w:r>
+          </w:p>
+        </w:tc>
+        <w:tc>
+          <w:tcPr>
+            <w:tcW w:type="dxa" w:w="2160"/>
+            <w:shd w:fill="7C3AED"/>
+            <w:tcMar>
+              <w:top w:w="100" w:type="dxa"/>
+              <w:bottom w:w="100" w:type="dxa"/>
+              <w:left w:w="120" w:type="dxa"/>
+              <w:right w:w="120" w:type="dxa"/>
+            </w:tcMar>
+          </w:tcPr>
+          <w:p>
+            <w:pPr>
+              <w:jc w:val="left"/>
+            </w:pPr>
+            <w:r>
+              <w:rPr>
+                <w:rFonts w:ascii="Calibri" w:hAnsi="Calibri"/>
+                <w:b/>
+                <w:color w:val="FFFFFF"/>
+                <w:sz w:val="19"/>
+              </w:rPr>
+              <w:t>Audit Requirement</w:t>
+            </w:r>
+          </w:p>
+        </w:tc>
+      </w:tr>
+      <w:tr>
+        <w:tc>
+          <w:tcPr>
+            <w:tcW w:type="dxa" w:w="1872"/>
+            <w:shd w:fill="FFFFFF"/>
+            <w:tcMar>
+              <w:top w:w="80" w:type="dxa"/>
+              <w:bottom w:w="80" w:type="dxa"/>
+              <w:left w:w="120" w:type="dxa"/>
+              <w:right w:w="120" w:type="dxa"/>
+            </w:tcMar>
+          </w:tcPr>
+          <w:p>
+            <w:pPr>
+              <w:jc w:val="left"/>
+            </w:pPr>
+            <w:r>
+              <w:rPr>
+                <w:rFonts w:ascii="Calibri" w:hAnsi="Calibri"/>
+                <w:color w:val="1F2937"/>
+                <w:sz w:val="18"/>
+              </w:rPr>
+              <w:t>Account Auth &amp; Security</w:t>
+            </w:r>
+          </w:p>
+        </w:tc>
+        <w:tc>
+          <w:tcPr>
+            <w:tcW w:type="dxa" w:w="2016"/>
+            <w:shd w:fill="FFFFFF"/>
+            <w:tcMar>
+              <w:top w:w="80" w:type="dxa"/>
+              <w:bottom w:w="80" w:type="dxa"/>
+              <w:left w:w="120" w:type="dxa"/>
+              <w:right w:w="120" w:type="dxa"/>
+            </w:tcMar>
+          </w:tcPr>
+          <w:p>
+            <w:pPr>
+              <w:jc w:val="left"/>
+            </w:pPr>
+            <w:r>
+              <w:rPr>
+                <w:rFonts w:ascii="Calibri" w:hAnsi="Calibri"/>
+                <w:color w:val="1F2937"/>
+                <w:sz w:val="18"/>
+              </w:rPr>
+              <w:t>MFA / 2FA Reset</w:t>
+            </w:r>
+          </w:p>
+        </w:tc>
+        <w:tc>
+          <w:tcPr>
+            <w:tcW w:type="dxa" w:w="3312"/>
+            <w:shd w:fill="FFFFFF"/>
+            <w:tcMar>
+              <w:top w:w="80" w:type="dxa"/>
+              <w:bottom w:w="80" w:type="dxa"/>
+              <w:left w:w="120" w:type="dxa"/>
+              <w:right w:w="120" w:type="dxa"/>
+            </w:tcMar>
+          </w:tcPr>
+          <w:p>
+            <w:pPr>
+              <w:jc w:val="left"/>
+            </w:pPr>
+            <w:r>
+              <w:rPr>
+                <w:rFonts w:ascii="Calibri" w:hAnsi="Calibri"/>
+                <w:color w:val="1F2937"/>
+                <w:sz w:val="18"/>
+              </w:rPr>
+              <w:t>Assist legitimate users locked out due to lost authenticators after identity verification</w:t>
+            </w:r>
+          </w:p>
+        </w:tc>
+        <w:tc>
+          <w:tcPr>
+            <w:tcW w:type="dxa" w:w="2160"/>
+            <w:shd w:fill="FFFFFF"/>
+            <w:tcMar>
+              <w:top w:w="80" w:type="dxa"/>
+              <w:bottom w:w="80" w:type="dxa"/>
+              <w:left w:w="120" w:type="dxa"/>
+              <w:right w:w="120" w:type="dxa"/>
+            </w:tcMar>
+          </w:tcPr>
+          <w:p>
+            <w:pPr>
+              <w:jc w:val="left"/>
+            </w:pPr>
+            <w:r>
+              <w:rPr>
+                <w:rFonts w:ascii="Calibri" w:hAnsi="Calibri"/>
+                <w:color w:val="1F2937"/>
+                <w:sz w:val="18"/>
+              </w:rPr>
+              <w:t>Logged to platform_admin_audit_logs with ticket ID</w:t>
+            </w:r>
+          </w:p>
+        </w:tc>
+      </w:tr>
+      <w:tr>
+        <w:tc>
+          <w:tcPr>
+            <w:tcW w:type="dxa" w:w="1872"/>
+            <w:shd w:fill="F9FAFB"/>
+            <w:tcMar>
+              <w:top w:w="80" w:type="dxa"/>
+              <w:bottom w:w="80" w:type="dxa"/>
+              <w:left w:w="120" w:type="dxa"/>
+              <w:right w:w="120" w:type="dxa"/>
+            </w:tcMar>
+          </w:tcPr>
+          <w:p>
+            <w:pPr>
+              <w:jc w:val="left"/>
+            </w:pPr>
+            <w:r>
+              <w:rPr>
+                <w:rFonts w:ascii="Calibri" w:hAnsi="Calibri"/>
+                <w:color w:val="1F2937"/>
+                <w:sz w:val="18"/>
+              </w:rPr>
+              <w:t>Account Lifecycle</w:t>
+            </w:r>
+          </w:p>
+        </w:tc>
+        <w:tc>
+          <w:tcPr>
+            <w:tcW w:type="dxa" w:w="2016"/>
+            <w:shd w:fill="F9FAFB"/>
+            <w:tcMar>
+              <w:top w:w="80" w:type="dxa"/>
+              <w:bottom w:w="80" w:type="dxa"/>
+              <w:left w:w="120" w:type="dxa"/>
+              <w:right w:w="120" w:type="dxa"/>
+            </w:tcMar>
+          </w:tcPr>
+          <w:p>
+            <w:pPr>
+              <w:jc w:val="left"/>
+            </w:pPr>
+            <w:r>
+              <w:rPr>
+                <w:rFonts w:ascii="Calibri" w:hAnsi="Calibri"/>
+                <w:color w:val="1F2937"/>
+                <w:sz w:val="18"/>
+              </w:rPr>
+              <w:t>Unlock Account / Password Reset</w:t>
+            </w:r>
+          </w:p>
+        </w:tc>
+        <w:tc>
+          <w:tcPr>
+            <w:tcW w:type="dxa" w:w="3312"/>
+            <w:shd w:fill="F9FAFB"/>
+            <w:tcMar>
+              <w:top w:w="80" w:type="dxa"/>
+              <w:bottom w:w="80" w:type="dxa"/>
+              <w:left w:w="120" w:type="dxa"/>
+              <w:right w:w="120" w:type="dxa"/>
+            </w:tcMar>
+          </w:tcPr>
+          <w:p>
+            <w:pPr>
+              <w:jc w:val="left"/>
+            </w:pPr>
+            <w:r>
+              <w:rPr>
+                <w:rFonts w:ascii="Calibri" w:hAnsi="Calibri"/>
+                <w:color w:val="1F2937"/>
+                <w:sz w:val="18"/>
+              </w:rPr>
+              <w:t>Clear security lockouts, trigger verified reset links, revoke compromised sessions</w:t>
+            </w:r>
+          </w:p>
+        </w:tc>
+        <w:tc>
+          <w:tcPr>
+            <w:tcW w:type="dxa" w:w="2160"/>
+            <w:shd w:fill="F9FAFB"/>
+            <w:tcMar>
+              <w:top w:w="80" w:type="dxa"/>
+              <w:bottom w:w="80" w:type="dxa"/>
+              <w:left w:w="120" w:type="dxa"/>
+              <w:right w:w="120" w:type="dxa"/>
+            </w:tcMar>
+          </w:tcPr>
+          <w:p>
+            <w:pPr>
+              <w:jc w:val="left"/>
+            </w:pPr>
+            <w:r>
+              <w:rPr>
+                <w:rFonts w:ascii="Calibri" w:hAnsi="Calibri"/>
+                <w:color w:val="1F2937"/>
+                <w:sz w:val="18"/>
+              </w:rPr>
+              <w:t>Full IP and timestamp log</w:t>
+            </w:r>
+          </w:p>
+        </w:tc>
+      </w:tr>
+      <w:tr>
+        <w:tc>
+          <w:tcPr>
+            <w:tcW w:type="dxa" w:w="1872"/>
+            <w:shd w:fill="FFFFFF"/>
+            <w:tcMar>
+              <w:top w:w="80" w:type="dxa"/>
+              <w:bottom w:w="80" w:type="dxa"/>
+              <w:left w:w="120" w:type="dxa"/>
+              <w:right w:w="120" w:type="dxa"/>
+            </w:tcMar>
+          </w:tcPr>
+          <w:p>
+            <w:pPr>
+              <w:jc w:val="left"/>
+            </w:pPr>
+            <w:r>
+              <w:rPr>
+                <w:rFonts w:ascii="Calibri" w:hAnsi="Calibri"/>
+                <w:color w:val="1F2937"/>
+                <w:sz w:val="18"/>
+              </w:rPr>
+              <w:t>Billing &amp; Payments</w:t>
+            </w:r>
+          </w:p>
+        </w:tc>
+        <w:tc>
+          <w:tcPr>
+            <w:tcW w:type="dxa" w:w="2016"/>
+            <w:shd w:fill="FFFFFF"/>
+            <w:tcMar>
+              <w:top w:w="80" w:type="dxa"/>
+              <w:bottom w:w="80" w:type="dxa"/>
+              <w:left w:w="120" w:type="dxa"/>
+              <w:right w:w="120" w:type="dxa"/>
+            </w:tcMar>
+          </w:tcPr>
+          <w:p>
+            <w:pPr>
+              <w:jc w:val="left"/>
+            </w:pPr>
+            <w:r>
+              <w:rPr>
+                <w:rFonts w:ascii="Calibri" w:hAnsi="Calibri"/>
+                <w:color w:val="1F2937"/>
+                <w:sz w:val="18"/>
+              </w:rPr>
+              <w:t>Refund Processing &amp; Tier Updates</w:t>
+            </w:r>
+          </w:p>
+        </w:tc>
+        <w:tc>
+          <w:tcPr>
+            <w:tcW w:type="dxa" w:w="3312"/>
+            <w:shd w:fill="FFFFFF"/>
+            <w:tcMar>
+              <w:top w:w="80" w:type="dxa"/>
+              <w:bottom w:w="80" w:type="dxa"/>
+              <w:left w:w="120" w:type="dxa"/>
+              <w:right w:w="120" w:type="dxa"/>
+            </w:tcMar>
+          </w:tcPr>
+          <w:p>
+            <w:pPr>
+              <w:jc w:val="left"/>
+            </w:pPr>
+            <w:r>
+              <w:rPr>
+                <w:rFonts w:ascii="Calibri" w:hAnsi="Calibri"/>
+                <w:color w:val="1F2937"/>
+                <w:sz w:val="18"/>
+              </w:rPr>
+              <w:t>Issue partial/full refunds via Stripe gateway, adjust subscription tiers</w:t>
+            </w:r>
+          </w:p>
+        </w:tc>
+        <w:tc>
+          <w:tcPr>
+            <w:tcW w:type="dxa" w:w="2160"/>
+            <w:shd w:fill="FFFFFF"/>
+            <w:tcMar>
+              <w:top w:w="80" w:type="dxa"/>
+              <w:bottom w:w="80" w:type="dxa"/>
+              <w:left w:w="120" w:type="dxa"/>
+              <w:right w:w="120" w:type="dxa"/>
+            </w:tcMar>
+          </w:tcPr>
+          <w:p>
+            <w:pPr>
+              <w:jc w:val="left"/>
+            </w:pPr>
+            <w:r>
+              <w:rPr>
+                <w:rFonts w:ascii="Calibri" w:hAnsi="Calibri"/>
+                <w:color w:val="1F2937"/>
+                <w:sz w:val="18"/>
+              </w:rPr>
+              <w:t>Stripe charge ID, refund amount, and justification logged</w:t>
+            </w:r>
+          </w:p>
+        </w:tc>
+      </w:tr>
+      <w:tr>
+        <w:tc>
+          <w:tcPr>
+            <w:tcW w:type="dxa" w:w="1872"/>
+            <w:shd w:fill="F9FAFB"/>
+            <w:tcMar>
+              <w:top w:w="80" w:type="dxa"/>
+              <w:bottom w:w="80" w:type="dxa"/>
+              <w:left w:w="120" w:type="dxa"/>
+              <w:right w:w="120" w:type="dxa"/>
+            </w:tcMar>
+          </w:tcPr>
+          <w:p>
+            <w:pPr>
+              <w:jc w:val="left"/>
+            </w:pPr>
+            <w:r>
+              <w:rPr>
+                <w:rFonts w:ascii="Calibri" w:hAnsi="Calibri"/>
+                <w:color w:val="1F2937"/>
+                <w:sz w:val="18"/>
+              </w:rPr>
+              <w:t>Data Integrity Support</w:t>
+            </w:r>
+          </w:p>
+        </w:tc>
+        <w:tc>
+          <w:tcPr>
+            <w:tcW w:type="dxa" w:w="2016"/>
+            <w:shd w:fill="F9FAFB"/>
+            <w:tcMar>
+              <w:top w:w="80" w:type="dxa"/>
+              <w:bottom w:w="80" w:type="dxa"/>
+              <w:left w:w="120" w:type="dxa"/>
+              <w:right w:w="120" w:type="dxa"/>
+            </w:tcMar>
+          </w:tcPr>
+          <w:p>
+            <w:pPr>
+              <w:jc w:val="left"/>
+            </w:pPr>
+            <w:r>
+              <w:rPr>
+                <w:rFonts w:ascii="Calibri" w:hAnsi="Calibri"/>
+                <w:color w:val="1F2937"/>
+                <w:sz w:val="18"/>
+              </w:rPr>
+              <w:t>Manual Snapshot Repair / Re-Index</w:t>
+            </w:r>
+          </w:p>
+        </w:tc>
+        <w:tc>
+          <w:tcPr>
+            <w:tcW w:type="dxa" w:w="3312"/>
+            <w:shd w:fill="F9FAFB"/>
+            <w:tcMar>
+              <w:top w:w="80" w:type="dxa"/>
+              <w:bottom w:w="80" w:type="dxa"/>
+              <w:left w:w="120" w:type="dxa"/>
+              <w:right w:w="120" w:type="dxa"/>
+            </w:tcMar>
+          </w:tcPr>
+          <w:p>
+            <w:pPr>
+              <w:jc w:val="left"/>
+            </w:pPr>
+            <w:r>
+              <w:rPr>
+                <w:rFonts w:ascii="Calibri" w:hAnsi="Calibri"/>
+                <w:color w:val="1F2937"/>
+                <w:sz w:val="18"/>
+              </w:rPr>
+              <w:t>Repair corrupted state snapshots or re-index vector embeddings on support request</w:t>
+            </w:r>
+          </w:p>
+        </w:tc>
+        <w:tc>
+          <w:tcPr>
+            <w:tcW w:type="dxa" w:w="2160"/>
+            <w:shd w:fill="F9FAFB"/>
+            <w:tcMar>
+              <w:top w:w="80" w:type="dxa"/>
+              <w:bottom w:w="80" w:type="dxa"/>
+              <w:left w:w="120" w:type="dxa"/>
+              <w:right w:w="120" w:type="dxa"/>
+            </w:tcMar>
+          </w:tcPr>
+          <w:p>
+            <w:pPr>
+              <w:jc w:val="left"/>
+            </w:pPr>
+            <w:r>
+              <w:rPr>
+                <w:rFonts w:ascii="Calibri" w:hAnsi="Calibri"/>
+                <w:color w:val="1F2937"/>
+                <w:sz w:val="18"/>
+              </w:rPr>
+              <w:t>Target project_id and repair execution log captured</w:t>
+            </w:r>
+          </w:p>
+        </w:tc>
+      </w:tr>
+      <w:tr>
+        <w:tc>
+          <w:tcPr>
+            <w:tcW w:type="dxa" w:w="1872"/>
+            <w:shd w:fill="FFFFFF"/>
+            <w:tcMar>
+              <w:top w:w="80" w:type="dxa"/>
+              <w:bottom w:w="80" w:type="dxa"/>
+              <w:left w:w="120" w:type="dxa"/>
+              <w:right w:w="120" w:type="dxa"/>
+            </w:tcMar>
+          </w:tcPr>
+          <w:p>
+            <w:pPr>
+              <w:jc w:val="left"/>
+            </w:pPr>
+            <w:r>
+              <w:rPr>
+                <w:rFonts w:ascii="Calibri" w:hAnsi="Calibri"/>
+                <w:color w:val="1F2937"/>
+                <w:sz w:val="18"/>
+              </w:rPr>
+              <w:t>Compliance &amp; Safety</w:t>
+            </w:r>
+          </w:p>
+        </w:tc>
+        <w:tc>
+          <w:tcPr>
+            <w:tcW w:type="dxa" w:w="2016"/>
+            <w:shd w:fill="FFFFFF"/>
+            <w:tcMar>
+              <w:top w:w="80" w:type="dxa"/>
+              <w:bottom w:w="80" w:type="dxa"/>
+              <w:left w:w="120" w:type="dxa"/>
+              <w:right w:w="120" w:type="dxa"/>
+            </w:tcMar>
+          </w:tcPr>
+          <w:p>
+            <w:pPr>
+              <w:jc w:val="left"/>
+            </w:pPr>
+            <w:r>
+              <w:rPr>
+                <w:rFonts w:ascii="Calibri" w:hAnsi="Calibri"/>
+                <w:color w:val="1F2937"/>
+                <w:sz w:val="18"/>
+              </w:rPr>
+              <w:t>Account Quarantine / DMCA</w:t>
+            </w:r>
+          </w:p>
+        </w:tc>
+        <w:tc>
+          <w:tcPr>
+            <w:tcW w:type="dxa" w:w="3312"/>
+            <w:shd w:fill="FFFFFF"/>
+            <w:tcMar>
+              <w:top w:w="80" w:type="dxa"/>
+              <w:bottom w:w="80" w:type="dxa"/>
+              <w:left w:w="120" w:type="dxa"/>
+              <w:right w:w="120" w:type="dxa"/>
+            </w:tcMar>
+          </w:tcPr>
+          <w:p>
+            <w:pPr>
+              <w:jc w:val="left"/>
+            </w:pPr>
+            <w:r>
+              <w:rPr>
+                <w:rFonts w:ascii="Calibri" w:hAnsi="Calibri"/>
+                <w:color w:val="1F2937"/>
+                <w:sz w:val="18"/>
+              </w:rPr>
+              <w:t>Temporarily suspend malicious or infringing accounts under legal / terms compliance</w:t>
+            </w:r>
+          </w:p>
+        </w:tc>
+        <w:tc>
+          <w:tcPr>
+            <w:tcW w:type="dxa" w:w="2160"/>
+            <w:shd w:fill="FFFFFF"/>
+            <w:tcMar>
+              <w:top w:w="80" w:type="dxa"/>
+              <w:bottom w:w="80" w:type="dxa"/>
+              <w:left w:w="120" w:type="dxa"/>
+              <w:right w:w="120" w:type="dxa"/>
+            </w:tcMar>
+          </w:tcPr>
+          <w:p>
+            <w:pPr>
+              <w:jc w:val="left"/>
+            </w:pPr>
+            <w:r>
+              <w:rPr>
+                <w:rFonts w:ascii="Calibri" w:hAnsi="Calibri"/>
+                <w:color w:val="1F2937"/>
+                <w:sz w:val="18"/>
+              </w:rPr>
+              <w:t>Legal case / report reference logged</w:t>
+            </w:r>
+          </w:p>
+        </w:tc>
+      </w:tr>
+    </w:tbl>
+    <w:tbl>
+      <w:tblPr>
+        <w:tblW w:type="auto" w:w="0"/>
+        <w:jc w:val="center"/>
+        <w:tblLayout w:type="fixed"/>
+        <w:tblLook w:firstColumn="1" w:firstRow="1" w:lastColumn="0" w:lastRow="0" w:noHBand="0" w:noVBand="1" w:val="04A0"/>
+      </w:tblPr>
+      <w:tblGrid>
+        <w:gridCol w:w="9360"/>
+      </w:tblGrid>
+      <w:tr>
+        <w:tc>
+          <w:tcPr>
+            <w:tcW w:type="dxa" w:w="9360"/>
+            <w:shd w:fill="F5F3FF"/>
+            <w:tcMar>
+              <w:top w:w="120" w:type="dxa"/>
+              <w:bottom w:w="120" w:type="dxa"/>
+              <w:left w:w="180" w:type="dxa"/>
+              <w:right w:w="180" w:type="dxa"/>
+            </w:tcMar>
+            <w:tcBorders>
+              <w:top w:val="none" w:sz="0" w:space="0" w:color="auto"/>
+              <w:left w:val="single" w:sz="24" w:space="0" w:color="7C3AED"/>
+              <w:bottom w:val="none" w:sz="0" w:space="0" w:color="auto"/>
+              <w:right w:val="none" w:sz="0" w:space="0" w:color="auto"/>
+            </w:tcBorders>
+          </w:tcPr>
+          <w:p>
+            <w:pPr>
+              <w:spacing w:before="40" w:after="40"/>
+            </w:pPr>
+            <w:r>
+              <w:rPr>
+                <w:rFonts w:ascii="Calibri" w:hAnsi="Calibri"/>
+                <w:b/>
+                <w:color w:val="5B21B6"/>
+                <w:sz w:val="20"/>
+              </w:rPr>
+              <w:t xml:space="preserve">SECURITY GUARANTEE: </w:t>
+            </w:r>
+            <w:r>
+              <w:rPr>
+                <w:rFonts w:ascii="Calibri" w:hAnsi="Calibri"/>
+                <w:color w:val="1F2937"/>
+                <w:sz w:val="20"/>
+              </w:rPr>
+              <w:t>Platform Admin Security Rails: (1) Zero access to plaintext passwords (Argon2id/bcrypt); (2) Zero unconsented browsing of private user prose (requires time-bounded user support grant); (3) Zero raw credit card storage (PCI-DSS Stripe tokenization); (4) Append-only platform audit logs.</w:t>
+            </w:r>
+          </w:p>
+        </w:tc>
+      </w:tr>
+    </w:tbl>
+    <w:p>
       <w:r>
         <w:br w:type="page"/>
       </w:r>
@@ -3202,16 +4345,14 @@
     </w:p>
     <w:p>
       <w:r>
-        <w:t>A critical UX decision in NovWrite is the complete decoupling of the Prose Writing Space from the World Creation Space. Writing prose and building fictional universes require fundamentally different cognitive workflows and interface layouts.</w:t>
+        <w:t>NovWrite decouples the Prose Writing Space from the World Creation Space into independent standalone workbenches:</w:t>
       </w:r>
     </w:p>
     <w:p>
       <w:r>
         <w:t>1. NovWrite Prose Studio (/novel):</w:t>
         <w:br/>
-        <w:t xml:space="preserve">   - Focuses exclusively on writing velocity with a full-height markdown prose canvas.</w:t>
-        <w:br/>
-        <w:t xml:space="preserve">   - Real-time author presence avatars and active scene lock banners.</w:t>
+        <w:t xml:space="preserve">   - Full-height markdown prose canvas with real-time co-author presence avatars and scene lock banners.</w:t>
         <w:br/>
         <w:t xml:space="preserve">   - Minimalist status pills indicate real-time continuity health without interrupting the creative flow.</w:t>
         <w:br/>
@@ -3234,7 +4375,7 @@
         <w:br/>
         <w:t xml:space="preserve">   - Relationships (/world/relationships): Master 2D relationship matrix and node-link network visualizer.</w:t>
         <w:br/>
-        <w:t xml:space="preserve">   - Continuity Health &amp; Canon Reconciler (/world/audit): System-wide violation dashboard with Admin Override Modal.</w:t>
+        <w:t xml:space="preserve">   - Continuity Health &amp; Canon Reconciler (/world/audit): System-wide violation dashboard with Canon Override Modal.</w:t>
       </w:r>
     </w:p>
     <w:tbl>
@@ -3830,23 +4971,6 @@
         </w:tc>
       </w:tr>
     </w:tbl>
-    <w:p>
-      <w:pPr>
-        <w:pStyle w:val="Heading2"/>
-      </w:pPr>
-      <w:r>
-        <w:t>5.3 Visual Workbench Aesthetic &amp; Mobile Responsiveness</w:t>
-      </w:r>
-    </w:p>
-    <w:p>
-      <w:r>
-        <w:t>- Aesthetic: Inspired by MongoDB Compass and Linear developer workbenches. Clean, high-contrast borders (#334155 / #e2e8f0), dark zinc surfaces (#080c14 / #0d1322) and crisp light slate surfaces (#f8fafc / #ffffff).</w:t>
-        <w:br/>
-        <w:t>- Dual Solid Primary Palette: Solid Purple (#7c3aed) for structural hierarchy and AI grounding; Solid Red (#dc2626) for invariant breach alerts and timeline mutations. Zero marketing gradients.</w:t>
-        <w:br/>
-        <w:t>- Android Viewport Parity: Rigorously engineered for narrow viewports (280px-340px foldable cover screens, 360px-390px compact Androids), 100dvh virtual keyboard compensation, and a strict Zero Horizontal Overflow Guarantee.</w:t>
-      </w:r>
-    </w:p>
     <w:p>
       <w:r>
         <w:br w:type="page"/>
@@ -4770,7 +5894,7 @@
                 <w:color w:val="1F2937"/>
                 <w:sz w:val="18"/>
               </w:rPr>
-              <w:t>Heartbeat Refresh / Admin Break</w:t>
+              <w:t>Heartbeat Refresh / Co-Author Break</w:t>
             </w:r>
           </w:p>
         </w:tc>
@@ -4905,19 +6029,6 @@
     </w:tbl>
     <w:p>
       <w:pPr>
-        <w:pStyle w:val="Heading2"/>
-      </w:pPr>
-      <w:r>
-        <w:t>6.1 Cascading Invalidation Protocol on Retroactive Edits</w:t>
-      </w:r>
-    </w:p>
-    <w:p>
-      <w:r>
-        <w:t>When an author edits or inserts an event at historical sequence K, all cached state snapshots with sequence &gt;= K in that project become invalid. The Go backend executes atomic key eviction via Redis UNLINK, broadcasts a retroactive invalidation message over Redis Pub/Sub, and pushes live SSE updates to all connected web, desktop, and mobile clients.</w:t>
-      </w:r>
-    </w:p>
-    <w:p>
-      <w:pPr>
         <w:pStyle w:val="Heading1"/>
       </w:pPr>
       <w:r>
@@ -4996,7 +6107,7 @@
     </w:p>
     <w:p>
       <w:r>
-        <w:t>NovWrite establishes a new architectural benchmark for AI-assisted creative writing systems. By enforcing Canon Over AI Memory, combining relational prose structures with dynamic JSONB schemas, providing robust multi-user RBAC and scene leases, and leveraging event-sourcing state reconstruction with audited admin overrides, the platform guarantees deterministic lore consistency across massive multi-chapter narratives.</w:t>
+        <w:t>NovWrite establishes a new architectural benchmark for AI-assisted creative writing systems. By enforcing Canon Over AI Memory, combining relational prose structures with dynamic JSONB schemas, providing robust in-app Author Roles and scene leases, offering comprehensive Platform Admin assistance (MFA resets, refunds, data repair), and leveraging event-sourcing state reconstruction with audited canon overrides, the platform guarantees deterministic lore consistency across massive multi-chapter narratives.</w:t>
       </w:r>
     </w:p>
     <w:p>

</xml_diff>

<commit_message>
feat(arch): formalize two-front branching and dedicated communication gateway
</commit_message>
<xml_diff>
--- a/Novwrite.docx
+++ b/Novwrite.docx
@@ -194,7 +194,7 @@
               <w:rPr>
                 <w:color w:val="111827"/>
               </w:rPr>
-              <w:t>Technical Architecture &amp; System Baseline Locked (v1.6 - Platform Admin &amp; Author Roles)</w:t>
+              <w:t>Technical Architecture &amp; System Baseline Locked (v1.7 - Two-Front Branching &amp; Communication Gateway)</w:t>
             </w:r>
           </w:p>
         </w:tc>
@@ -264,7 +264,7 @@
     </w:p>
     <w:p>
       <w:r>
-        <w:t>NovWrite addresses these foundational limitations by establishing a continuity-first multi-user novel creation architecture grounded in the principle: Canon Over AI Memory. Rather than treating a novel as flat, unstructured text documents, NovWrite formalizes the fictional universe as a deterministic state machine powered by event-sourcing state reconstruction, dynamic schema definitions, in-app Author Roles (Lead Author, Co-Author, Editor, Contributor, Viewer), Platform Administration capabilities (MFA resets, payment/refund processing, data repair assistance), and explainable continuity verification algorithms.</w:t>
+        <w:t>NovWrite addresses these foundational limitations by establishing a continuity-first multi-user novel creation architecture grounded in the principle: Canon Over AI Memory. Rather than treating a novel as flat, unstructured text documents, NovWrite formalizes the fictional universe as a deterministic state machine powered by event-sourcing state reconstruction, dynamic schema definitions, in-app Author Roles (Lead Author, Co-Author, Editor, Contributor, Viewer), Platform Administration capabilities (MFA resets, payment/refund processing, data repair assistance), a Two-Front isolated branching model ('world' vs 'novel' branches), a dedicated cross-domain Communication Layer, and explainable continuity verification algorithms.</w:t>
       </w:r>
     </w:p>
     <w:tbl>
@@ -314,7 +314,7 @@
                 <w:color w:val="1F2937"/>
                 <w:sz w:val="20"/>
               </w:rPr>
-              <w:t>Core Architectural Thesis: Fictional world state is stored deterministically in an authoritative relational + dynamic JSONB database (PostgreSQL 18 with pgvector), not implicitly inside probabilistic AI context windows. In-app collaboration is managed via Author Roles (Lead Author, Co-Author) with heartbeat scene leases, while Platform Administrators handle user account support, MFA resets, and billing.</w:t>
+              <w:t>Core Architectural Thesis: Fictional world state is stored deterministically in an authoritative relational + dynamic JSONB database (PostgreSQL 18 with pgvector), not implicitly inside probabilistic AI context windows. In-app collaboration is managed via Author Roles (Lead Author, Co-Author) with heartbeat scene leases, while Novel and World engineering are decoupled across two isolated git branches communicating exclusively through a dedicated contract bridge and unified diagnostic console.</w:t>
             </w:r>
           </w:p>
         </w:tc>
@@ -322,7 +322,7 @@
     </w:tbl>
     <w:p>
       <w:r>
-        <w:t>This report outlines the complete technical architecture of the NovWrite platform, spanning its hybrid multi-service backend (Go 1.23+ Core API, TypeScript Prisma Data Service, PostgreSQL 18 with pgvector, and Redis 7 Multi-Tier Cache), its decoupled multi-platform frontend architecture (SvelteKit Web, Tauri 2 Desktop, and React Native / Expo Mobile with React Native Reusables), and its deterministic multi-user continuity verification pipeline.</w:t>
+        <w:t>This report outlines the complete technical architecture of the NovWrite platform, spanning its hybrid multi-service backend (Go 1.23+ Core API, TypeScript Prisma Data Service, PostgreSQL 18 with pgvector, and Redis 7 Multi-Tier Cache), its decoupled multi-platform frontend architecture (SvelteKit Web, Tauri 2 Desktop, and React Native / Expo Mobile with React Native Reusables), its two-front branching and dedicated communication bridge, and its deterministic multi-user continuity verification pipeline.</w:t>
       </w:r>
     </w:p>
     <w:p>
@@ -1069,7 +1069,17 @@
         <w:rPr>
           <w:b/>
         </w:rPr>
-        <w:t xml:space="preserve">5. Explainable Continuity Verification &amp; Canon Overrides: </w:t>
+        <w:t xml:space="preserve">5. Two-Front Branching &amp; Zero Direct Cross-Talk: </w:t>
+      </w:r>
+      <w:r>
+        <w:t>Divide development into dedicated 'world' and 'novel' branches with an isolated, typed Communication Layer and single-page diagnostic hub.</w:t>
+        <w:br/>
+      </w:r>
+      <w:r>
+        <w:rPr>
+          <w:b/>
+        </w:rPr>
+        <w:t xml:space="preserve">6. Explainable Continuity Verification &amp; Canon Overrides: </w:t>
       </w:r>
       <w:r>
         <w:t>Automatically detect lore contradictions, cite historical events responsible, and allow authorized Lead Authors/Co-Authors to force-approve intentional exceptions with mandatory audit logging.</w:t>
@@ -1079,7 +1089,7 @@
         <w:rPr>
           <w:b/>
         </w:rPr>
-        <w:t xml:space="preserve">6. Decoupled Dedicated Workspaces: </w:t>
+        <w:t xml:space="preserve">7. Decoupled Dedicated Workspaces: </w:t>
       </w:r>
       <w:r>
         <w:t>Provide dedicated full-viewport workbenches for Novel Writing vs World Building, eliminating nested tab-in-modal anti-patterns.</w:t>
@@ -1089,7 +1099,7 @@
         <w:rPr>
           <w:b/>
         </w:rPr>
-        <w:t xml:space="preserve">7. Tri-Platform Co-Development: </w:t>
+        <w:t xml:space="preserve">8. Tri-Platform Co-Development: </w:t>
       </w:r>
       <w:r>
         <w:t>Engineer Web (SvelteKit), Desktop (Tauri 2), and Mobile (React Native + Expo) simultaneously with complete component and design system parity.</w:t>
@@ -1236,6 +1246,113 @@
         <w:t xml:space="preserve">   - Redis 7.2 handles multi-tier snapshot caching, collaborative scene lease mutexes, and real-time Pub/Sub invalidation.</w:t>
       </w:r>
     </w:p>
+    <w:p>
+      <w:pPr>
+        <w:pStyle w:val="Heading2"/>
+      </w:pPr>
+      <w:r>
+        <w:t>2.2 Two-Front Branching Strategy &amp; Dedicated Communication Gateway</w:t>
+      </w:r>
+    </w:p>
+    <w:p>
+      <w:r>
+        <w:t>To achieve extreme modularity, eliminate cross-domain dependency spaghetti, and enable independent parallel engineering, NovWrite divides core engineering into two autonomous fronts on dedicated git branches:</w:t>
+      </w:r>
+    </w:p>
+    <w:p>
+      <w:r>
+        <w:rPr>
+          <w:b/>
+        </w:rPr>
+        <w:t xml:space="preserve">1. World Front (Git Branch: `world`): </w:t>
+      </w:r>
+      <w:r>
+        <w:t>Owns universe entity models, dynamic schema systems, timeline event logs, invariant rule graphs, and the deterministic State Fold Engine. Has zero awareness of prose formatting, rich-text editor nodes, or manuscript hierarchies.</w:t>
+        <w:br/>
+      </w:r>
+      <w:r>
+        <w:rPr>
+          <w:b/>
+        </w:rPr>
+        <w:t xml:space="preserve">2. Novel Front (Git Branch: `novel`): </w:t>
+      </w:r>
+      <w:r>
+        <w:t>Owns Prose Studio, chapter trees, TipTap/Lexical editor engines, collaborative scene leases, and multi-author presence. Has zero awareness of raw entity ASTs, SQL join graphs, or internal rule execution loops.</w:t>
+        <w:br/>
+      </w:r>
+      <w:r>
+        <w:rPr>
+          <w:b/>
+        </w:rPr>
+        <w:t xml:space="preserve">3. The Zero Direct Cross-Talk Invariant: </w:t>
+      </w:r>
+      <w:r>
+        <w:t>Novel Space and World Space NEVER import each other's domain packages or query raw databases directly. All inter-space interactions pass through a strictly typed Communication Bridge (`@novwrite/bridge`) using standardized RPC and SSE contracts.</w:t>
+        <w:br/>
+      </w:r>
+      <w:r>
+        <w:rPr>
+          <w:b/>
+        </w:rPr>
+        <w:t xml:space="preserve">4. Centralized Communication Diagnostics Hub (/dev/communication-hub): </w:t>
+      </w:r>
+      <w:r>
+        <w:t>A single, unified console capturing all cross-space payloads, schema validation mismatches, network errors, and replay debugging in one page, ensuring communication anomalies are isolated and fixed instantly without cross-domain regression.</w:t>
+      </w:r>
+    </w:p>
+    <w:tbl>
+      <w:tblPr>
+        <w:tblW w:type="auto" w:w="0"/>
+        <w:jc w:val="center"/>
+        <w:tblLayout w:type="fixed"/>
+        <w:tblLook w:firstColumn="1" w:firstRow="1" w:lastColumn="0" w:lastRow="0" w:noHBand="0" w:noVBand="1" w:val="04A0"/>
+      </w:tblPr>
+      <w:tblGrid>
+        <w:gridCol w:w="9360"/>
+      </w:tblGrid>
+      <w:tr>
+        <w:tc>
+          <w:tcPr>
+            <w:tcW w:type="dxa" w:w="9360"/>
+            <w:shd w:fill="F5F3FF"/>
+            <w:tcMar>
+              <w:top w:w="120" w:type="dxa"/>
+              <w:bottom w:w="120" w:type="dxa"/>
+              <w:left w:w="180" w:type="dxa"/>
+              <w:right w:w="180" w:type="dxa"/>
+            </w:tcMar>
+            <w:tcBorders>
+              <w:top w:val="none" w:sz="0" w:space="0" w:color="auto"/>
+              <w:left w:val="single" w:sz="24" w:space="0" w:color="7C3AED"/>
+              <w:bottom w:val="none" w:sz="0" w:space="0" w:color="auto"/>
+              <w:right w:val="none" w:sz="0" w:space="0" w:color="auto"/>
+            </w:tcBorders>
+          </w:tcPr>
+          <w:p>
+            <w:pPr>
+              <w:spacing w:before="40" w:after="40"/>
+            </w:pPr>
+            <w:r>
+              <w:rPr>
+                <w:rFonts w:ascii="Calibri" w:hAnsi="Calibri"/>
+                <w:b/>
+                <w:color w:val="5B21B6"/>
+                <w:sz w:val="20"/>
+              </w:rPr>
+              <w:t xml:space="preserve">BRANCHING RULE: </w:t>
+            </w:r>
+            <w:r>
+              <w:rPr>
+                <w:rFonts w:ascii="Calibri" w:hAnsi="Calibri"/>
+                <w:color w:val="1F2937"/>
+                <w:sz w:val="20"/>
+              </w:rPr>
+              <w:t>Branching Governance: Both 'world' and 'novel' branches develop independently against locked mock fixtures in the Communication Layer. Neither branch merges directly into the other; all features rebase and merge into 'main' upon passing automated contract validation tests.</w:t>
+            </w:r>
+          </w:p>
+        </w:tc>
+      </w:tr>
+    </w:tbl>
     <w:p>
       <w:r>
         <w:br w:type="page"/>

</xml_diff>

<commit_message>
feat(plan): add phased mvp implementation plan and dev test seeder spec
</commit_message>
<xml_diff>
--- a/Novwrite.docx
+++ b/Novwrite.docx
@@ -194,7 +194,7 @@
               <w:rPr>
                 <w:color w:val="111827"/>
               </w:rPr>
-              <w:t>Technical Architecture &amp; System Baseline Locked (v1.7 - Two-Front Branching &amp; Communication Gateway)</w:t>
+              <w:t>Technical Architecture &amp; System Baseline Locked (v1.8 - MVP Phased Plan &amp; One-Click Test Seeder)</w:t>
             </w:r>
           </w:p>
         </w:tc>
@@ -6161,6 +6161,14 @@
       </w:r>
     </w:p>
     <w:p>
+      <w:pPr>
+        <w:pStyle w:val="Heading2"/>
+      </w:pPr>
+      <w:r>
+        <w:t>7.1 Software Engineering Standards &amp; DevOps</w:t>
+      </w:r>
+    </w:p>
+    <w:p>
       <w:r>
         <w:rPr>
           <w:b/>
@@ -6211,6 +6219,701 @@
         <w:t>Docker Compose orchestrates PostgreSQL 18, Redis 7, and Traefik reverse proxy with automated TLS termination.</w:t>
       </w:r>
     </w:p>
+    <w:p>
+      <w:pPr>
+        <w:pStyle w:val="Heading2"/>
+      </w:pPr>
+      <w:r>
+        <w:t>7.2 MVP Phased Implementation Plan &amp; Development Test Seeder</w:t>
+      </w:r>
+    </w:p>
+    <w:p>
+      <w:r>
+        <w:t>To deliver a robust, functional MVP while adhering strictly to YAGNI principles (eliminating unnecessary pre-optimizations), development is structured into deliberate, independent phases across isolated branches:</w:t>
+      </w:r>
+    </w:p>
+    <w:tbl>
+      <w:tblPr>
+        <w:tblW w:type="auto" w:w="0"/>
+        <w:jc w:val="center"/>
+        <w:tblLook w:firstColumn="1" w:firstRow="1" w:lastColumn="0" w:lastRow="0" w:noHBand="0" w:noVBand="1" w:val="04A0"/>
+      </w:tblPr>
+      <w:tblGrid>
+        <w:gridCol w:w="2340"/>
+        <w:gridCol w:w="2340"/>
+        <w:gridCol w:w="2340"/>
+        <w:gridCol w:w="2340"/>
+      </w:tblGrid>
+      <w:tr>
+        <w:tc>
+          <w:tcPr>
+            <w:tcW w:type="dxa" w:w="1872"/>
+            <w:shd w:fill="7C3AED"/>
+            <w:tcMar>
+              <w:top w:w="100" w:type="dxa"/>
+              <w:bottom w:w="100" w:type="dxa"/>
+              <w:left w:w="120" w:type="dxa"/>
+              <w:right w:w="120" w:type="dxa"/>
+            </w:tcMar>
+          </w:tcPr>
+          <w:p>
+            <w:pPr>
+              <w:jc w:val="left"/>
+            </w:pPr>
+            <w:r>
+              <w:rPr>
+                <w:rFonts w:ascii="Calibri" w:hAnsi="Calibri"/>
+                <w:b/>
+                <w:color w:val="FFFFFF"/>
+                <w:sz w:val="19"/>
+              </w:rPr>
+              <w:t>Phase / Branch</w:t>
+            </w:r>
+          </w:p>
+        </w:tc>
+        <w:tc>
+          <w:tcPr>
+            <w:tcW w:type="dxa" w:w="2736"/>
+            <w:shd w:fill="7C3AED"/>
+            <w:tcMar>
+              <w:top w:w="100" w:type="dxa"/>
+              <w:bottom w:w="100" w:type="dxa"/>
+              <w:left w:w="120" w:type="dxa"/>
+              <w:right w:w="120" w:type="dxa"/>
+            </w:tcMar>
+          </w:tcPr>
+          <w:p>
+            <w:pPr>
+              <w:jc w:val="left"/>
+            </w:pPr>
+            <w:r>
+              <w:rPr>
+                <w:rFonts w:ascii="Calibri" w:hAnsi="Calibri"/>
+                <w:b/>
+                <w:color w:val="FFFFFF"/>
+                <w:sz w:val="19"/>
+              </w:rPr>
+              <w:t>Primary Deliverable</w:t>
+            </w:r>
+          </w:p>
+        </w:tc>
+        <w:tc>
+          <w:tcPr>
+            <w:tcW w:type="dxa" w:w="2448"/>
+            <w:shd w:fill="7C3AED"/>
+            <w:tcMar>
+              <w:top w:w="100" w:type="dxa"/>
+              <w:bottom w:w="100" w:type="dxa"/>
+              <w:left w:w="120" w:type="dxa"/>
+              <w:right w:w="120" w:type="dxa"/>
+            </w:tcMar>
+          </w:tcPr>
+          <w:p>
+            <w:pPr>
+              <w:jc w:val="left"/>
+            </w:pPr>
+            <w:r>
+              <w:rPr>
+                <w:rFonts w:ascii="Calibri" w:hAnsi="Calibri"/>
+                <w:b/>
+                <w:color w:val="FFFFFF"/>
+                <w:sz w:val="19"/>
+              </w:rPr>
+              <w:t>Block Standard ID</w:t>
+            </w:r>
+          </w:p>
+        </w:tc>
+        <w:tc>
+          <w:tcPr>
+            <w:tcW w:type="dxa" w:w="2304"/>
+            <w:shd w:fill="7C3AED"/>
+            <w:tcMar>
+              <w:top w:w="100" w:type="dxa"/>
+              <w:bottom w:w="100" w:type="dxa"/>
+              <w:left w:w="120" w:type="dxa"/>
+              <w:right w:w="120" w:type="dxa"/>
+            </w:tcMar>
+          </w:tcPr>
+          <w:p>
+            <w:pPr>
+              <w:jc w:val="left"/>
+            </w:pPr>
+            <w:r>
+              <w:rPr>
+                <w:rFonts w:ascii="Calibri" w:hAnsi="Calibri"/>
+                <w:b/>
+                <w:color w:val="FFFFFF"/>
+                <w:sz w:val="19"/>
+              </w:rPr>
+              <w:t>Key Validation Criteria</w:t>
+            </w:r>
+          </w:p>
+        </w:tc>
+      </w:tr>
+      <w:tr>
+        <w:tc>
+          <w:tcPr>
+            <w:tcW w:type="dxa" w:w="1872"/>
+            <w:shd w:fill="FFFFFF"/>
+            <w:tcMar>
+              <w:top w:w="80" w:type="dxa"/>
+              <w:bottom w:w="80" w:type="dxa"/>
+              <w:left w:w="120" w:type="dxa"/>
+              <w:right w:w="120" w:type="dxa"/>
+            </w:tcMar>
+          </w:tcPr>
+          <w:p>
+            <w:pPr>
+              <w:jc w:val="left"/>
+            </w:pPr>
+            <w:r>
+              <w:rPr>
+                <w:rFonts w:ascii="Calibri" w:hAnsi="Calibri"/>
+                <w:color w:val="1F2937"/>
+                <w:sz w:val="18"/>
+              </w:rPr>
+              <w:t>Phase 0 (main)</w:t>
+            </w:r>
+          </w:p>
+        </w:tc>
+        <w:tc>
+          <w:tcPr>
+            <w:tcW w:type="dxa" w:w="2736"/>
+            <w:shd w:fill="FFFFFF"/>
+            <w:tcMar>
+              <w:top w:w="80" w:type="dxa"/>
+              <w:bottom w:w="80" w:type="dxa"/>
+              <w:left w:w="120" w:type="dxa"/>
+              <w:right w:w="120" w:type="dxa"/>
+            </w:tcMar>
+          </w:tcPr>
+          <w:p>
+            <w:pPr>
+              <w:jc w:val="left"/>
+            </w:pPr>
+            <w:r>
+              <w:rPr>
+                <w:rFonts w:ascii="Calibri" w:hAnsi="Calibri"/>
+                <w:color w:val="1F2937"/>
+                <w:sz w:val="18"/>
+              </w:rPr>
+              <w:t>Core Monorepo, DB Migrations &amp; @novwrite/bridge</w:t>
+            </w:r>
+          </w:p>
+        </w:tc>
+        <w:tc>
+          <w:tcPr>
+            <w:tcW w:type="dxa" w:w="2448"/>
+            <w:shd w:fill="FFFFFF"/>
+            <w:tcMar>
+              <w:top w:w="80" w:type="dxa"/>
+              <w:bottom w:w="80" w:type="dxa"/>
+              <w:left w:w="120" w:type="dxa"/>
+              <w:right w:w="120" w:type="dxa"/>
+            </w:tcMar>
+          </w:tcPr>
+          <w:p>
+            <w:pPr>
+              <w:jc w:val="left"/>
+            </w:pPr>
+            <w:r>
+              <w:rPr>
+                <w:rFonts w:ascii="Calibri" w:hAnsi="Calibri"/>
+                <w:color w:val="1F2937"/>
+                <w:sz w:val="18"/>
+              </w:rPr>
+              <w:t>BLOCK_CORE_INFRA_INIT_001</w:t>
+            </w:r>
+          </w:p>
+        </w:tc>
+        <w:tc>
+          <w:tcPr>
+            <w:tcW w:type="dxa" w:w="2304"/>
+            <w:shd w:fill="FFFFFF"/>
+            <w:tcMar>
+              <w:top w:w="80" w:type="dxa"/>
+              <w:bottom w:w="80" w:type="dxa"/>
+              <w:left w:w="120" w:type="dxa"/>
+              <w:right w:w="120" w:type="dxa"/>
+            </w:tcMar>
+          </w:tcPr>
+          <w:p>
+            <w:pPr>
+              <w:jc w:val="left"/>
+            </w:pPr>
+            <w:r>
+              <w:rPr>
+                <w:rFonts w:ascii="Calibri" w:hAnsi="Calibri"/>
+                <w:color w:val="1F2937"/>
+                <w:sz w:val="18"/>
+              </w:rPr>
+              <w:t>Clean Prisma migration &amp; Mock Bridge passing unit tests</w:t>
+            </w:r>
+          </w:p>
+        </w:tc>
+      </w:tr>
+      <w:tr>
+        <w:tc>
+          <w:tcPr>
+            <w:tcW w:type="dxa" w:w="1872"/>
+            <w:shd w:fill="F9FAFB"/>
+            <w:tcMar>
+              <w:top w:w="80" w:type="dxa"/>
+              <w:bottom w:w="80" w:type="dxa"/>
+              <w:left w:w="120" w:type="dxa"/>
+              <w:right w:w="120" w:type="dxa"/>
+            </w:tcMar>
+          </w:tcPr>
+          <w:p>
+            <w:pPr>
+              <w:jc w:val="left"/>
+            </w:pPr>
+            <w:r>
+              <w:rPr>
+                <w:rFonts w:ascii="Calibri" w:hAnsi="Calibri"/>
+                <w:color w:val="1F2937"/>
+                <w:sz w:val="18"/>
+              </w:rPr>
+              <w:t>Phase 0.4 (main)</w:t>
+            </w:r>
+          </w:p>
+        </w:tc>
+        <w:tc>
+          <w:tcPr>
+            <w:tcW w:type="dxa" w:w="2736"/>
+            <w:shd w:fill="F9FAFB"/>
+            <w:tcMar>
+              <w:top w:w="80" w:type="dxa"/>
+              <w:bottom w:w="80" w:type="dxa"/>
+              <w:left w:w="120" w:type="dxa"/>
+              <w:right w:w="120" w:type="dxa"/>
+            </w:tcMar>
+          </w:tcPr>
+          <w:p>
+            <w:pPr>
+              <w:jc w:val="left"/>
+            </w:pPr>
+            <w:r>
+              <w:rPr>
+                <w:rFonts w:ascii="Calibri" w:hAnsi="Calibri"/>
+                <w:color w:val="1F2937"/>
+                <w:sz w:val="18"/>
+              </w:rPr>
+              <w:t>Development-Only One-Click Test Seeder</w:t>
+            </w:r>
+          </w:p>
+        </w:tc>
+        <w:tc>
+          <w:tcPr>
+            <w:tcW w:type="dxa" w:w="2448"/>
+            <w:shd w:fill="F9FAFB"/>
+            <w:tcMar>
+              <w:top w:w="80" w:type="dxa"/>
+              <w:bottom w:w="80" w:type="dxa"/>
+              <w:left w:w="120" w:type="dxa"/>
+              <w:right w:w="120" w:type="dxa"/>
+            </w:tcMar>
+          </w:tcPr>
+          <w:p>
+            <w:pPr>
+              <w:jc w:val="left"/>
+            </w:pPr>
+            <w:r>
+              <w:rPr>
+                <w:rFonts w:ascii="Calibri" w:hAnsi="Calibri"/>
+                <w:color w:val="1F2937"/>
+                <w:sz w:val="18"/>
+              </w:rPr>
+              <w:t>BLOCK_DEV_SEEDER_ENGINE_001</w:t>
+            </w:r>
+          </w:p>
+        </w:tc>
+        <w:tc>
+          <w:tcPr>
+            <w:tcW w:type="dxa" w:w="2304"/>
+            <w:shd w:fill="F9FAFB"/>
+            <w:tcMar>
+              <w:top w:w="80" w:type="dxa"/>
+              <w:bottom w:w="80" w:type="dxa"/>
+              <w:left w:w="120" w:type="dxa"/>
+              <w:right w:w="120" w:type="dxa"/>
+            </w:tcMar>
+          </w:tcPr>
+          <w:p>
+            <w:pPr>
+              <w:jc w:val="left"/>
+            </w:pPr>
+            <w:r>
+              <w:rPr>
+                <w:rFonts w:ascii="Calibri" w:hAnsi="Calibri"/>
+                <w:color w:val="1F2937"/>
+                <w:sz w:val="18"/>
+              </w:rPr>
+              <w:t>POST /api/v1/dev/seed populates 'Chronicles of Aethelgard' in &lt;500ms</w:t>
+            </w:r>
+          </w:p>
+        </w:tc>
+      </w:tr>
+      <w:tr>
+        <w:tc>
+          <w:tcPr>
+            <w:tcW w:type="dxa" w:w="1872"/>
+            <w:shd w:fill="FFFFFF"/>
+            <w:tcMar>
+              <w:top w:w="80" w:type="dxa"/>
+              <w:bottom w:w="80" w:type="dxa"/>
+              <w:left w:w="120" w:type="dxa"/>
+              <w:right w:w="120" w:type="dxa"/>
+            </w:tcMar>
+          </w:tcPr>
+          <w:p>
+            <w:pPr>
+              <w:jc w:val="left"/>
+            </w:pPr>
+            <w:r>
+              <w:rPr>
+                <w:rFonts w:ascii="Calibri" w:hAnsi="Calibri"/>
+                <w:color w:val="1F2937"/>
+                <w:sz w:val="18"/>
+              </w:rPr>
+              <w:t>Phase W (world)</w:t>
+            </w:r>
+          </w:p>
+        </w:tc>
+        <w:tc>
+          <w:tcPr>
+            <w:tcW w:type="dxa" w:w="2736"/>
+            <w:shd w:fill="FFFFFF"/>
+            <w:tcMar>
+              <w:top w:w="80" w:type="dxa"/>
+              <w:bottom w:w="80" w:type="dxa"/>
+              <w:left w:w="120" w:type="dxa"/>
+              <w:right w:w="120" w:type="dxa"/>
+            </w:tcMar>
+          </w:tcPr>
+          <w:p>
+            <w:pPr>
+              <w:jc w:val="left"/>
+            </w:pPr>
+            <w:r>
+              <w:rPr>
+                <w:rFonts w:ascii="Calibri" w:hAnsi="Calibri"/>
+                <w:color w:val="1F2937"/>
+                <w:sz w:val="18"/>
+              </w:rPr>
+              <w:t>Dynamic Schemas, Timeline &amp; State Fold Engine</w:t>
+            </w:r>
+          </w:p>
+        </w:tc>
+        <w:tc>
+          <w:tcPr>
+            <w:tcW w:type="dxa" w:w="2448"/>
+            <w:shd w:fill="FFFFFF"/>
+            <w:tcMar>
+              <w:top w:w="80" w:type="dxa"/>
+              <w:bottom w:w="80" w:type="dxa"/>
+              <w:left w:w="120" w:type="dxa"/>
+              <w:right w:w="120" w:type="dxa"/>
+            </w:tcMar>
+          </w:tcPr>
+          <w:p>
+            <w:pPr>
+              <w:jc w:val="left"/>
+            </w:pPr>
+            <w:r>
+              <w:rPr>
+                <w:rFonts w:ascii="Calibri" w:hAnsi="Calibri"/>
+                <w:color w:val="1F2937"/>
+                <w:sz w:val="18"/>
+              </w:rPr>
+              <w:t>BLOCK_WORLD_STATE_FOLD_001</w:t>
+            </w:r>
+          </w:p>
+        </w:tc>
+        <w:tc>
+          <w:tcPr>
+            <w:tcW w:type="dxa" w:w="2304"/>
+            <w:shd w:fill="FFFFFF"/>
+            <w:tcMar>
+              <w:top w:w="80" w:type="dxa"/>
+              <w:bottom w:w="80" w:type="dxa"/>
+              <w:left w:w="120" w:type="dxa"/>
+              <w:right w:w="120" w:type="dxa"/>
+            </w:tcMar>
+          </w:tcPr>
+          <w:p>
+            <w:pPr>
+              <w:jc w:val="left"/>
+            </w:pPr>
+            <w:r>
+              <w:rPr>
+                <w:rFonts w:ascii="Calibri" w:hAnsi="Calibri"/>
+                <w:color w:val="1F2937"/>
+                <w:sz w:val="18"/>
+              </w:rPr>
+              <w:t>4-step fold loop detects intentional test violation with RFC 7807 payload</w:t>
+            </w:r>
+          </w:p>
+        </w:tc>
+      </w:tr>
+      <w:tr>
+        <w:tc>
+          <w:tcPr>
+            <w:tcW w:type="dxa" w:w="1872"/>
+            <w:shd w:fill="F9FAFB"/>
+            <w:tcMar>
+              <w:top w:w="80" w:type="dxa"/>
+              <w:bottom w:w="80" w:type="dxa"/>
+              <w:left w:w="120" w:type="dxa"/>
+              <w:right w:w="120" w:type="dxa"/>
+            </w:tcMar>
+          </w:tcPr>
+          <w:p>
+            <w:pPr>
+              <w:jc w:val="left"/>
+            </w:pPr>
+            <w:r>
+              <w:rPr>
+                <w:rFonts w:ascii="Calibri" w:hAnsi="Calibri"/>
+                <w:color w:val="1F2937"/>
+                <w:sz w:val="18"/>
+              </w:rPr>
+              <w:t>Phase N (novel)</w:t>
+            </w:r>
+          </w:p>
+        </w:tc>
+        <w:tc>
+          <w:tcPr>
+            <w:tcW w:type="dxa" w:w="2736"/>
+            <w:shd w:fill="F9FAFB"/>
+            <w:tcMar>
+              <w:top w:w="80" w:type="dxa"/>
+              <w:bottom w:w="80" w:type="dxa"/>
+              <w:left w:w="120" w:type="dxa"/>
+              <w:right w:w="120" w:type="dxa"/>
+            </w:tcMar>
+          </w:tcPr>
+          <w:p>
+            <w:pPr>
+              <w:jc w:val="left"/>
+            </w:pPr>
+            <w:r>
+              <w:rPr>
+                <w:rFonts w:ascii="Calibri" w:hAnsi="Calibri"/>
+                <w:color w:val="1F2937"/>
+                <w:sz w:val="18"/>
+              </w:rPr>
+              <w:t>Prose Studio, TipTap Editor &amp; Heartbeat Leases</w:t>
+            </w:r>
+          </w:p>
+        </w:tc>
+        <w:tc>
+          <w:tcPr>
+            <w:tcW w:type="dxa" w:w="2448"/>
+            <w:shd w:fill="F9FAFB"/>
+            <w:tcMar>
+              <w:top w:w="80" w:type="dxa"/>
+              <w:bottom w:w="80" w:type="dxa"/>
+              <w:left w:w="120" w:type="dxa"/>
+              <w:right w:w="120" w:type="dxa"/>
+            </w:tcMar>
+          </w:tcPr>
+          <w:p>
+            <w:pPr>
+              <w:jc w:val="left"/>
+            </w:pPr>
+            <w:r>
+              <w:rPr>
+                <w:rFonts w:ascii="Calibri" w:hAnsi="Calibri"/>
+                <w:color w:val="1F2937"/>
+                <w:sz w:val="18"/>
+              </w:rPr>
+              <w:t>BLOCK_NOVEL_SCENE_LEASE_001</w:t>
+            </w:r>
+          </w:p>
+        </w:tc>
+        <w:tc>
+          <w:tcPr>
+            <w:tcW w:type="dxa" w:w="2304"/>
+            <w:shd w:fill="F9FAFB"/>
+            <w:tcMar>
+              <w:top w:w="80" w:type="dxa"/>
+              <w:bottom w:w="80" w:type="dxa"/>
+              <w:left w:w="120" w:type="dxa"/>
+              <w:right w:w="120" w:type="dxa"/>
+            </w:tcMar>
+          </w:tcPr>
+          <w:p>
+            <w:pPr>
+              <w:jc w:val="left"/>
+            </w:pPr>
+            <w:r>
+              <w:rPr>
+                <w:rFonts w:ascii="Calibri" w:hAnsi="Calibri"/>
+                <w:color w:val="1F2937"/>
+                <w:sz w:val="18"/>
+              </w:rPr>
+              <w:t>Scene lease lock &amp; real-time continuity HUD pill rendered</w:t>
+            </w:r>
+          </w:p>
+        </w:tc>
+      </w:tr>
+      <w:tr>
+        <w:tc>
+          <w:tcPr>
+            <w:tcW w:type="dxa" w:w="1872"/>
+            <w:shd w:fill="FFFFFF"/>
+            <w:tcMar>
+              <w:top w:w="80" w:type="dxa"/>
+              <w:bottom w:w="80" w:type="dxa"/>
+              <w:left w:w="120" w:type="dxa"/>
+              <w:right w:w="120" w:type="dxa"/>
+            </w:tcMar>
+          </w:tcPr>
+          <w:p>
+            <w:pPr>
+              <w:jc w:val="left"/>
+            </w:pPr>
+            <w:r>
+              <w:rPr>
+                <w:rFonts w:ascii="Calibri" w:hAnsi="Calibri"/>
+                <w:color w:val="1F2937"/>
+                <w:sz w:val="18"/>
+              </w:rPr>
+              <w:t>Phase I (main)</w:t>
+            </w:r>
+          </w:p>
+        </w:tc>
+        <w:tc>
+          <w:tcPr>
+            <w:tcW w:type="dxa" w:w="2736"/>
+            <w:shd w:fill="FFFFFF"/>
+            <w:tcMar>
+              <w:top w:w="80" w:type="dxa"/>
+              <w:bottom w:w="80" w:type="dxa"/>
+              <w:left w:w="120" w:type="dxa"/>
+              <w:right w:w="120" w:type="dxa"/>
+            </w:tcMar>
+          </w:tcPr>
+          <w:p>
+            <w:pPr>
+              <w:jc w:val="left"/>
+            </w:pPr>
+            <w:r>
+              <w:rPr>
+                <w:rFonts w:ascii="Calibri" w:hAnsi="Calibri"/>
+                <w:color w:val="1F2937"/>
+                <w:sz w:val="18"/>
+              </w:rPr>
+              <w:t>Cross-Domain Integration &amp; End-to-End Demo</w:t>
+            </w:r>
+          </w:p>
+        </w:tc>
+        <w:tc>
+          <w:tcPr>
+            <w:tcW w:type="dxa" w:w="2448"/>
+            <w:shd w:fill="FFFFFF"/>
+            <w:tcMar>
+              <w:top w:w="80" w:type="dxa"/>
+              <w:bottom w:w="80" w:type="dxa"/>
+              <w:left w:w="120" w:type="dxa"/>
+              <w:right w:w="120" w:type="dxa"/>
+            </w:tcMar>
+          </w:tcPr>
+          <w:p>
+            <w:pPr>
+              <w:jc w:val="left"/>
+            </w:pPr>
+            <w:r>
+              <w:rPr>
+                <w:rFonts w:ascii="Calibri" w:hAnsi="Calibri"/>
+                <w:color w:val="1F2937"/>
+                <w:sz w:val="18"/>
+              </w:rPr>
+              <w:t>BLOCK_INTEGRATION_DEMO_001</w:t>
+            </w:r>
+          </w:p>
+        </w:tc>
+        <w:tc>
+          <w:tcPr>
+            <w:tcW w:type="dxa" w:w="2304"/>
+            <w:shd w:fill="FFFFFF"/>
+            <w:tcMar>
+              <w:top w:w="80" w:type="dxa"/>
+              <w:bottom w:w="80" w:type="dxa"/>
+              <w:left w:w="120" w:type="dxa"/>
+              <w:right w:w="120" w:type="dxa"/>
+            </w:tcMar>
+          </w:tcPr>
+          <w:p>
+            <w:pPr>
+              <w:jc w:val="left"/>
+            </w:pPr>
+            <w:r>
+              <w:rPr>
+                <w:rFonts w:ascii="Calibri" w:hAnsi="Calibri"/>
+                <w:color w:val="1F2937"/>
+                <w:sz w:val="18"/>
+              </w:rPr>
+              <w:t>One-click seeder -&gt; contradiction detection -&gt; Lead Author override flow verified</w:t>
+            </w:r>
+          </w:p>
+        </w:tc>
+      </w:tr>
+    </w:tbl>
+    <w:tbl>
+      <w:tblPr>
+        <w:tblW w:type="auto" w:w="0"/>
+        <w:jc w:val="center"/>
+        <w:tblLayout w:type="fixed"/>
+        <w:tblLook w:firstColumn="1" w:firstRow="1" w:lastColumn="0" w:lastRow="0" w:noHBand="0" w:noVBand="1" w:val="04A0"/>
+      </w:tblPr>
+      <w:tblGrid>
+        <w:gridCol w:w="9360"/>
+      </w:tblGrid>
+      <w:tr>
+        <w:tc>
+          <w:tcPr>
+            <w:tcW w:type="dxa" w:w="9360"/>
+            <w:shd w:fill="F5F3FF"/>
+            <w:tcMar>
+              <w:top w:w="120" w:type="dxa"/>
+              <w:bottom w:w="120" w:type="dxa"/>
+              <w:left w:w="180" w:type="dxa"/>
+              <w:right w:w="180" w:type="dxa"/>
+            </w:tcMar>
+            <w:tcBorders>
+              <w:top w:val="none" w:sz="0" w:space="0" w:color="auto"/>
+              <w:left w:val="single" w:sz="24" w:space="0" w:color="7C3AED"/>
+              <w:bottom w:val="none" w:sz="0" w:space="0" w:color="auto"/>
+              <w:right w:val="none" w:sz="0" w:space="0" w:color="auto"/>
+            </w:tcBorders>
+          </w:tcPr>
+          <w:p>
+            <w:pPr>
+              <w:spacing w:before="40" w:after="40"/>
+            </w:pPr>
+            <w:r>
+              <w:rPr>
+                <w:rFonts w:ascii="Calibri" w:hAnsi="Calibri"/>
+                <w:b/>
+                <w:color w:val="5B21B6"/>
+                <w:sz w:val="20"/>
+              </w:rPr>
+              <w:t xml:space="preserve">DEV EXPERIENCE: </w:t>
+            </w:r>
+            <w:r>
+              <w:rPr>
+                <w:rFonts w:ascii="Calibri" w:hAnsi="Calibri"/>
+                <w:color w:val="1F2937"/>
+                <w:sz w:val="20"/>
+              </w:rPr>
+              <w:t>Development-Only Test Data One-Click Filler: To eliminate manual testing overhead, a dedicated development seeder provisions an interconnected fantasy universe ('Chronicles of Aethelgard') containing 3 characters, 2 locations, 5 historical timeline events, 2 invariant rules, 3 manuscript scenes, and deliberate rule violations for instant end-to-end verification.</w:t>
+            </w:r>
+          </w:p>
+        </w:tc>
+      </w:tr>
+    </w:tbl>
     <w:p>
       <w:pPr>
         <w:pStyle w:val="Heading1"/>

</xml_diff>

<commit_message>
feat(ui): add ui-ux quality standards, badge discipline, select standard, and ai anti-pattern rules
</commit_message>
<xml_diff>
--- a/Novwrite.docx
+++ b/Novwrite.docx
@@ -194,7 +194,7 @@
               <w:rPr>
                 <w:color w:val="111827"/>
               </w:rPr>
-              <w:t>Technical Architecture &amp; System Baseline Locked (v1.8 - MVP Phased Plan &amp; One-Click Test Seeder)</w:t>
+              <w:t>Technical Architecture &amp; System Baseline Locked (v1.9 - UI/UX Quality Standards &amp; AI Anti-Patterns)</w:t>
             </w:r>
           </w:p>
         </w:tc>
@@ -5089,6 +5089,113 @@
       </w:tr>
     </w:tbl>
     <w:p>
+      <w:pPr>
+        <w:pStyle w:val="Heading2"/>
+      </w:pPr>
+      <w:r>
+        <w:t>5.3 UI/UX Standards, Visual Noise Constraints &amp; AI Anti-Pattern Prevention</w:t>
+      </w:r>
+    </w:p>
+    <w:p>
+      <w:r>
+        <w:t>To deliver a focused, professional authoring environment inspired by MongoDB Compass and Linear, NovWrite enforces strict visual constraints and UI anti-pattern prevention:</w:t>
+      </w:r>
+    </w:p>
+    <w:p>
+      <w:r>
+        <w:rPr>
+          <w:b/>
+        </w:rPr>
+        <w:t xml:space="preserve">1. Prohibition of Excessive Gradients: </w:t>
+      </w:r>
+      <w:r>
+        <w:t>Avoid multi-color marketing gradients, glassmorphism, and neon glow effects. Use solid, grounded surfaces (zinc-900 / slate-900) with crisp 1px borders.</w:t>
+        <w:br/>
+      </w:r>
+      <w:r>
+        <w:rPr>
+          <w:b/>
+        </w:rPr>
+        <w:t xml:space="preserve">2. Strict Badge Discipline: </w:t>
+      </w:r>
+      <w:r>
+        <w:t>Badges are restricted primarily to Data Tables (e.g. status columns, enum indicators) and compact header status pills. Badges must not clutter body text, cards, or form labels.</w:t>
+        <w:br/>
+      </w:r>
+      <w:r>
+        <w:rPr>
+          <w:b/>
+        </w:rPr>
+        <w:t xml:space="preserve">3. Dropdown Component Standard: </w:t>
+      </w:r>
+      <w:r>
+        <w:t>All dropdown selection menus must use the accessible Select primitive from shadcn-svelte ($lib/components/ui/select) or @rn-primitives on mobile, never native unstyled &lt;select&gt; tags.</w:t>
+        <w:br/>
+      </w:r>
+      <w:r>
+        <w:rPr>
+          <w:b/>
+        </w:rPr>
+        <w:t xml:space="preserve">4. Prevention of AI UI Anti-Patterns: </w:t>
+      </w:r>
+      <w:r>
+        <w:t>Eliminate 'Card Sprawl' (group into master-detail tables instead of wrapping every label in a card), prevent nested modals, provide designed empty/loading skeleton states, and ensure full keyboard navigation (Esc, Tab, arrow keys).</w:t>
+      </w:r>
+    </w:p>
+    <w:tbl>
+      <w:tblPr>
+        <w:tblW w:type="auto" w:w="0"/>
+        <w:jc w:val="center"/>
+        <w:tblLayout w:type="fixed"/>
+        <w:tblLook w:firstColumn="1" w:firstRow="1" w:lastColumn="0" w:lastRow="0" w:noHBand="0" w:noVBand="1" w:val="04A0"/>
+      </w:tblPr>
+      <w:tblGrid>
+        <w:gridCol w:w="9360"/>
+      </w:tblGrid>
+      <w:tr>
+        <w:tc>
+          <w:tcPr>
+            <w:tcW w:type="dxa" w:w="9360"/>
+            <w:shd w:fill="F5F3FF"/>
+            <w:tcMar>
+              <w:top w:w="120" w:type="dxa"/>
+              <w:bottom w:w="120" w:type="dxa"/>
+              <w:left w:w="180" w:type="dxa"/>
+              <w:right w:w="180" w:type="dxa"/>
+            </w:tcMar>
+            <w:tcBorders>
+              <w:top w:val="none" w:sz="0" w:space="0" w:color="auto"/>
+              <w:left w:val="single" w:sz="24" w:space="0" w:color="7C3AED"/>
+              <w:bottom w:val="none" w:sz="0" w:space="0" w:color="auto"/>
+              <w:right w:val="none" w:sz="0" w:space="0" w:color="auto"/>
+            </w:tcBorders>
+          </w:tcPr>
+          <w:p>
+            <w:pPr>
+              <w:spacing w:before="40" w:after="40"/>
+            </w:pPr>
+            <w:r>
+              <w:rPr>
+                <w:rFonts w:ascii="Calibri" w:hAnsi="Calibri"/>
+                <w:b/>
+                <w:color w:val="5B21B6"/>
+                <w:sz w:val="20"/>
+              </w:rPr>
+              <w:t xml:space="preserve">DESIGN DISCIPLINE: </w:t>
+            </w:r>
+            <w:r>
+              <w:rPr>
+                <w:rFonts w:ascii="Calibri" w:hAnsi="Calibri"/>
+                <w:color w:val="1F2937"/>
+                <w:sz w:val="20"/>
+              </w:rPr>
+              <w:t>UI Quality Standard: All agents and engineers must audit components against the UI/UX checklist before committing code. Every view must provide designed empty states with actionable primary buttons and maintain WCAG AA 4.5:1 text contrast ratios.</w:t>
+            </w:r>
+          </w:p>
+        </w:tc>
+      </w:tr>
+    </w:tbl>
+    <w:p>
       <w:r>
         <w:br w:type="page"/>
       </w:r>

</xml_diff>

<commit_message>
docs(spec): update system specifications, rules, and capstone report to version 2.0
</commit_message>
<xml_diff>
--- a/Novwrite.docx
+++ b/Novwrite.docx
@@ -194,7 +194,7 @@
               <w:rPr>
                 <w:color w:val="111827"/>
               </w:rPr>
-              <w:t>Technical Architecture &amp; System Baseline Locked (v1.9 - UI/UX Quality Standards &amp; AI Anti-Patterns)</w:t>
+              <w:t>Technical Architecture Baseline (v2.0 - Custom Blueprints, Formulas, Dedicated Routing &amp; Zero-Badge Standards)</w:t>
             </w:r>
           </w:p>
         </w:tc>
@@ -5093,12 +5093,12 @@
         <w:pStyle w:val="Heading2"/>
       </w:pPr>
       <w:r>
-        <w:t>5.3 UI/UX Standards, Visual Noise Constraints &amp; AI Anti-Pattern Prevention</w:t>
+        <w:t>5.3 UI/UX Standards, Zero-Badge Policy &amp; Dedicated Page Routes</w:t>
       </w:r>
     </w:p>
     <w:p>
       <w:r>
-        <w:t>To deliver a focused, professional authoring environment inspired by MongoDB Compass and Linear, NovWrite enforces strict visual constraints and UI anti-pattern prevention:</w:t>
+        <w:t>To deliver a focused, professional authoring environment inspired by MongoDB Compass and Linear, NovWrite enforces strict visual constraints, dedicated page routing, and UI anti-pattern prevention:</w:t>
       </w:r>
     </w:p>
     <w:p>
@@ -5116,17 +5116,27 @@
         <w:rPr>
           <w:b/>
         </w:rPr>
-        <w:t xml:space="preserve">2. Strict Badge Discipline: </w:t>
+        <w:t xml:space="preserve">2. Zero-Badge Policy Across the UI: </w:t>
       </w:r>
       <w:r>
-        <w:t>Badges are restricted primarily to Data Tables (e.g. status columns, enum indicators) and compact header status pills. Badges must not clutter body text, cards, or form labels.</w:t>
+        <w:t>Badges, pill tags, and colored chip boxes are strictly prohibited across the frontend. Statuses and attributes are communicated via semantic icons with text dots, action buttons, accessible breadcrumbs, and slide-over side drawers.</w:t>
         <w:br/>
       </w:r>
       <w:r>
         <w:rPr>
           <w:b/>
         </w:rPr>
-        <w:t xml:space="preserve">3. Dropdown Component Standard: </w:t>
+        <w:t xml:space="preserve">3. Dedicated 3-Tier Page-Based Routing: </w:t>
+      </w:r>
+      <w:r>
+        <w:t>Every core domain (Entities, Blueprints/Schemas, Sub-Systems) is partitioned into a dedicated 3-tier route architecture: Default List view (/), Create view (/create), and Update/Inspector view (/[id]). Complex forms and formula editors are never crammed into popups or single-page tabs.</w:t>
+        <w:br/>
+      </w:r>
+      <w:r>
+        <w:rPr>
+          <w:b/>
+        </w:rPr>
+        <w:t xml:space="preserve">4. Dropdown Component Standard: </w:t>
       </w:r>
       <w:r>
         <w:t>All dropdown selection menus must use the accessible Select primitive from shadcn-svelte ($lib/components/ui/select) or @rn-primitives on mobile, never native unstyled &lt;select&gt; tags.</w:t>
@@ -5136,10 +5146,64 @@
         <w:rPr>
           <w:b/>
         </w:rPr>
-        <w:t xml:space="preserve">4. Prevention of AI UI Anti-Patterns: </w:t>
+        <w:t xml:space="preserve">5. Isolation of Internal Communication Bridge: </w:t>
       </w:r>
       <w:r>
-        <w:t>Eliminate 'Card Sprawl' (group into master-detail tables instead of wrapping every label in a card), prevent nested modals, provide designed empty/loading skeleton states, and ensure full keyboard navigation (Esc, Tab, arrow keys).</w:t>
+        <w:t>The @novwrite/bridge transport and diagnostic message hubs belong to backend machinery and are restricted to isolated developer tooling (/dev/communication-hub), keeping authoring navigation clean.</w:t>
+      </w:r>
+    </w:p>
+    <w:p>
+      <w:pPr>
+        <w:pStyle w:val="Heading2"/>
+      </w:pPr>
+      <w:r>
+        <w:t>5.4 First &amp; Second Class Blueprints with Sandboxed Mathematical Formulas</w:t>
+      </w:r>
+    </w:p>
+    <w:p>
+      <w:r>
+        <w:t>NovWrite empowers authors with complete creative freedom to construct custom universe rules, dynamic identities, and mathematical formulas from scratch:</w:t>
+      </w:r>
+    </w:p>
+    <w:p>
+      <w:r>
+        <w:rPr>
+          <w:b/>
+        </w:rPr>
+        <w:t xml:space="preserve">• First-Class Blueprints (Primary Entity Archetypes): </w:t>
+      </w:r>
+      <w:r>
+        <w:t>Instantiate tangible entities in the universe timeline (e.g. Cultivator Characters, Sacred Relics, Realms, Factions) with unique IDs, state snapshots, and mutation history.</w:t>
+        <w:br/>
+      </w:r>
+      <w:r>
+        <w:rPr>
+          <w:b/>
+        </w:rPr>
+        <w:t xml:space="preserve">• Second-Class Blueprints (Sub-Blueprints &amp; Value Objects): </w:t>
+      </w:r>
+      <w:r>
+        <w:t>Reusable embedded data structures and continuous scale gauges (e.g. Romantic Affection Scale, Cultivation Rank &amp; Mastery, Power Matrices) referenced as dynamic fields in 1st-Class blueprints.</w:t>
+        <w:br/>
+      </w:r>
+      <w:r>
+        <w:rPr>
+          <w:b/>
+        </w:rPr>
+        <w:t xml:space="preserve">• Dynamic Enum Categories: </w:t>
+      </w:r>
+      <w:r>
+        <w:t>Authors can define and manage dynamic option tags on enum fields (e.g., gender with ['Male', 'Female', 'Dual-Yin-Yang', 'Celestial']).</w:t>
+        <w:br/>
+      </w:r>
+      <w:r>
+        <w:rPr>
+          <w:b/>
+        </w:rPr>
+        <w:t xml:space="preserve">• Sandboxed Mathematical &amp; Logical Formula Engine (formulaEngine.ts): </w:t>
+      </w:r>
+      <w:r>
+        <w:t>A safe AST expression parser that evaluates complex mathematical formulas for computed properties (e.g. Total Combat Power = (cultivation.major_realm * cultivation.minor_realm) * special_Physique + attack * attack_technique_Mastery - defence * defence_technique_mastery) in real time as component fields are modified.</w:t>
       </w:r>
     </w:p>
     <w:tbl>
@@ -5181,7 +5245,7 @@
                 <w:color w:val="5B21B6"/>
                 <w:sz w:val="20"/>
               </w:rPr>
-              <w:t xml:space="preserve">DESIGN DISCIPLINE: </w:t>
+              <w:t xml:space="preserve">CORE CAPABILITY: </w:t>
             </w:r>
             <w:r>
               <w:rPr>
@@ -5189,7 +5253,7 @@
                 <w:color w:val="1F2937"/>
                 <w:sz w:val="20"/>
               </w:rPr>
-              <w:t>UI Quality Standard: All agents and engineers must audit components against the UI/UX checklist before committing code. Every view must provide designed empty states with actionable primary buttons and maintain WCAG AA 4.5:1 text contrast ratios.</w:t>
+              <w:t>Blueprint &amp; Formula Freedom: Authors define custom mathematical formulas, multi-tier power ladders, and relationship scales with zero hardcoded constraints. Formulas evaluate in real-time within live test sandboxes and entity creation/update forms with 100% test verification.</w:t>
             </w:r>
           </w:p>
         </w:tc>

</xml_diff>

<commit_message>
docs: update system specifications, rules, and capstone report to version 2.0
</commit_message>
<xml_diff>
--- a/Novwrite.docx
+++ b/Novwrite.docx
@@ -194,7 +194,7 @@
               <w:rPr>
                 <w:color w:val="111827"/>
               </w:rPr>
-              <w:t>Technical Architecture &amp; System Baseline Locked (v1.9 - UI/UX Quality Standards &amp; AI Anti-Patterns)</w:t>
+              <w:t>Technical Architecture Baseline (v2.0 - Custom Blueprints, Formulas, Dedicated Routing &amp; Zero-Badge Standards)</w:t>
             </w:r>
           </w:p>
         </w:tc>
@@ -5093,12 +5093,12 @@
         <w:pStyle w:val="Heading2"/>
       </w:pPr>
       <w:r>
-        <w:t>5.3 UI/UX Standards, Visual Noise Constraints &amp; AI Anti-Pattern Prevention</w:t>
+        <w:t>5.3 UI/UX Standards, Zero-Badge Policy &amp; Dedicated Page Routes</w:t>
       </w:r>
     </w:p>
     <w:p>
       <w:r>
-        <w:t>To deliver a focused, professional authoring environment inspired by MongoDB Compass and Linear, NovWrite enforces strict visual constraints and UI anti-pattern prevention:</w:t>
+        <w:t>To deliver a focused, professional authoring environment inspired by MongoDB Compass and Linear, NovWrite enforces strict visual constraints, dedicated page routing, and UI anti-pattern prevention:</w:t>
       </w:r>
     </w:p>
     <w:p>
@@ -5116,17 +5116,27 @@
         <w:rPr>
           <w:b/>
         </w:rPr>
-        <w:t xml:space="preserve">2. Strict Badge Discipline: </w:t>
+        <w:t xml:space="preserve">2. Zero-Badge Policy Across the UI: </w:t>
       </w:r>
       <w:r>
-        <w:t>Badges are restricted primarily to Data Tables (e.g. status columns, enum indicators) and compact header status pills. Badges must not clutter body text, cards, or form labels.</w:t>
+        <w:t>Badges, pill tags, and colored chip boxes are strictly prohibited across the frontend. Statuses and attributes are communicated via semantic icons with text dots, action buttons, accessible breadcrumbs, and slide-over side drawers.</w:t>
         <w:br/>
       </w:r>
       <w:r>
         <w:rPr>
           <w:b/>
         </w:rPr>
-        <w:t xml:space="preserve">3. Dropdown Component Standard: </w:t>
+        <w:t xml:space="preserve">3. Dedicated 3-Tier Page-Based Routing: </w:t>
+      </w:r>
+      <w:r>
+        <w:t>Every core domain (Entities, Blueprints/Schemas, Sub-Systems) is partitioned into a dedicated 3-tier route architecture: Default List view (/), Create view (/create), and Update/Inspector view (/[id]). Complex forms and formula editors are never crammed into popups or single-page tabs.</w:t>
+        <w:br/>
+      </w:r>
+      <w:r>
+        <w:rPr>
+          <w:b/>
+        </w:rPr>
+        <w:t xml:space="preserve">4. Dropdown Component Standard: </w:t>
       </w:r>
       <w:r>
         <w:t>All dropdown selection menus must use the accessible Select primitive from shadcn-svelte ($lib/components/ui/select) or @rn-primitives on mobile, never native unstyled &lt;select&gt; tags.</w:t>
@@ -5136,10 +5146,64 @@
         <w:rPr>
           <w:b/>
         </w:rPr>
-        <w:t xml:space="preserve">4. Prevention of AI UI Anti-Patterns: </w:t>
+        <w:t xml:space="preserve">5. Isolation of Internal Communication Bridge: </w:t>
       </w:r>
       <w:r>
-        <w:t>Eliminate 'Card Sprawl' (group into master-detail tables instead of wrapping every label in a card), prevent nested modals, provide designed empty/loading skeleton states, and ensure full keyboard navigation (Esc, Tab, arrow keys).</w:t>
+        <w:t>The @novwrite/bridge transport and diagnostic message hubs belong to backend machinery and are restricted to isolated developer tooling (/dev/communication-hub), keeping authoring navigation clean.</w:t>
+      </w:r>
+    </w:p>
+    <w:p>
+      <w:pPr>
+        <w:pStyle w:val="Heading2"/>
+      </w:pPr>
+      <w:r>
+        <w:t>5.4 First &amp; Second Class Blueprints with Sandboxed Mathematical Formulas</w:t>
+      </w:r>
+    </w:p>
+    <w:p>
+      <w:r>
+        <w:t>NovWrite empowers authors with complete creative freedom to construct custom universe rules, dynamic identities, and mathematical formulas from scratch:</w:t>
+      </w:r>
+    </w:p>
+    <w:p>
+      <w:r>
+        <w:rPr>
+          <w:b/>
+        </w:rPr>
+        <w:t xml:space="preserve">• First-Class Blueprints (Primary Entity Archetypes): </w:t>
+      </w:r>
+      <w:r>
+        <w:t>Instantiate tangible entities in the universe timeline (e.g. Cultivator Characters, Sacred Relics, Realms, Factions) with unique IDs, state snapshots, and mutation history.</w:t>
+        <w:br/>
+      </w:r>
+      <w:r>
+        <w:rPr>
+          <w:b/>
+        </w:rPr>
+        <w:t xml:space="preserve">• Second-Class Blueprints (Sub-Blueprints &amp; Value Objects): </w:t>
+      </w:r>
+      <w:r>
+        <w:t>Reusable embedded data structures and continuous scale gauges (e.g. Romantic Affection Scale, Cultivation Rank &amp; Mastery, Power Matrices) referenced as dynamic fields in 1st-Class blueprints.</w:t>
+        <w:br/>
+      </w:r>
+      <w:r>
+        <w:rPr>
+          <w:b/>
+        </w:rPr>
+        <w:t xml:space="preserve">• Dynamic Enum Categories: </w:t>
+      </w:r>
+      <w:r>
+        <w:t>Authors can define and manage dynamic option tags on enum fields (e.g., gender with ['Male', 'Female', 'Dual-Yin-Yang', 'Celestial']).</w:t>
+        <w:br/>
+      </w:r>
+      <w:r>
+        <w:rPr>
+          <w:b/>
+        </w:rPr>
+        <w:t xml:space="preserve">• Sandboxed Mathematical &amp; Logical Formula Engine (formulaEngine.ts): </w:t>
+      </w:r>
+      <w:r>
+        <w:t>A safe AST expression parser that evaluates complex mathematical formulas for computed properties (e.g. Total Combat Power = (cultivation.major_realm * cultivation.minor_realm) * special_Physique + attack * attack_technique_Mastery - defence * defence_technique_mastery) in real time as component fields are modified.</w:t>
       </w:r>
     </w:p>
     <w:tbl>
@@ -5181,7 +5245,7 @@
                 <w:color w:val="5B21B6"/>
                 <w:sz w:val="20"/>
               </w:rPr>
-              <w:t xml:space="preserve">DESIGN DISCIPLINE: </w:t>
+              <w:t xml:space="preserve">CORE CAPABILITY: </w:t>
             </w:r>
             <w:r>
               <w:rPr>
@@ -5189,7 +5253,7 @@
                 <w:color w:val="1F2937"/>
                 <w:sz w:val="20"/>
               </w:rPr>
-              <w:t>UI Quality Standard: All agents and engineers must audit components against the UI/UX checklist before committing code. Every view must provide designed empty states with actionable primary buttons and maintain WCAG AA 4.5:1 text contrast ratios.</w:t>
+              <w:t>Blueprint &amp; Formula Freedom: Authors define custom mathematical formulas, multi-tier power ladders, and relationship scales with zero hardcoded constraints. Formulas evaluate in real-time within live test sandboxes and entity creation/update forms with 100% test verification.</w:t>
             </w:r>
           </w:p>
         </w:tc>

</xml_diff>

<commit_message>
docs(core): comprehensive documentation overhaul across architecture specs, API guides, and frontend standards
</commit_message>
<xml_diff>
--- a/Novwrite.docx
+++ b/Novwrite.docx
@@ -4383,6 +4383,54 @@
         </w:tc>
       </w:tr>
     </w:tbl>
+    <w:p>
+      <w:pPr>
+        <w:pStyle w:val="Heading2"/>
+      </w:pPr>
+      <w:r>
+        <w:t>4.4 RESTful API Best Practices, Telemetry &amp; RFC 7807 Problem Details</w:t>
+      </w:r>
+    </w:p>
+    <w:p>
+      <w:r>
+        <w:t>All NovWrite API endpoints implement industry-standard REST best practices and telemetry:</w:t>
+        <w:br/>
+        <w:t>• Explicit Route Versioning: All production endpoints are scoped under /api/v1/... and return the API-Version: 1.0 response header.</w:t>
+        <w:br/>
+        <w:t>• Observability Tracing: Requests automatically include X-Request-ID (UUID correlation token) and X-Response-Time (millisecond latency metric).</w:t>
+        <w:br/>
+        <w:t>• Standardized Pagination Envelopes: Collection queries return structured pagination metadata envelopes (page, pageSize, totalCount, totalPages, hasNextPage, hasPreviousPage).</w:t>
+        <w:br/>
+        <w:t>• Empty Query Guarantees: Queries returning 0 matching records always return HTTP 200 OK with 'data': [] and 'totalCount': 0 (never null or 404).</w:t>
+        <w:br/>
+        <w:t>• RFC 7807 Problem Details: All HTTP error responses adhere to application/problem+json with machine-readable error codes and invalid parameter breakdowns.</w:t>
+        <w:br/>
+        <w:t>• Container &amp; Orchestration Health Probes: Standardized /healthz (system summary), /livez (liveness probe), and /readyz (database &amp; Redis readiness).</w:t>
+      </w:r>
+    </w:p>
+    <w:p>
+      <w:pPr>
+        <w:pStyle w:val="Heading2"/>
+      </w:pPr>
+      <w:r>
+        <w:t>4.5 The UPDATE Pipe &amp; Hanging EDIT Trees Dual-Axis DAG Revision Engine</w:t>
+      </w:r>
+    </w:p>
+    <w:p>
+      <w:r>
+        <w:t>NovWrite bifurcates story progression from authorial drafting through an orthogonal dual-axis architecture:</w:t>
+        <w:br/>
+        <w:t>• The UPDATE Pipe (Plot Axis / T_story): A horizontal sequential conduit representing chronological narrative milestones (event0 ---&gt; event1 ---&gt; event2 ...).</w:t>
+        <w:br/>
+        <w:t>• Hanging EDIT Trees (Authorial Revision DAG / T_revision): Every event and entity possesses a vertical DAG of immutable revision nodes (ED0 -&gt; ED1 -&gt; ED2 ...).</w:t>
+        <w:br/>
+        <w:t>• Non-Destructive Checkouts: Checking out an earlier revision (e.g. ED3 from ED4) moves the active EDIT head pointer without deleting newer drafts (ED4 remains a child branch).</w:t>
+        <w:br/>
+        <w:t>• Infinite Branching Support: Adding an edit while at an intermediate node creates branching child paths, allowing infinite parallel drafting exploration without destructive overwrites.</w:t>
+        <w:br/>
+        <w:t>• Bitemporal Coordinate Resolution: Deterministically resolves exact world state at any dual-axis coordinate (T_narrative, T_revision).</w:t>
+      </w:r>
+    </w:p>
     <w:tbl>
       <w:tblPr>
         <w:tblW w:type="auto" w:w="0"/>
@@ -4422,7 +4470,7 @@
                 <w:color w:val="5B21B6"/>
                 <w:sz w:val="20"/>
               </w:rPr>
-              <w:t xml:space="preserve">SECURITY GUARANTEE: </w:t>
+              <w:t xml:space="preserve">REVISION DAG: </w:t>
             </w:r>
             <w:r>
               <w:rPr>
@@ -4430,7 +4478,7 @@
                 <w:color w:val="1F2937"/>
                 <w:sz w:val="20"/>
               </w:rPr>
-              <w:t>Platform Admin Security Rails: (1) Zero access to plaintext passwords (Argon2id/bcrypt); (2) Zero unconsented browsing of private user prose (requires time-bounded user support grant); (3) Zero raw credit card storage (PCI-DSS Stripe tokenization); (4) Append-only platform audit logs.</w:t>
+              <w:t>The UPDATE Pipe &amp; Hanging EDIT Trees: Enables authors to make infinite non-destructive drafting revisions, fix typos, and experiment with alternate descriptions while preserving complete historical timeline integrity.</w:t>
             </w:r>
           </w:p>
         </w:tc>
@@ -4480,17 +4528,13 @@
         <w:br/>
         <w:t xml:space="preserve">   - Standalone workbench suite containing dedicated full-viewport pages for each domain.</w:t>
         <w:br/>
-        <w:t xml:space="preserve">   - Characters &amp; Entities Studio (/world/characters): Master-detail data grid with full CRUD and a dedicated Change History Table per entity.</w:t>
+        <w:t xml:space="preserve">   - Characters &amp; Entities Studio (/world/entities): Master-detail data grid with full CRUD and customizable per-blueprint column pickers.</w:t>
         <w:br/>
-        <w:t xml:space="preserve">   - Power Systems &amp; Progression (/world/progression): Visual progression ladder builder, technique registries, and breakthrough prerequisites.</w:t>
-        <w:br/>
-        <w:t xml:space="preserve">   - Universe Schemas (/world/schema): Custom entity type architect and dynamic property definition editor.</w:t>
+        <w:t xml:space="preserve">   - Blueprints &amp; Schemas Architect (/world/schemas): Unified architect for 1st-Class Archetypes and 2nd-Class Sub-Schemas.</w:t>
         <w:br/>
         <w:t xml:space="preserve">   - Continuity Rules (/world/rules): Visual predicate builder for custom invariant constraints.</w:t>
         <w:br/>
         <w:t xml:space="preserve">   - Causal Timeline (/world/timeline): Dual-mode timeline (Narrative vs Chronological) and atomic EventEffect editor.</w:t>
-        <w:br/>
-        <w:t xml:space="preserve">   - Relationships (/world/relationships): Master 2D relationship matrix and node-link network visualizer.</w:t>
         <w:br/>
         <w:t xml:space="preserve">   - Continuity Health &amp; Canon Reconciler (/world/audit): System-wide violation dashboard with Canon Override Modal.</w:t>
       </w:r>
@@ -5204,6 +5248,25 @@
       </w:r>
       <w:r>
         <w:t>A safe AST expression parser that evaluates complex mathematical formulas for computed properties (e.g. Total Combat Power = (cultivation.major_realm * cultivation.minor_realm) * special_Physique + attack * attack_technique_Mastery - defence * defence_technique_mastery) in real time as component fields are modified.</w:t>
+      </w:r>
+    </w:p>
+    <w:p>
+      <w:pPr>
+        <w:pStyle w:val="Heading2"/>
+      </w:pPr>
+      <w:r>
+        <w:t>5.5 Entity Editor 3-Tier Visual Hierarchy &amp; Strict Schema Invariance</w:t>
+      </w:r>
+    </w:p>
+    <w:p>
+      <w:r>
+        <w:t>To resolve visual toolbar crowding and protect data integrity, NovWrite establishes strict frontend standards for entity management:</w:t>
+        <w:br/>
+        <w:t>• 3-Tier Header Visual Hierarchy: Partitioned into Tier 1 (Location &amp; Breadcrumbs), Tier 2 (Identity Banner &amp; Archetype metadata), and Tier 3 (Utility Toolbar with Visual Form vs Raw JSON toggle, Feather History drawer trigger, schema quick-jump, and primary Save action).</w:t>
+        <w:br/>
+        <w:t>• PipeTreeVisualizer UI Component: Interactive visualizer rendering the glowing narrative UPDATE pipeline conduit alongside vertical revision DAG branch graphs with live active edit head indicators.</w:t>
+        <w:br/>
+        <w:t>• Strict Schema Invariance: Complete elimination of arbitrary unmanaged custom properties from entity editing. All entity properties are strictly governed by formal Blueprint schemas.</w:t>
       </w:r>
     </w:p>
     <w:tbl>
@@ -7032,6 +7095,82 @@
         </w:tc>
       </w:tr>
     </w:tbl>
+    <w:p>
+      <w:pPr>
+        <w:pStyle w:val="Heading2"/>
+      </w:pPr>
+      <w:r>
+        <w:t>7.3 5-Phase Monorepo Test Architecture &amp; Regression Pipeline</w:t>
+      </w:r>
+    </w:p>
+    <w:p>
+      <w:r>
+        <w:t>NovWrite enforces an automated 5-phase test execution runner (./test.sh) across all tiers of the monorepo:</w:t>
+        <w:br/>
+        <w:t>• Phase 1 (@novwrite/bridge): 12 unit tests validating RPC contracts, Zod schemas, and error adapters.</w:t>
+        <w:br/>
+        <w:t>• Phase 2 (@novwrite/data-service): 40 unit tests verifying schema engines, property normalization, formula AST evaluation, and state folding.</w:t>
+        <w:br/>
+        <w:t>• Phase 3 (apps/api): Go backend test suite verifying handlers, middlewares, and domain logic.</w:t>
+        <w:br/>
+        <w:t>• Phase 4 (@novwrite/web): 14 Vitest tests covering stores, formula engines, and UI visualizer components.</w:t>
+        <w:br/>
+        <w:t>• Phase 5 (Diagnostic Typecheck): Monorepo-wide strict TypeScript and Svelte diagnostics verification via ./check.sh (0 errors).</w:t>
+      </w:r>
+    </w:p>
+    <w:tbl>
+      <w:tblPr>
+        <w:tblW w:type="auto" w:w="0"/>
+        <w:jc w:val="center"/>
+        <w:tblLayout w:type="fixed"/>
+        <w:tblLook w:firstColumn="1" w:firstRow="1" w:lastColumn="0" w:lastRow="0" w:noHBand="0" w:noVBand="1" w:val="04A0"/>
+      </w:tblPr>
+      <w:tblGrid>
+        <w:gridCol w:w="9360"/>
+      </w:tblGrid>
+      <w:tr>
+        <w:tc>
+          <w:tcPr>
+            <w:tcW w:type="dxa" w:w="9360"/>
+            <w:shd w:fill="F5F3FF"/>
+            <w:tcMar>
+              <w:top w:w="120" w:type="dxa"/>
+              <w:bottom w:w="120" w:type="dxa"/>
+              <w:left w:w="180" w:type="dxa"/>
+              <w:right w:w="180" w:type="dxa"/>
+            </w:tcMar>
+            <w:tcBorders>
+              <w:top w:val="none" w:sz="0" w:space="0" w:color="auto"/>
+              <w:left w:val="single" w:sz="24" w:space="0" w:color="7C3AED"/>
+              <w:bottom w:val="none" w:sz="0" w:space="0" w:color="auto"/>
+              <w:right w:val="none" w:sz="0" w:space="0" w:color="auto"/>
+            </w:tcBorders>
+          </w:tcPr>
+          <w:p>
+            <w:pPr>
+              <w:spacing w:before="40" w:after="40"/>
+            </w:pPr>
+            <w:r>
+              <w:rPr>
+                <w:rFonts w:ascii="Calibri" w:hAnsi="Calibri"/>
+                <w:b/>
+                <w:color w:val="5B21B6"/>
+                <w:sz w:val="20"/>
+              </w:rPr>
+              <w:t xml:space="preserve">QA ASSURANCE: </w:t>
+            </w:r>
+            <w:r>
+              <w:rPr>
+                <w:rFonts w:ascii="Calibri" w:hAnsi="Calibri"/>
+                <w:color w:val="1F2937"/>
+                <w:sz w:val="20"/>
+              </w:rPr>
+              <w:t>5-Phase Test Runner: Guarantees 100% test coverage and regression prevention across all services, engines, and frontend stores with zero type diagnostics warnings.</w:t>
+            </w:r>
+          </w:p>
+        </w:tc>
+      </w:tr>
+    </w:tbl>
     <w:tbl>
       <w:tblPr>
         <w:tblW w:type="auto" w:w="0"/>

</xml_diff>